<commit_message>
Update main revised thesis draft
</commit_message>
<xml_diff>
--- a/Thesis drafts/Thesis_Draft_29-06-2026_revised_method.docx
+++ b/Thesis drafts/Thesis_Draft_29-06-2026_revised_method.docx
@@ -602,7 +602,7 @@
         </w:rPr>
       </w:pPr>
       <w:r>
-        <w:t xml:space="preserve">This thesis investigates anomaly detection in district-heating substations using historical operational data. The study adapts a reference encoder-assisted clustering methodology to a smaller case-study setting with longer historical coverage and limited fault labels. The main method is a reconstruction-based autoencoder that models 24-hour patterns of supply temperature, return temperature, and flow rate. The main outcomes are an interpretable anomaly-detection workflow, feature-level anomaly attribution, a comparison between threshold configurations, and a reviewable set of anomaly candidates for later validation on live data.</w:t>
+        <w:t xml:space="preserve">This thesis investigates anomaly detection in district-heating substations using historical operational data. Modern district-heating substations generate continuous measurements, but confirmed fault labels are often sparse or unavailable, which makes conventional supervised fault classification difficult. The study therefore adapts a reference encoder-assisted clustering methodology to a smaller case-study setting and proposes a reconstruction-based autoencoder as the main detector. The model analyses 24-hour windows of supply temperature, return temperature, and flow rate. Each window is reconstructed by the autoencoder, scored using reconstruction error, and interpreted through feature-level reconstruction contributions so that each anomaly candidate can be linked to supply, return, or flow behaviour. The method is evaluated through reconstruction-error distributions, a 3-sigma threshold configuration, comparison with an earlier percentile-based threshold, low delta-T engineering checks, and clustering-based interpretation of operating regimes and anomaly families. The main outcome is a reviewable anomaly-detection workflow that produces physically interpretable anomaly candidates despite incomplete labels and can later be applied to live district-heating data for supervisor and domain-expert validation.</w:t>
       </w:r>
     </w:p>
     <w:p ns2:paraId="09B53CBD" ns2:textId="77777777">
@@ -610,19 +610,22 @@
         <w:pStyle w:val="Heading1"/>
         <w:spacing w:after="120"/>
       </w:pPr>
-      <w:bookmarkStart w:id="19" w:name="_Toc233037912"/>
+      <w:bookmarkStart w:id="3" w:name="_Toc233037912"/>
+      <w:r>
+        <w:t>Sammanfattning</w:t>
+      </w:r>
+      <w:bookmarkEnd w:id="3"/>
+    </w:p>
+    <w:p ns2:paraId="08E7D25D" ns2:textId="77777777">
+      <w:pPr>
+        <w:pStyle w:val="BodyTextFirstIndent"/>
+      </w:pPr>
+      <w:r>
+        <w:t xml:space="preserve">Detta examensarbete undersöker anomalidetektion i ett litet fjärrvärmenät med hjälp av historiska driftsdata från sju kundcentraler. Arbetet utgår från HEAT-artikeln som metodologisk referens, men anpassar angreppssättet till en situation med färre undercentraler, längre historisk täckning och begränsad tillgång till felmärkta data. Huvudmetoden är en rekonstruktionsbaserad anomalidetektor byggd på 24-timmarsfönster av framledningstemperatur, returtemperatur och flöde. I resultatpaketet med sju byggnader </w:t>
+      </w:r>
       <w:r>
         <w:lastRenderedPageBreak/>
-        <w:t>Sammanfattning</w:t>
-      </w:r>
-      <w:bookmarkEnd w:id="19"/>
-    </w:p>
-    <w:p ns2:paraId="08E7D25D" ns2:textId="77777777">
-      <w:pPr>
-        <w:pStyle w:val="BodyTextFirstIndent"/>
-      </w:pPr>
-      <w:r>
-        <w:t>Detta examensarbete undersöker anomalidetektion i ett litet fjärrvärmenät med hjälp av historiska driftsdata från sju kundcentraler. Arbetet utgår från HEAT-artikeln som metodologisk referens, men anpassar angreppssättet till en situation med färre undercentraler, längre historisk täckning och begränsad tillgång till felmärkta data. Huvudmetoden är en rekonstruktionsbaserad anomalidetektor byggd på 24-timmarsfönster av framledningstemperatur, returtemperatur och flöde. I resultatpaketet med sju byggnader analyserade modellen mellan 323 och 1113 behållna fönster per byggnad. Med den slutliga 3-sigma-tröskeln varierade andelen flaggade anomalier från 0,21 procent för Abat Oliba till 4,65 procent för Hostatgeria DHW Radiators. Det tydligaste enskilda fallet var Hostatgeria Underfloor, där 5 av 323 fönster flaggades och den starkaste anomalin också överlappade den ingenjörsmässiga låg-delta-T-baslinjen. Analysen av dominerande variabel visade att anomalibeteendet inte var enhetligt: vissa byggnader var främst flödesdominerade, andra främst returdominerade, medan Underfloor och Nostra Senyora gav de tydligaste framledningsdominerade fallen. Resultaten visar att rekonstruktionsbaserad anomalidetektion kan ge tolkbara anomalikandidater i en realistisk fjärrvärmesituation med svaga etiketter, men också att slutlig validering fortfarande kräver domängranskning och framtida utvärdering på live-data.</w:t>
+        <w:t>analyserade modellen mellan 323 och 1113 behållna fönster per byggnad. Med den slutliga 3-sigma-tröskeln varierade andelen flaggade anomalier från 0,21 procent för Abat Oliba till 4,65 procent för Hostatgeria DHW Radiators. Det tydligaste enskilda fallet var Hostatgeria Underfloor, där 5 av 323 fönster flaggades och den starkaste anomalin också överlappade den ingenjörsmässiga låg-delta-T-baslinjen. Analysen av dominerande variabel visade att anomalibeteendet inte var enhetligt: vissa byggnader var främst flödesdominerade, andra främst returdominerade, medan Underfloor och Nostra Senyora gav de tydligaste framledningsdominerade fallen. Resultaten visar att rekonstruktionsbaserad anomalidetektion kan ge tolkbara anomalikandidater i en realistisk fjärrvärmesituation med svaga etiketter, men också att slutlig validering fortfarande kräver domängranskning och framtida utvärdering på live-data.</w:t>
       </w:r>
     </w:p>
     <w:p ns2:paraId="407DFA00" ns2:textId="77777777">
@@ -632,14 +635,14 @@
           <w:lang w:val="en-US"/>
         </w:rPr>
       </w:pPr>
-      <w:bookmarkStart w:id="20" w:name="_Toc233037913"/>
+      <w:bookmarkStart w:id="4" w:name="_Toc233037913"/>
       <w:r>
         <w:rPr>
           <w:lang w:val="en-US"/>
         </w:rPr>
         <w:t>Keywords</w:t>
       </w:r>
-      <w:bookmarkEnd w:id="20"/>
+      <w:bookmarkEnd w:id="4"/>
     </w:p>
     <w:p ns2:paraId="3BEC9F07" ns2:textId="77777777">
       <w:pPr>
@@ -667,11 +670,11 @@
       <w:pPr>
         <w:pStyle w:val="Heading1"/>
       </w:pPr>
-      <w:bookmarkStart w:id="21" w:name="_Toc233037914"/>
+      <w:bookmarkStart w:id="5" w:name="_Toc233037914"/>
       <w:r>
         <w:t>Acknowledgments</w:t>
       </w:r>
-      <w:bookmarkEnd w:id="21"/>
+      <w:bookmarkEnd w:id="5"/>
     </w:p>
     <w:p ns2:paraId="6A47FC46" ns2:textId="77777777">
       <w:pPr>
@@ -694,14 +697,14 @@
           <w:lang w:val="en-US"/>
         </w:rPr>
       </w:pPr>
-      <w:bookmarkStart w:id="22" w:name="_Toc233037915"/>
+      <w:bookmarkStart w:id="6" w:name="_Toc233037915"/>
       <w:r>
         <w:rPr>
           <w:lang w:val="en-US"/>
         </w:rPr>
         <w:t>List of Acronyms and Abbreviations</w:t>
       </w:r>
-      <w:bookmarkEnd w:id="22"/>
+      <w:bookmarkEnd w:id="6"/>
     </w:p>
     <w:p ns2:paraId="090911D5" ns2:textId="77777777">
       <w:pPr>
@@ -753,7 +756,7 @@
         </w:rPr>
       </w:pPr>
       <w:r>
-        <w:t xml:space="preserve">Reference method - Hierarchical encoder-assisted clustering for substation fault detection</w:t>
+        <w:t>Reference method - Hierarchical encoder-assisted clustering for substation fault detection</w:t>
       </w:r>
     </w:p>
     <w:p ns2:paraId="1B8ACFAC" ns2:textId="77777777">
@@ -2153,63 +2156,9 @@
               <ns2:ligatures ns2:val="standardContextual"/>
             </w:rPr>
           </w:pPr>
-          <w:hyperlink w:anchor="_Toc233037927" w:history="1">
-            <w:r>
-              <w:rPr>
-                <w:rStyle w:val="Hyperlink"/>
-                <w:noProof/>
-              </w:rPr>
-              <w:t>2.6 Related work positioning</w:t>
-            </w:r>
-            <w:r>
-              <w:rPr>
-                <w:noProof/>
-                <w:webHidden/>
-              </w:rPr>
-              <w:tab/>
-            </w:r>
-            <w:r>
-              <w:rPr>
-                <w:noProof/>
-                <w:webHidden/>
-              </w:rPr>
-              <w:fldChar w:fldCharType="begin"/>
-            </w:r>
-            <w:r>
-              <w:rPr>
-                <w:noProof/>
-                <w:webHidden/>
-              </w:rPr>
-              <w:instrText xml:space="preserve"> PAGEREF _Toc233037927 \h </w:instrText>
-            </w:r>
-            <w:r>
-              <w:rPr>
-                <w:noProof/>
-                <w:webHidden/>
-              </w:rPr>
-            </w:r>
-            <w:r>
-              <w:rPr>
-                <w:noProof/>
-                <w:webHidden/>
-              </w:rPr>
-              <w:fldChar w:fldCharType="separate"/>
-            </w:r>
-            <w:r>
-              <w:rPr>
-                <w:noProof/>
-                <w:webHidden/>
-              </w:rPr>
-              <w:t>13</w:t>
-            </w:r>
-            <w:r>
-              <w:rPr>
-                <w:noProof/>
-                <w:webHidden/>
-              </w:rPr>
-              <w:fldChar w:fldCharType="end"/>
-            </w:r>
-          </w:hyperlink>
+          <w:r>
+            <w:t xml:space="preserve">2.6 Related work13</w:t>
+          </w:r>
         </w:p>
         <w:p ns2:paraId="458724A9" ns2:textId="747C0E16">
           <w:pPr>
@@ -3962,7 +3911,7 @@
         <w:pStyle w:val="Heading1"/>
         <w:spacing w:after="120"/>
       </w:pPr>
-      <w:bookmarkStart w:id="23" w:name="_Toc233037916"/>
+      <w:bookmarkStart w:id="7" w:name="_Toc233037916"/>
     </w:p>
     <w:p ns2:paraId="3218F8AF" ns2:textId="58F5AC9F">
       <w:pPr>
@@ -3978,7 +3927,7 @@
         </w:rPr>
         <w:t>1 Introduction</w:t>
       </w:r>
-      <w:bookmarkEnd w:id="23"/>
+      <w:bookmarkEnd w:id="7"/>
     </w:p>
     <w:p ns2:paraId="030914F0" ns2:textId="77777777">
       <w:pPr>
@@ -3988,7 +3937,7 @@
         </w:rPr>
       </w:pPr>
       <w:r>
-        <w:t xml:space="preserve">Operational anomalies are a persistent issue in modern district-heating networks because substations operate continuously and their behaviour changes with demand, control settings, season, and data quality. At the same time, modern substations produce large amounts of operational time-series data that can be used for monitoring. This creates a clear methodological need: to take advantage of available substation data to detect unusual or inefficient operation even when confirmed fault labels are sparse, incomplete, or unavailable. In this setting, anomaly detection is a pragmatic alternative because it identifies data points and periods that deviate from historically learned behaviour without requiring a fully labelled fault dataset [2, 3].</w:t>
+        <w:t xml:space="preserve">Operational anomalies are a persistent issue in modern district-heating networks because substations operate continuously and their behaviour changes with demand, control settings, season, and data quality. At the same time, modern substations produce large amounts of operational time-series data that can be used for monitoring. This creates a clear methodological need: to take advantage of available substation data to detect unusual or inefficient operation even when confirmed fault labels are sparse, incomplete, or unavailable. In this setting, anomaly detection is a pragmatic alternative because it identifies data points and periods that deviate from historically learned behaviour without requiring a fully labelled fault dataset [1, 2].</w:t>
       </w:r>
     </w:p>
     <w:p ns2:paraId="0E74F9FB" ns2:textId="77777777">
@@ -3998,14 +3947,14 @@
           <w:lang w:val="en-US"/>
         </w:rPr>
       </w:pPr>
-      <w:bookmarkStart w:id="25" w:name="_Toc233037917"/>
+      <w:bookmarkStart w:id="8" w:name="_Toc233037917"/>
       <w:r>
         <w:rPr>
           <w:lang w:val="en-US"/>
         </w:rPr>
         <w:t>1.1 Problem setting</w:t>
       </w:r>
-      <w:bookmarkEnd w:id="25"/>
+      <w:bookmarkEnd w:id="8"/>
     </w:p>
     <w:p ns2:paraId="38A6CDE8" ns2:textId="77777777">
       <w:pPr>
@@ -4015,7 +3964,7 @@
         </w:rPr>
       </w:pPr>
       <w:r>
-        <w:t xml:space="preserve">District-heating systems distribute thermal energy from centralized production to connected buildings through a shared network of pipes, heat exchangers, and local substations. At substation level, supply temperature, return temperature, flow rate, and power together describe how heat is transferred from the network side to the building side. This makes monitoring inherently multivariate: inefficient or abnormal operation may appear through elevated return temperature, weak temperature difference, unstable flow, or a combination of these effects.</w:t>
+        <w:t>District-heating systems distribute thermal energy from centralized production to connected buildings through a shared network of pipes, heat exchangers, and local substations. At substation level, supply temperature, return temperature, flow rate, and power together describe how heat is transferred from the network side to the building side. This makes monitoring inherently multivariate: inefficient or abnormal operation may appear through elevated return temperature, weak temperature difference, unstable flow, or a combination of these effects.</w:t>
       </w:r>
     </w:p>
     <w:p ns2:paraId="7235FED7" ns2:textId="77777777">
@@ -4025,14 +3974,14 @@
           <w:lang w:val="en-US"/>
         </w:rPr>
       </w:pPr>
-      <w:bookmarkStart w:id="27" w:name="_Toc233037918"/>
+      <w:bookmarkStart w:id="9" w:name="_Toc233037918"/>
       <w:r>
         <w:rPr>
           <w:lang w:val="en-US"/>
         </w:rPr>
         <w:t>1.2 Ethics and sustainability</w:t>
       </w:r>
-      <w:bookmarkEnd w:id="27"/>
+      <w:bookmarkEnd w:id="9"/>
     </w:p>
     <w:p ns2:paraId="1C7E7BD6" ns2:textId="77777777">
       <w:pPr>
@@ -4042,17 +3991,7 @@
         </w:rPr>
       </w:pPr>
       <w:r>
-        <w:rPr>
-          <w:lang w:val="en-US"/>
-        </w:rPr>
-        <w:t xml:space="preserve">The sustainability motivation of this thesis is direct. District-heating systems are most effective when connected substations extract heat efficiently and return cooler water to the network. Poor control, hidden faults, or persistently inefficient operating periods can increase return temperature, reduce overall network efficiency, and make heat distribution less effective for the rest of the connected system [19, 20]. Better monitoring therefore has a </w:t>
-      </w:r>
-      <w:r>
-        <w:rPr>
-          <w:lang w:val="en-US"/>
-        </w:rPr>
-        <w:lastRenderedPageBreak/>
-        <w:t>practical sustainability role: it can help prioritize the building periods where wasted energy, poor control behaviour, or maintenance-relevant inefficiency are most likely to occur.</w:t>
+        <w:t xml:space="preserve">The sustainability motivation of this thesis is direct. District-heating systems are most effective when connected substations extract heat efficiently and return cooler water to the network. Poor control, hidden faults, or persistently inefficient operating periods can increase return temperature, reduce overall network efficiency, and make heat distribution less effective for the rest of the connected system [3, 4]. Better monitoring therefore has a practical sustainability role: it can help prioritize the building periods where wasted energy, poor control behaviour, or maintenance-relevant inefficiency are most likely to occur.</w:t>
       </w:r>
     </w:p>
     <w:p ns2:paraId="3B6192CA" ns2:textId="77777777">
@@ -4063,10 +4002,7 @@
         </w:rPr>
       </w:pPr>
       <w:r>
-        <w:rPr>
-          <w:lang w:val="en-US"/>
-        </w:rPr>
-        <w:t>There is also an ethics dimension. Automated anomaly detection should support engineering review rather than replace it. In this thesis, anomaly flags are not treated as proof of fault. They are treated as review signals that help direct limited expert attention toward unusual operating windows. This is important because a weak-label industrial dataset can contain missing values, sensor artifacts, and building-specific operating patterns that a purely automatic system may misread if its outputs are interpreted without domain context [7, 11]. The ethical goal is therefore not blind automation, but responsible decision support: more transparent monitoring, better prioritization, and more accountable interpretation of abnormal behaviour.</w:t>
+        <w:t xml:space="preserve">There is also an ethics dimension. Automated anomaly detection should support engineering review rather than replace it. In this thesis, anomaly flags are not treated as proof of fault. They are treated as review signals that help direct limited expert attention toward unusual operating windows. This is important because a weak-label industrial dataset can contain missing values, sensor artifacts, and building-specific operating patterns that a purely automatic system may misread if its outputs are interpreted without domain context [5, 6]. The ethical goal is therefore not blind automation, but responsible decision support: more transparent monitoring, better prioritization, and more accountable interpretation of abnormal behaviour.</w:t>
       </w:r>
     </w:p>
     <w:p ns2:paraId="29492541" ns2:textId="77777777">
@@ -4076,14 +4012,14 @@
           <w:lang w:val="en-US"/>
         </w:rPr>
       </w:pPr>
-      <w:bookmarkStart w:id="28" w:name="_Toc233037919"/>
+      <w:bookmarkStart w:id="10" w:name="_Toc233037919"/>
       <w:r>
         <w:rPr>
           <w:lang w:val="en-US"/>
         </w:rPr>
         <w:t>1.3 Quantitative and qualitative analysis</w:t>
       </w:r>
-      <w:bookmarkEnd w:id="28"/>
+      <w:bookmarkEnd w:id="10"/>
     </w:p>
     <w:p ns2:paraId="7626E83B" ns2:textId="77777777">
       <w:pPr>
@@ -4096,7 +4032,14 @@
         <w:rPr>
           <w:lang w:val="en-US"/>
         </w:rPr>
-        <w:t>The thesis combines quantitative and qualitative analysis. The quantitative part includes window counts, reconstruction errors, anomaly rates, threshold comparisons, dominant-feature summaries, and baseline-overlap statistics. These are needed to understand how the detector behaves across buildings and under different thresholding choices. The qualitative part consists of inspecting the highest-scoring anomaly windows, comparing supply, return, flow, and delta-T behaviour, and discussing those windows in engineering terms together with the supervisor. This combination is necessary because the available dataset does not support fully labelled benchmark evaluation. Quantitative results show where the detector reacts; qualitative review is needed to judge whether those reactions are meaningful.</w:t>
+        <w:t xml:space="preserve">The thesis combines quantitative and qualitative analysis. The quantitative part includes window counts, reconstruction errors, anomaly rates, threshold comparisons, dominant-feature summaries, and baseline-overlap statistics. These are needed to understand how the detector behaves across buildings and under different thresholding choices. The qualitative part consists of inspecting the highest-scoring anomaly windows, comparing supply, return, flow, and delta-T behaviour, and discussing those windows in engineering terms together </w:t>
+      </w:r>
+      <w:r>
+        <w:rPr>
+          <w:lang w:val="en-US"/>
+        </w:rPr>
+        <w:lastRenderedPageBreak/>
+        <w:t>with the supervisor. This combination is necessary because the available dataset does not support fully labelled benchmark evaluation. Quantitative results show where the detector reacts; qualitative review is needed to judge whether those reactions are meaningful.</w:t>
       </w:r>
     </w:p>
     <w:p ns2:paraId="4DA8136C" ns2:textId="77777777">
@@ -4106,14 +4049,14 @@
           <w:lang w:val="en-US"/>
         </w:rPr>
       </w:pPr>
-      <w:bookmarkStart w:id="29" w:name="_Toc233037920"/>
+      <w:bookmarkStart w:id="11" w:name="_Toc233037920"/>
       <w:r>
         <w:rPr>
           <w:lang w:val="en-US"/>
         </w:rPr>
         <w:t>1.4 Thesis aim and research questions</w:t>
       </w:r>
-      <w:bookmarkEnd w:id="29"/>
+      <w:bookmarkEnd w:id="11"/>
     </w:p>
     <w:p ns2:paraId="43FDF6F8" ns2:textId="77777777">
       <w:pPr>
@@ -4123,7 +4066,7 @@
         </w:rPr>
       </w:pPr>
       <w:r>
-        <w:t xml:space="preserve">The thesis therefore aims to build and evaluate an anomaly-detection pipeline that can identify physically interpretable abnormal operating periods from historical district-heating data and later be transferred to live data as it becomes available. The work is motivated by a reference encoder-assisted clustering methodology for district-heating fault detection [1]. However, the available KTH thesis dataset differs from that reference setting in two important ways. First, the network is much smaller, which reduces the statistical strength of pure peer-group comparison. Second, the historical coverage is longer, which makes per-substation temporal modelling more attractive than relying only on network-wide clustering. For this reason, the thesis treats reconstruction-based anomaly detection as the primary method and uses clustering mainly as a secondary interpretation layer.</w:t>
+        <w:t xml:space="preserve">The thesis therefore aims to build and evaluate an anomaly-detection pipeline that can identify physically interpretable abnormal operating periods from historical district-heating data and later be transferred to live data as it becomes available. The work is motivated by a reference encoder-assisted clustering methodology for district-heating fault detection [7]. However, the available KTH thesis dataset differs from that reference setting in two important ways. First, the network is much smaller, which reduces the statistical strength of pure peer-group comparison. Second, the historical coverage is longer, which makes per-substation temporal modelling more attractive than relying only on network-wide clustering. For this reason, the thesis treats reconstruction-based anomaly detection as the primary method and uses clustering mainly as a secondary interpretation layer.</w:t>
       </w:r>
     </w:p>
     <w:p ns2:paraId="00F84EAE" ns2:textId="77777777">
@@ -4148,10 +4091,7 @@
         </w:rPr>
       </w:pPr>
       <w:r>
-        <w:rPr>
-          <w:lang w:val="en-US"/>
-        </w:rPr>
-        <w:t>A clear research gap follows from this comparison. Much of the strongest recent work either assumes a larger peer population for comparison, access to cleaner labelled maintenance events, or an evaluation setup built around benchmark-style metrics [1, 5, 7, 8]. The present thesis works in a different regime: a smaller set of consumer substations, long historical time-series coverage, and limited fault confirmation. The contribution is therefore not to outperform a labelled benchmark, but to show that a reconstruction-based workflow can still produce structured, feature-level anomaly evidence that is technically defensible and operationally reviewable in this weaker-data setting.</w:t>
+        <w:t xml:space="preserve">A clear research gap follows from this comparison. Much of the strongest recent work either assumes a larger peer population for comparison, access to cleaner labelled maintenance events, or an evaluation setup built around benchmark-style metrics [7, 8, 5, 9]. The present thesis works in a different regime: a smaller set of consumer substations, long historical time-series coverage, and limited fault confirmation. The contribution is therefore not to outperform a labelled benchmark, but to show that a reconstruction-based workflow can still produce structured, feature-level anomaly evidence that is technically defensible and operationally reviewable in this weaker-data setting.</w:t>
       </w:r>
     </w:p>
     <w:p ns2:paraId="00C796A2" ns2:textId="77777777">
@@ -4177,7 +4117,7 @@
         </w:rPr>
       </w:pPr>
       <w:r>
-        <w:t xml:space="preserve">Can a reconstruction-based anomaly-detection methodology identify interpretable abnormal operating periods in district-heating substations when complete fault labels are unavailable?</w:t>
+        <w:t>Can a reconstruction-based anomaly-detection methodology identify interpretable abnormal operating periods in district-heating substations when complete fault labels are unavailable?</w:t>
       </w:r>
     </w:p>
     <w:p ns2:paraId="52230233" ns2:textId="77777777">
@@ -4199,11 +4139,11 @@
         <w:pStyle w:val="BodyText"/>
         <w:spacing w:after="40"/>
         <w:rPr>
-          <w:del w:id="34" w:author="Mustapha Habib" w:date="2026-06-29T10:15:00Z" ns4:dateUtc="2026-06-29T08:15:00Z"/>
-          <w:lang w:val="en-US"/>
-        </w:rPr>
-      </w:pPr>
-      <w:del w:id="36" w:author="Mustapha Habib" w:date="2026-06-29T10:15:00Z" ns4:dateUtc="2026-06-29T08:15:00Z">
+          <w:del w:id="12" w:author="Mustapha Habib" w:date="2026-06-29T10:15:00Z" ns4:dateUtc="2026-06-29T08:15:00Z"/>
+          <w:lang w:val="en-US"/>
+        </w:rPr>
+      </w:pPr>
+      <w:del w:id="13" w:author="Mustapha Habib" w:date="2026-06-29T10:15:00Z" ns4:dateUtc="2026-06-29T08:15:00Z">
         <w:r>
           <w:rPr>
             <w:lang w:val="en-US"/>
@@ -4211,25 +4151,17 @@
           <w:delText>How should the derived flow feature be handled when small temperature differences cause numerical instability?</w:delText>
         </w:r>
       </w:del>
-      <w:r>
-        <w:rPr>
-          <w:rStyle w:val="CommentReference"/>
-          <w:sz w:val="24"/>
-          <w:szCs w:val="24"/>
-          <w:lang w:val="en-US"/>
-        </w:rPr>
-      </w:r>
     </w:p>
     <w:p ns2:paraId="5351DE18" ns2:textId="1C0791C1">
       <w:pPr>
         <w:pStyle w:val="BodyText"/>
         <w:spacing w:after="40"/>
         <w:rPr>
-          <w:del w:id="37" w:author="Mustapha Habib" w:date="2026-06-29T10:15:00Z" ns4:dateUtc="2026-06-29T08:15:00Z"/>
-          <w:lang w:val="en-US"/>
-        </w:rPr>
-      </w:pPr>
-      <w:del w:id="39" w:author="Mustapha Habib" w:date="2026-06-29T10:15:00Z" ns4:dateUtc="2026-06-29T08:15:00Z">
+          <w:del w:id="14" w:author="Mustapha Habib" w:date="2026-06-29T10:15:00Z" ns4:dateUtc="2026-06-29T08:15:00Z"/>
+          <w:lang w:val="en-US"/>
+        </w:rPr>
+      </w:pPr>
+      <w:del w:id="15" w:author="Mustapha Habib" w:date="2026-06-29T10:15:00Z" ns4:dateUtc="2026-06-29T08:15:00Z">
         <w:r>
           <w:rPr>
             <w:lang w:val="en-US"/>
@@ -4237,14 +4169,6 @@
           <w:delText>How does a reconstruction-based detector compare with a simple engineering low delta-T baseline?</w:delText>
         </w:r>
       </w:del>
-      <w:r>
-        <w:rPr>
-          <w:rStyle w:val="CommentReference"/>
-          <w:sz w:val="24"/>
-          <w:szCs w:val="24"/>
-          <w:lang w:val="en-US"/>
-        </w:rPr>
-      </w:r>
     </w:p>
     <w:p ns2:paraId="06C212CB" ns2:textId="77777777">
       <w:pPr>
@@ -4255,7 +4179,8 @@
         </w:rPr>
       </w:pPr>
       <w:r>
-        <w:t xml:space="preserve">What is the impact of changing the configuration settings of the proposed methodology on the expected anomaly-detection results?</w:t>
+        <w:lastRenderedPageBreak/>
+        <w:t>What is the impact of changing the configuration settings of the proposed methodology on the expected anomaly-detection results?</w:t>
       </w:r>
     </w:p>
     <w:p ns2:paraId="5E57A194" ns2:textId="12BDD1D3">
@@ -4267,7 +4192,7 @@
         </w:rPr>
       </w:pPr>
       <w:r>
-        <w:t xml:space="preserve">Can clustering support interpretation in a small district-heating case study where the number of studied substations is limited?</w:t>
+        <w:t>Can clustering support interpretation in a small district-heating case study where the number of studied substations is limited?</w:t>
       </w:r>
     </w:p>
     <w:p ns2:paraId="62DE8E91" ns2:textId="2FFAA292">
@@ -4278,7 +4203,7 @@
         </w:rPr>
       </w:pPr>
       <w:r>
-        <w:t xml:space="preserve">The main contributions of the thesis are threefold. First, it adapts a reconstruction-based anomaly detector to a small district-heating setting with limited labels using autoencoders. Second, it introduces a feature-level interpretation view that attributes anomalies to supply temperature, return temperature, or the flow-rate channel. Third, it compares the learned detector with simple engineering baselines and clustering-based interpretation views in order to understand which anomalies appear physically meaningful. The rest of the thesis is organized as follows. Chapter 2 reviews the relevant background and the reference encoder-assisted clustering methodology. Chapter 3 presents the anomaly-detection methodology. Chapter 4 summarizes the experimental results. Chapter 5 discusses interpretation, limitations, and implications for live deployment. Chapter 6 concludes the thesis and outlines future work.</w:t>
+        <w:t>The main contributions of the thesis are threefold. First, it adapts a reconstruction-based anomaly detector to a small district-heating setting with limited labels using autoencoders. Second, it introduces a feature-level interpretation view that attributes anomalies to supply temperature, return temperature, or the flow-rate channel. Third, it compares the learned detector with simple engineering baselines and clustering-based interpretation views in order to understand which anomalies appear physically meaningful. The rest of the thesis is organized as follows. Chapter 2 reviews the relevant background and the reference encoder-assisted clustering methodology. Chapter 3 presents the anomaly-detection methodology. Chapter 4 summarizes the experimental results. Chapter 5 discusses interpretation, limitations, and implications for live deployment. Chapter 6 concludes the thesis and outlines future work.</w:t>
       </w:r>
     </w:p>
     <w:p ns2:paraId="0F104EC9" ns2:textId="77777777">
@@ -4289,14 +4214,14 @@
           <w:lang w:val="en-US"/>
         </w:rPr>
       </w:pPr>
-      <w:bookmarkStart w:id="46" w:name="_Toc233037921"/>
+      <w:bookmarkStart w:id="16" w:name="_Toc233037921"/>
       <w:r>
         <w:rPr>
           <w:lang w:val="en-US"/>
         </w:rPr>
         <w:t>2 Background</w:t>
       </w:r>
-      <w:bookmarkEnd w:id="46"/>
+      <w:bookmarkEnd w:id="16"/>
     </w:p>
     <w:p ns2:paraId="7FAB1D07" ns2:textId="77777777">
       <w:pPr>
@@ -4306,14 +4231,14 @@
           <w:lang w:val="en-US"/>
         </w:rPr>
       </w:pPr>
-      <w:bookmarkStart w:id="47" w:name="_Toc233037922"/>
+      <w:bookmarkStart w:id="17" w:name="_Toc233037922"/>
       <w:r>
         <w:rPr>
           <w:lang w:val="en-US"/>
         </w:rPr>
         <w:t>2.1 District-heating anomaly detection</w:t>
       </w:r>
-      <w:bookmarkEnd w:id="47"/>
+      <w:bookmarkEnd w:id="17"/>
     </w:p>
     <w:p ns2:paraId="62859598" ns2:textId="77777777">
       <w:pPr>
@@ -4323,10 +4248,7 @@
         </w:rPr>
       </w:pPr>
       <w:r>
-        <w:rPr>
-          <w:lang w:val="en-US"/>
-        </w:rPr>
-        <w:t>District-heating systems transport thermal energy from a central production source to buildings through a pipe network and local substations [19]. At the substation level, measurements such as supply temperature, return temperature, flow, and power provide indirect evidence about how effectively heat is being transferred to the building side. When the system behaves abnormally, that abnormality may appear as an unusual temperature profile, poor separation between supply and return, unstable flow behaviour, or some combination of these effects. In practical monitoring, low supply-return temperature difference, or low delta-T, is often used as an initial engineering warning sign because it can indicate poor heat extraction, inefficient operation, or high return-temperature behaviour [5, 6]. However, low delta-T only captures one narrow anomaly family and cannot explain all relevant abnormal operating patterns. This is one reason recent district-heating research has increasingly combined physical intuition with data-driven modelling. Simple rules remain useful as references, but they are too narrow to represent the full range of possible substation faults or inefficient operating regimes [21].</w:t>
+        <w:t xml:space="preserve">District-heating systems transport thermal energy from a central production source to buildings through a pipe network and local substations [3]. At the substation level, measurements such as supply temperature, return temperature, flow, and power provide indirect evidence about how effectively heat is being transferred to the building side. When the system behaves abnormally, that abnormality may appear as an unusual temperature profile, poor separation between supply and return, unstable flow behaviour, or some combination of these effects. In practical monitoring, low supply-return temperature difference, or low delta-T, is often used as an initial engineering warning sign because it can indicate poor heat extraction, inefficient operation, or high return-temperature behaviour [8, 10]. However, low delta-T only captures one narrow anomaly family and cannot explain all relevant abnormal operating patterns. This is one reason recent district-heating research has increasingly combined physical intuition with data-driven modelling. Simple rules remain useful as references, but they are too narrow to represent the full range of possible substation faults or inefficient operating regimes [11].</w:t>
       </w:r>
     </w:p>
     <w:p ns2:paraId="39C8D265" ns2:textId="77777777">
@@ -4337,10 +4259,7 @@
         </w:rPr>
       </w:pPr>
       <w:r>
-        <w:rPr>
-          <w:lang w:val="en-US"/>
-        </w:rPr>
-        <w:t>Broader time-series anomaly-detection research reaches a similar conclusion. Recent reviews emphasize that unsupervised methods remain especially important when anomaly labels are scarce, expensive, or operationally ambiguous, but they also note that method comparison becomes harder because results depend strongly on the dataset, anomaly type, and evaluation protocol [2, 8]. This is directly relevant for district-heating data, where many suspicious periods can be recognized by operators as unusual without being linked to a single confirmed fault label.</w:t>
+        <w:t xml:space="preserve">Broader time-series anomaly-detection research reaches a similar conclusion. Recent reviews emphasize that unsupervised methods remain especially important when anomaly labels are scarce, expensive, or operationally ambiguous, but they also note that method comparison becomes harder because results depend strongly on the dataset, anomaly type, and evaluation protocol [1, 9]. This is directly relevant for district-heating data, where many suspicious periods can be recognized by operators as unusual without being linked to a single confirmed fault label.</w:t>
       </w:r>
     </w:p>
     <w:p ns2:paraId="683C2EED" ns2:textId="77777777">
@@ -4351,10 +4270,7 @@
         </w:rPr>
       </w:pPr>
       <w:r>
-        <w:rPr>
-          <w:lang w:val="en-US"/>
-        </w:rPr>
-        <w:t>District-heating-specific studies also span several different problem formulations. Calikus et al. study data-driven heat-load patterns and show that operational behaviour can be meaningfully grouped even before explicit fault labels are introduced [6]. SHEDAD moves further toward anomaly detection by building neighborhood-aware comparisons between substations and isolating anomalous supply-temperature and performance behaviour in larger urban networks [5]. More recently, Roelofs et al. highlight the value of labelled service data and event-based evaluation for predictive maintenance, which is especially relevant for understanding what this thesis can and cannot validate with its current historical dataset [7].</w:t>
+        <w:t xml:space="preserve">District-heating-specific studies also span several different problem formulations. Calikus et al. study data-driven heat-load patterns and show that operational behaviour can be meaningfully grouped even before explicit fault labels are introduced [10]. SHEDAD moves further toward anomaly detection by building neighborhood-aware comparisons between substations and isolating anomalous supply-temperature and performance behaviour in larger urban networks [8]. More recently, Roelofs et al. highlight the value of labelled service data and event-based evaluation for predictive maintenance, which is especially relevant for understanding what this thesis can and cannot validate with its current historical dataset [5].</w:t>
       </w:r>
     </w:p>
     <w:p ns2:paraId="67E129D0" ns2:textId="77777777">
@@ -4366,7 +4282,7 @@
         </w:rPr>
       </w:pPr>
       <w:r>
-        <w:t xml:space="preserve">2.2 Reference encoder-assisted clustering method</w:t>
+        <w:t>2.2 Reference encoder-assisted clustering method</w:t>
       </w:r>
     </w:p>
     <w:p ns2:paraId="440E0A19" ns2:textId="77777777">
@@ -4377,7 +4293,7 @@
         </w:rPr>
       </w:pPr>
       <w:r>
-        <w:t xml:space="preserve">The reference method proposes a hierarchical, encoder-assisted clustering approach for fault detection in district-heating substations [1]. Its central idea is to transform time-series observations into a compact representation and then use clustering to construct local peer groups that can be compared against one another. This is a sensible design in a large network with many similar substations, because the method can exploit similarities and differences between multiple operating units instead of relying only on the history of a single site. In that framing, the encoder is not only a compression device. It is also a way to produce a representation on which clustering becomes more meaningful than on raw high-dimensional measurements.</w:t>
+        <w:t xml:space="preserve">The reference method proposes a hierarchical, encoder-assisted clustering approach for fault detection in district-heating substations [7]. Its central idea is to transform time-series observations into a compact representation and then use clustering to construct local peer groups that can be compared against one another. This is a sensible design in a large network with many similar substations, because the method can exploit similarities and differences between multiple operating units instead of relying only on the history of a single site. In that framing, the encoder is not only a compression device. It is also a way to produce a representation on which clustering becomes more meaningful than on raw high-dimensional measurements.</w:t>
       </w:r>
     </w:p>
     <w:p ns2:paraId="69A62C62" ns2:textId="77777777">
@@ -4388,7 +4304,7 @@
         </w:rPr>
       </w:pPr>
       <w:r>
-        <w:t xml:space="preserve">In this thesis, the reference method remains a methodological starting point rather than a blueprint copied without modification. The available dataset contains far fewer usable consumer sheets than the reference case study, and this changes what clustering can realistically achieve. With a small number of buildings, clustering alone is less reliable as a primary fault-detection mechanism because the peer structure is weak. The practical consequence is that clustering is still useful, but its role shifts toward interpretation: it helps describe operating regimes and groups of anomalies after detection, rather than serving as the main detector by itself.</w:t>
+        <w:t>In this thesis, the reference method remains a methodological starting point rather than a blueprint copied without modification. The available dataset contains far fewer usable consumer sheets than the reference case study, and this changes what clustering can realistically achieve. With a small number of buildings, clustering alone is less reliable as a primary fault-detection mechanism because the peer structure is weak. The practical consequence is that clustering is still useful, but its role shifts toward interpretation: it helps describe operating regimes and groups of anomalies after detection, rather than serving as the main detector by itself.</w:t>
       </w:r>
     </w:p>
     <w:p ns2:paraId="27019A7F" ns2:textId="77777777">
@@ -4398,14 +4314,14 @@
           <w:lang w:val="en-US"/>
         </w:rPr>
       </w:pPr>
-      <w:bookmarkStart w:id="51" w:name="_Toc233037924"/>
+      <w:bookmarkStart w:id="18" w:name="_Toc233037924"/>
       <w:r>
         <w:rPr>
           <w:lang w:val="en-US"/>
         </w:rPr>
         <w:t>2.3 Supervised and unsupervised fault detection</w:t>
       </w:r>
-      <w:bookmarkEnd w:id="51"/>
+      <w:bookmarkEnd w:id="18"/>
     </w:p>
     <w:p ns2:paraId="0390CD63" ns2:textId="77777777">
       <w:pPr>
@@ -4415,16 +4331,7 @@
         </w:rPr>
       </w:pPr>
       <w:r>
-        <w:rPr>
-          <w:lang w:val="en-US"/>
-        </w:rPr>
-        <w:t xml:space="preserve">A useful distinction for this thesis is the difference between supervised and unsupervised fault detection. In a supervised setting, the training data contain reliable labels that state which observations correspond to known fault classes and which correspond to normal operation. A supervised model therefore learns a direct mapping from measured signals to predefined labels. This is attractive when labels are abundant and trustworthy, because the resulting performance can be evaluated with standard metrics such as accuracy, precision, recall, and F1-score. In anomaly-detection practice, however, such clean labels are often unavailable, incomplete, or expensive to obtain. Classical anomaly and novelty-detection surveys make clear why unsupervised formulations therefore remain practically important [10, 12]. </w:t>
-      </w:r>
-      <w:r>
-        <w:rPr>
-          <w:lang w:val="en-US"/>
-        </w:rPr>
-        <w:t>Older outlier-detection work provides the statistical background for that same problem setting [22].</w:t>
+        <w:t xml:space="preserve">A useful distinction for this thesis is the difference between supervised and unsupervised fault detection. In a supervised setting, the training data contain reliable labels that state which observations correspond to known fault classes and which correspond to normal operation. A supervised model therefore learns a direct mapping from measured signals to predefined labels. This is attractive when labels are abundant and trustworthy, because the resulting performance can be evaluated with standard metrics such as accuracy, precision, recall, and F1-score. In anomaly-detection practice, however, such clean labels are often unavailable, incomplete, or expensive to obtain. Classical anomaly and novelty-detection surveys make clear why unsupervised formulations therefore remain practically important [12, 13]. Older outlier-detection work provides the statistical background for that same problem setting [14].</w:t>
       </w:r>
     </w:p>
     <w:p ns2:paraId="6523FADF" ns2:textId="77777777">
@@ -4435,17 +4342,7 @@
         </w:rPr>
       </w:pPr>
       <w:r>
-        <w:rPr>
-          <w:lang w:val="en-US"/>
-        </w:rPr>
-        <w:t xml:space="preserve">The present project does not have that kind of labelled dataset. Most windows in the historical data are unlabeled, and even suspicious periods are usually not tied to a confirmed </w:t>
-      </w:r>
-      <w:r>
-        <w:rPr>
-          <w:lang w:val="en-US"/>
-        </w:rPr>
-        <w:lastRenderedPageBreak/>
-        <w:t>fault record. For that reason, the problem is better framed as unsupervised anomaly detection. In an unsupervised setting, the model is trained to capture the structure of historical normal-looking behaviour without being told explicit fault classes. A high anomaly score does not mean that a specific known fault has been diagnosed. It means that the operating pattern is sufficiently different from the learned historical structure that it deserves review. This distinction matters for the whole thesis: the contribution is not a supervised classifier of named faults, but a ranking and interpretation workflow for unusual operating windows. The evaluation consequence is equally important. Without stable labels, one must rely more heavily on score distributions, qualitative inspection, expert review, and careful discussion of what an anomaly flag actually means, which is fully consistent with the cautions raised in unsupervised outlier-evaluation research [11, 23].</w:t>
+        <w:t xml:space="preserve">The present project does not have that kind of labelled dataset. Most windows in the historical data are unlabeled, and even suspicious periods are usually not tied to a confirmed fault record. For that reason, the problem is better framed as unsupervised anomaly detection. In an unsupervised setting, the model is trained to capture the structure of historical normal-looking behaviour without being told explicit fault classes. A high anomaly score does not mean that a specific known fault has been diagnosed. It means that the operating pattern is sufficiently different from the learned historical structure that it deserves review. This distinction matters for the whole thesis: the contribution is not a supervised classifier of named faults, but a ranking and interpretation workflow for unusual operating windows. The evaluation consequence is equally important. Without stable labels, one must rely more heavily on score distributions, qualitative inspection, expert review, and careful discussion of what an anomaly flag actually means, which is fully consistent with the cautions raised in unsupervised outlier-evaluation research [6, 15].</w:t>
       </w:r>
     </w:p>
     <w:p ns2:paraId="305C27C9" ns2:textId="77777777">
@@ -4456,14 +4353,14 @@
           <w:lang w:val="en-US"/>
         </w:rPr>
       </w:pPr>
-      <w:bookmarkStart w:id="52" w:name="_Toc233037925"/>
+      <w:bookmarkStart w:id="19" w:name="_Toc233037925"/>
       <w:r>
         <w:rPr>
           <w:lang w:val="en-US"/>
         </w:rPr>
         <w:t>2.4 Reconstruction-based anomaly detection</w:t>
       </w:r>
-      <w:bookmarkEnd w:id="52"/>
+      <w:bookmarkEnd w:id="19"/>
     </w:p>
     <w:p ns2:paraId="5A6F1DA3" ns2:textId="77777777">
       <w:pPr>
@@ -4473,10 +4370,7 @@
         </w:rPr>
       </w:pPr>
       <w:r>
-        <w:rPr>
-          <w:lang w:val="en-US"/>
-        </w:rPr>
-        <w:t>An autoencoder is a neural network trained to reproduce its own input at the output layer [4]. In the thesis pipeline, each input is a 24-hour multivariate window containing three synchronized channels: supply temperature, return temperature, and a flow-related channel. The encoder compresses the window into a latent representation that retains the most important structure, and the decoder uses that representation to reconstruct the original signal sequence. If a window follows patterns that are common in the historical training data, the model usually reconstructs it well and the reconstruction error remains low. If a window contains an unusual temporal pattern, one or more channels are reconstructed less accurately and the reconstruction error increases. This makes the reconstruction error a natural anomaly score in situations where explicit fault labels are not available. In this thesis, anomaly detection is joint at the window level because all three channels are reconstructed together, but interpretation is feature-specific afterward because the reconstruction error is also decomposed by channel. That decomposition is what allows a flagged window to be discussed as mainly supply-related, return-related, or flow-related rather than only 'anomalous' in a generic sense.</w:t>
+        <w:t xml:space="preserve">An autoencoder is a neural network trained to reproduce its own input at the output layer [16]. In the thesis pipeline, each input is a 24-hour multivariate window containing three synchronized channels: supply temperature, return temperature, and a flow-related channel. The encoder compresses the window into a latent representation that retains the most important structure, and the decoder uses that representation to reconstruct the original signal sequence. If a window follows patterns that are common in the historical training data, the model usually reconstructs it well and the reconstruction error remains low. If a window contains an unusual temporal pattern, one or more channels are reconstructed less accurately and the reconstruction error increases. This makes the reconstruction error a natural anomaly score in situations where explicit fault labels are not available. In this thesis, anomaly detection is joint at the window level because all three channels are reconstructed together, but interpretation is feature-specific afterward because the reconstruction error is also decomposed by channel. That decomposition is what allows a flagged window to be discussed as mainly supply-related, return-related, or flow-related rather than only 'anomalous' in a generic sense.</w:t>
       </w:r>
     </w:p>
     <w:p ns2:paraId="73D0EB53" ns2:textId="77777777">
@@ -4487,10 +4381,7 @@
         </w:rPr>
       </w:pPr>
       <w:r>
-        <w:rPr>
-          <w:lang w:val="en-US"/>
-        </w:rPr>
-        <w:t>Explainability is also an active topic in the autoencoder literature. Recent work on robust and explainable unsupervised autoencoders argues that reconstruction-based detectors become more useful when the anomaly score can be decomposed into understandable temporal or feature-level contributions rather than being treated as a single opaque number [9]. That argument aligns closely with the design choice in this thesis to inspect per-feature reconstruction errors and dominant-feature labels after each window is flagged.</w:t>
+        <w:t xml:space="preserve">Explainability is also an active topic in the autoencoder literature. Recent work on robust and explainable unsupervised autoencoders argues that reconstruction-based detectors become more useful when the anomaly score can be decomposed into understandable temporal or feature-level contributions rather than being treated as a single opaque number [17]. That argument aligns closely with the design choice in this thesis to inspect per-feature reconstruction errors and dominant-feature labels after each window is flagged.</w:t>
       </w:r>
     </w:p>
     <w:p ns2:paraId="30E0CBAF" ns2:textId="77777777">
@@ -4501,14 +4392,15 @@
           <w:lang w:val="en-US"/>
         </w:rPr>
       </w:pPr>
-      <w:bookmarkStart w:id="53" w:name="_Toc233037926"/>
+      <w:bookmarkStart w:id="20" w:name="_Toc233037926"/>
       <w:r>
         <w:rPr>
           <w:lang w:val="en-US"/>
         </w:rPr>
+        <w:lastRenderedPageBreak/>
         <w:t>2.5 Physics-informed feature construction</w:t>
       </w:r>
-      <w:bookmarkEnd w:id="53"/>
+      <w:bookmarkEnd w:id="20"/>
     </w:p>
     <w:p ns2:paraId="3AF2CE38" ns2:textId="77777777">
       <w:pPr>
@@ -4533,7 +4425,7 @@
         </w:rPr>
       </w:pPr>
       <w:r>
-        <w:t xml:space="preserve">Q = m_dot c_p (T_s - T_r)    (1)</w:t>
+        <w:t xml:space="preserve">m = P / (c_p (T_s - T_r))    (1)</w:t>
       </w:r>
     </w:p>
     <w:p ns2:paraId="5382DA39" ns2:textId="77777777">
@@ -4544,7 +4436,7 @@
         </w:rPr>
       </w:pPr>
       <w:r>
-        <w:t xml:space="preserve">where Q is thermal power, m_dot is the measured mass flow rate, c_p is the specific heat capacity of water, T_s is supply temperature, and T_r is return temperature. This relationship links the thermal and hydraulic sides of substation operation and explains why the flow-rate channel is useful for anomaly detection. Unusual heat-transfer behaviour may not be fully visible from temperature signals alone, so the model uses temperature and flow-rate measurements jointly.</w:t>
+        <w:t xml:space="preserve">where m is the mass flow rate [kg/s], P is thermal power [W], c_p is the water specific heat coefficient [J/(kg C)], T_s is the supply temperature [C], and T_r is the return temperature [C]. This relationship links the thermal and hydraulic sides of substation operation and explains why the flow-rate channel is useful for anomaly detection. Unusual heat-transfer behaviour may not be fully visible from temperature signals alone, so the model uses temperature and flow-rate measurements jointly.</w:t>
       </w:r>
     </w:p>
     <w:p ns2:paraId="5DFA9C50" ns2:textId="77777777">
@@ -4568,14 +4460,9 @@
           <w:lang w:val="en-US"/>
         </w:rPr>
       </w:pPr>
-      <w:bookmarkStart w:id="56" w:name="_Toc233037927"/>
       <w:r>
-        <w:rPr>
-          <w:lang w:val="en-US"/>
-        </w:rPr>
-        <w:t>2.6 Related work positioning</w:t>
+        <w:t xml:space="preserve">2.6 Related work</w:t>
       </w:r>
-      <w:bookmarkEnd w:id="56"/>
     </w:p>
     <w:p ns2:paraId="5A5BF660" ns2:textId="77777777">
       <w:pPr>
@@ -4585,10 +4472,7 @@
         </w:rPr>
       </w:pPr>
       <w:r>
-        <w:rPr>
-          <w:lang w:val="en-US"/>
-        </w:rPr>
-        <w:t>The thesis sits at the intersection of three research lines. The first is classical anomaly and novelty detection, where the main question is how to identify rare or abnormal observations without assuming that all possible fault classes are known in advance [10, 12]. Older outlier-detection work provides the statistical framing behind that problem class [22]. The second is unsupervised time-series anomaly detection, where reconstruction models are used to learn normal temporal structure and assign anomaly scores from reconstruction failure [8, 9]. Later autoencoder-based and sequence-based studies show how this idea is implemented in practice [14, 15, 16, 17]. The third is district-heating-specific monitoring, where physical interpretation, efficiency loss, and operational validation matter as much as statistical detection performance. In this thesis, that line of work is represented by HEAT [1], by data-driven grouping of operational behavior [6], by neighborhood-based anomaly detection [5], and by more recent service-validated evaluation work [7].</w:t>
+        <w:t xml:space="preserve">The thesis sits at the intersection of three research lines. The first is classical anomaly and novelty detection, where the main question is how to identify rare or abnormal observations without assuming that all possible fault classes are known in advance [12, 13]. Older outlier-detection work provides the statistical framing behind that problem class [14]. The second is unsupervised time-series anomaly detection, where reconstruction models are used to learn normal temporal structure and assign anomaly scores from reconstruction failure [9, 17]. Later autoencoder-based and sequence-based studies show how this idea is implemented in practice [18, 19, 20, 21]. The third is district-heating-specific monitoring, where physical interpretation, efficiency loss, and operational validation matter as much as statistical detection performance. In this thesis, that line of work is represented by HEAT [7], by data-driven grouping of operational behavior [10], by neighborhood-based anomaly detection [8], and by more recent service-validated evaluation work [5].</w:t>
       </w:r>
     </w:p>
     <w:p ns2:paraId="1507AC1A" ns2:textId="77777777">
@@ -4613,7 +4497,11 @@
         </w:rPr>
       </w:pPr>
       <w:r>
-        <w:t xml:space="preserve">Compared with the reference encoder-assisted clustering method, the main methodological difference is scale. HEAT is strongest when a larger population of substations supports peer-based comparison and clustering. In the present project, the smaller number of usable buildings makes pure peer comparison less reliable as a primary detector. For that reason, the thesis gives reconstruction against each building's own historical behavior the central role, while still retaining clustering as a secondary interpretation layer. This keeps the work aligned with the spirit of HEAT while adapting it to the actual statistical structure of the available data.</w:t>
+        <w:t>Compared with the reference encoder-assisted clustering method, the main methodological difference is scale. HEAT is strongest when a larger population of substations supports peer-</w:t>
+      </w:r>
+      <w:r>
+        <w:lastRenderedPageBreak/>
+        <w:t>based comparison and clustering. In the present project, the smaller number of usable buildings makes pure peer comparison less reliable as a primary detector. For that reason, the thesis gives reconstruction against each building's own historical behavior the central role, while still retaining clustering as a secondary interpretation layer. This keeps the work aligned with the spirit of HEAT while adapting it to the actual statistical structure of the available data.</w:t>
       </w:r>
     </w:p>
     <w:p ns2:paraId="675F1830" ns2:textId="77777777">
@@ -4624,14 +4512,14 @@
           <w:lang w:val="en-US"/>
         </w:rPr>
       </w:pPr>
-      <w:bookmarkStart w:id="57" w:name="_Toc233037928"/>
+      <w:bookmarkStart w:id="22" w:name="_Toc233037928"/>
       <w:r>
         <w:rPr>
           <w:lang w:val="en-US"/>
         </w:rPr>
         <w:t>3 Method</w:t>
       </w:r>
-      <w:bookmarkEnd w:id="57"/>
+      <w:bookmarkEnd w:id="22"/>
     </w:p>
     <w:p ns2:paraId="462FE837" ns2:textId="77777777">
       <w:pPr>
@@ -4641,14 +4529,14 @@
           <w:lang w:val="en-US"/>
         </w:rPr>
       </w:pPr>
-      <w:bookmarkStart w:id="58" w:name="_Toc233037929"/>
+      <w:bookmarkStart w:id="23" w:name="_Toc233037929"/>
       <w:r>
         <w:rPr>
           <w:lang w:val="en-US"/>
         </w:rPr>
         <w:t>3.1 Overview</w:t>
       </w:r>
-      <w:bookmarkEnd w:id="58"/>
+      <w:bookmarkEnd w:id="23"/>
     </w:p>
     <w:p ns2:paraId="36EC6CB5" ns2:textId="77777777">
       <w:pPr>
@@ -4792,7 +4680,14 @@
         <w:rPr>
           <w:lang w:val="en-US"/>
         </w:rPr>
-        <w:t>These sheets are complemented by reports, drawings, and contextual material about the network. That supporting context is important because it provides an engineering frame for interpretation even when explicit fault labels are unavailable. In other words, the results are not evaluated only as abstract machine-learning scores; they are also discussed in relation to how the substations are expected to behave physically.</w:t>
+        <w:t xml:space="preserve">These sheets are complemented by reports, drawings, and contextual material about the network. That supporting context is important because it provides an engineering frame for interpretation even when explicit fault labels are unavailable. In other words, the results are </w:t>
+      </w:r>
+      <w:r>
+        <w:rPr>
+          <w:lang w:val="en-US"/>
+        </w:rPr>
+        <w:lastRenderedPageBreak/>
+        <w:t>not evaluated only as abstract machine-learning scores; they are also discussed in relation to how the substations are expected to behave physically.</w:t>
       </w:r>
     </w:p>
     <w:p ns2:paraId="65A5C545" ns2:textId="77777777">
@@ -4806,7 +4701,6 @@
         <w:rPr>
           <w:lang w:val="en-US"/>
         </w:rPr>
-        <w:lastRenderedPageBreak/>
         <w:t>These seven sheets should not be understood as seven identical substations observed under identical conditions. They differ in coverage, missing-data behaviour, apparent heating intensity, and the frequency of clearly inactive periods. Some sheets contain long stretches that are visually flat or weakly informative for reconstruction-based modeling, while others show richer day-to-day variation. This heterogeneity is part of the practical challenge of the thesis and helps explain why a single shared detector can still produce building-specific anomaly behaviour.</w:t>
       </w:r>
     </w:p>
@@ -5010,14 +4904,14 @@
         <w:rPr>
           <w:lang w:val="en-US"/>
         </w:rPr>
-        <w:t xml:space="preserve">Taken together, these decisions reduce the influence of missing data, long inactive periods, and weakly informative windows. More precisely, each sheet is timestamp-sorted, delta-T is computed as supply minus return, non-active periods are masked using positive power and positive delta-T, the signals are resampled to 15-minute medians, and only short gaps are interpolated. A 24-hour window therefore contains 96 synchronized time steps per channel, and the 12-hour stride creates overlap so that abrupt changes are less likely to fall exactly on window boundaries. Windows are kept only when at least 60 percent of their resampled points correspond to active heating and at least 85 percent of the three-channel samples are </w:t>
+        <w:t xml:space="preserve">Taken together, these decisions reduce the influence of missing data, long inactive periods, and weakly informative windows. More precisely, each sheet is timestamp-sorted, delta-T is computed as supply minus return, non-active periods are masked using positive power and positive delta-T, the signals are resampled to 15-minute medians, and only short gaps are interpolated. A 24-hour window therefore contains 96 synchronized time steps per channel, and the 12-hour stride creates overlap so that abrupt changes are less likely to fall exactly on </w:t>
       </w:r>
       <w:r>
         <w:rPr>
           <w:lang w:val="en-US"/>
         </w:rPr>
         <w:lastRenderedPageBreak/>
-        <w:t>complete. The goal is not simply to maximize the number of windows, but to preserve windows that are comparable enough for reconstruction-based modelling and later interpretation.</w:t>
+        <w:t>window boundaries. Windows are kept only when at least 60 percent of their resampled points correspond to active heating and at least 85 percent of the three-channel samples are complete. The goal is not simply to maximize the number of windows, but to preserve windows that are comparable enough for reconstruction-based modelling and later interpretation.</w:t>
       </w:r>
     </w:p>
     <w:p ns2:paraId="3B43544D" ns2:textId="77777777">
@@ -5120,10 +5014,7 @@
         </w:rPr>
       </w:pPr>
       <w:r>
-        <w:rPr>
-          <w:lang w:val="en-US"/>
-        </w:rPr>
-        <w:t>Because of these limitations, evaluation in this thesis is based on anomaly review, cross-method comparison, and supervisor or domain interpretation rather than standard supervised metrics such as accuracy, recall, or F1-score. This is an important methodological point: the thesis is primarily about finding interpretable anomaly candidates in a realistic low-label setting, not about optimizing a conventional labelled benchmark. That makes the work closer in spirit to recent unsupervised district-heating studies and further motivates the need for richer visual inspection and later live-data validation [5, 7].</w:t>
+        <w:t xml:space="preserve">Because of these limitations, evaluation in this thesis is based on anomaly review, cross-method comparison, and supervisor or domain interpretation rather than standard supervised metrics such as accuracy, recall, or F1-score. This is an important methodological point: the thesis is primarily about finding interpretable anomaly candidates in a realistic low-label setting, not about optimizing a conventional labelled benchmark. That makes the work closer in spirit to recent unsupervised district-heating studies and further motivates the need for richer visual inspection and later live-data validation [8, 5].</w:t>
       </w:r>
     </w:p>
     <w:p ns2:paraId="49DB296D" ns2:textId="77777777">
@@ -5235,14 +5126,8 @@
         <w:rPr>
           <w:lang w:val="en-US"/>
         </w:rPr>
-        <w:t xml:space="preserve">For most result figures, all seven buildings are kept in order to preserve the full comparative picture. The only exception is the reconstruction-error timeline comparison, where Abat </w:t>
-      </w:r>
-      <w:r>
-        <w:rPr>
-          <w:lang w:val="en-US"/>
-        </w:rPr>
         <w:lastRenderedPageBreak/>
-        <w:t>Oliba and Hostatgeria Underfloor are omitted because long faulty constant-value stretches make that specific plot harder to interpret. They are still retained everywhere else in the thesis result set.</w:t>
+        <w:t>For most result figures, all seven buildings are kept in order to preserve the full comparative picture. The only exception is the reconstruction-error timeline comparison, where Abat Oliba and Hostatgeria Underfloor are omitted because long faulty constant-value stretches make that specific plot harder to interpret. They are still retained everywhere else in the thesis result set.</w:t>
       </w:r>
     </w:p>
     <w:p ns2:paraId="0D9426A2" ns2:textId="77777777">
@@ -5399,14 +5284,14 @@
           <w:lang w:val="en-US"/>
         </w:rPr>
       </w:pPr>
-      <w:bookmarkStart w:id="59" w:name="_Toc233037930"/>
+      <w:bookmarkStart w:id="24" w:name="_Toc233037930"/>
       <w:r>
         <w:rPr>
           <w:lang w:val="en-US"/>
         </w:rPr>
         <w:t>3.1.1 Implementation pipeline</w:t>
       </w:r>
-      <w:bookmarkEnd w:id="59"/>
+      <w:bookmarkEnd w:id="24"/>
     </w:p>
     <w:p ns2:paraId="5342EBD1" ns2:textId="77777777">
       <w:pPr>
@@ -5475,14 +5360,14 @@
         <w:rPr>
           <w:lang w:val="en-US"/>
         </w:rPr>
-        <w:t xml:space="preserve">The comparison and visualization scripts then summarize the model outputs at building level. These scripts aggregate anomaly counts, dominant-feature assignments, baseline overlap, threshold comparisons, and clustering summaries into the figures used throughout Chapters 4 </w:t>
+        <w:t xml:space="preserve">The comparison and visualization scripts then summarize the model outputs at building level. These scripts aggregate anomaly counts, dominant-feature assignments, baseline overlap, </w:t>
       </w:r>
       <w:r>
         <w:rPr>
           <w:lang w:val="en-US"/>
         </w:rPr>
         <w:lastRenderedPageBreak/>
-        <w:t>and 5. In this sense, the scripts are not separate from the method; they are the executable form of the methodological pipeline described in this thesis.</w:t>
+        <w:t>threshold comparisons, and clustering summaries into the figures used throughout Chapters 4 and 5. In this sense, the scripts are not separate from the method; they are the executable form of the methodological pipeline described in this thesis.</w:t>
       </w:r>
     </w:p>
     <w:p ns2:paraId="20B4D2AF" ns2:textId="77777777">
@@ -5493,14 +5378,14 @@
           <w:lang w:val="en-US"/>
         </w:rPr>
       </w:pPr>
-      <w:bookmarkStart w:id="60" w:name="_Toc233037931"/>
+      <w:bookmarkStart w:id="25" w:name="_Toc233037931"/>
       <w:r>
         <w:rPr>
           <w:lang w:val="en-US"/>
         </w:rPr>
         <w:t>3.2 Autoencoder architecture</w:t>
       </w:r>
-      <w:bookmarkEnd w:id="60"/>
+      <w:bookmarkEnd w:id="25"/>
     </w:p>
     <w:p ns2:paraId="5403564B" ns2:textId="77777777">
       <w:pPr>
@@ -5510,85 +5395,83 @@
         </w:rPr>
       </w:pPr>
       <w:r>
-        <w:rPr>
-          <w:lang w:val="en-US"/>
-        </w:rPr>
-        <w:t>The current architecture is a compact 1D convolutional autoencoder. Each 24-hour input window is represented as a three-channel sequence of length 96. The encoder first applies a one-dimensional convolution with 16 output channels, kernel size 5, and padding 2, followed by a ReLU activation and max pooling by a factor of 2. A second convolution maps the signal to 16 latent channels with the same kernel size and padding, again followed by ReLU and max pooling. After the two pooling operations, the temporal resolution has been reduced from 96 to 24 time steps, so the latent representation is a compressed multichannel summary of the daily pattern. The decoder then uses two transposed convolutions with stride 2 to upsample the latent signal back to the original sequence length and reconstruct the three input channels. This architecture was chosen as a conservative baseline. The basic autoencoder idea follows Hinton and Salakhutdinov [4]. Autoencoder-based anomaly detection has since been used by Sakurada and Yairi [15] and extended to richer multivariate settings by Zong et al. [16]. Sequence reconstruction for multivariate anomaly detection is also a standard design choice in Malhotra et al. [14]. A broader review of such detectors is given by Belay et al. [17].</w:t>
+        <w:t xml:space="preserve">The current architecture is a compact 1D convolutional autoencoder. Each 24-hour input window is represented as a three-channel sequence of length 96. The encoder first applies a one-dimensional convolution with 16 output channels, kernel size 5, and padding 2, followed by a ReLU activation and max pooling by a factor of 2. A second convolution maps the signal to 16 latent channels with the same kernel size and padding, again followed by ReLU and max pooling. After the two pooling operations, the temporal resolution has been reduced from 96 to 24 time steps, so the latent representation is a compressed multichannel summary of the daily pattern. The decoder then uses two transposed convolutions with stride 2 to upsample the latent signal back to the original sequence length and reconstruct the three input channels. This architecture was chosen as a conservative baseline. The basic autoencoder idea follows Hinton and Salakhutdinov [16]. Autoencoder-based anomaly detection has since been used by Sakurada and Yairi [19] and extended to richer multivariate settings by Zong et al. [20]. Sequence reconstruction for multivariate anomaly detection is also a standard design choice in Malhotra et al. [18]. A broader review of such detectors is given by Belay et al. [21].</w:t>
       </w:r>
     </w:p>
-    <w:p>
+    <w:p ns2:paraId="7F8539BA" ns2:textId="77777777">
       <w:r>
-        <w:t xml:space="preserve">The mathematical formulation of the autoencoder is defined per building. Let X = {x_i}_{i=1}^N denote the retained training windows for one building after preprocessing and normalization. Each input window contains C = 3 channels and T = 96 time steps:</w:t>
+        <w:t>The mathematical formulation of the autoencoder is defined per building. Let X = {x_i}_{i=1}^N denote the retained training windows for one building after preprocessing and normalization. Each input window contains C = 3 channels and T = 96 time steps:</w:t>
       </w:r>
     </w:p>
-    <w:p>
+    <w:p ns2:paraId="350499A5" ns2:textId="77777777">
       <w:r>
-        <w:t xml:space="preserve">x_i in R^{C x T},    C = 3, T = 96.    (2)</w:t>
+        <w:t>x_i in R^{C x T},    C = 3, T = 96.    (2)</w:t>
       </w:r>
     </w:p>
-    <w:p>
+    <w:p ns2:paraId="0C871933" ns2:textId="77777777">
       <w:r>
-        <w:t xml:space="preserve">The encoder maps the input window to a lower-dimensional latent representation:</w:t>
+        <w:t>The encoder maps the input window to a lower-dimensional latent representation:</w:t>
       </w:r>
     </w:p>
-    <w:p>
+    <w:p ns2:paraId="35DE6D3B" ns2:textId="77777777">
       <w:r>
-        <w:t xml:space="preserve">z_i = f_theta(x_i).    (3)</w:t>
+        <w:t>z_i = f_theta(x_i).    (3)</w:t>
       </w:r>
     </w:p>
-    <w:p>
+    <w:p ns2:paraId="311130A6" ns2:textId="77777777">
       <w:r>
-        <w:t xml:space="preserve">The decoder maps this latent representation back to the original input space:</w:t>
+        <w:t>The decoder maps this latent representation back to the original input space:</w:t>
       </w:r>
     </w:p>
-    <w:p>
+    <w:p ns2:paraId="7B841D54" ns2:textId="77777777">
       <w:r>
-        <w:t xml:space="preserve">x_hat_i = g_phi(z_i) = g_phi(f_theta(x_i)).    (4)</w:t>
+        <w:t>x_hat_i = g_phi(z_i) = g_phi(f_theta(x_i)).    (4)</w:t>
       </w:r>
     </w:p>
-    <w:p>
+    <w:p ns2:paraId="1666153B" ns2:textId="77777777">
       <w:r>
-        <w:t xml:space="preserve">The model parameters theta and phi are fitted by minimizing mean squared reconstruction loss over the training windows:</w:t>
+        <w:t>The model parameters theta and phi are fitted by minimizing mean squared reconstruction loss over the training windows:</w:t>
       </w:r>
     </w:p>
-    <w:p>
+    <w:p ns2:paraId="654939B2" ns2:textId="77777777">
       <w:r>
-        <w:t xml:space="preserve">theta*, phi* = argmin_{theta,phi} (1/N) sum_{i=1}^N (1/(C T)) sum_{c=1}^C sum_{t=1}^T (x_{i,c,t} - x_hat_{i,c,t})^2.    (5)</w:t>
+        <w:t>theta*, phi* = argmin_{theta,phi} (1/N) sum_{i=1}^N (1/(C T)) sum_{c=1}^C sum_{t=1}^T (x_{i,c,t} - x_hat_{i,c,t})^2.    (5)</w:t>
       </w:r>
     </w:p>
-    <w:p>
+    <w:p ns2:paraId="45374385" ns2:textId="77777777">
       <w:r>
-        <w:t xml:space="preserve">After training, the total reconstruction error for a retained window is used as the anomaly score:</w:t>
+        <w:t>After training, the total reconstruction error for a retained window is used as the anomaly score:</w:t>
       </w:r>
     </w:p>
-    <w:p>
+    <w:p ns2:paraId="742627B2" ns2:textId="77777777">
       <w:r>
-        <w:t xml:space="preserve">e_i = (1/(C T)) sum_{c=1}^C sum_{t=1}^T (x_{i,c,t} - x_hat_{i,c,t})^2.    (6)</w:t>
+        <w:t>e_i = (1/(C T)) sum_{c=1}^C sum_{t=1}^T (x_{i,c,t} - x_hat_{i,c,t})^2.    (6)</w:t>
       </w:r>
     </w:p>
-    <w:p>
+    <w:p ns2:paraId="76CDC475" ns2:textId="77777777">
       <w:r>
-        <w:t xml:space="preserve">To make the anomaly interpretable, the same reconstruction error is decomposed per feature channel:</w:t>
+        <w:t>To make the anomaly interpretable, the same reconstruction error is decomposed per feature channel:</w:t>
       </w:r>
     </w:p>
-    <w:p>
+    <w:p ns2:paraId="4EF6B2D1" ns2:textId="77777777">
       <w:r>
-        <w:t xml:space="preserve">e_{i,c} = (1/T) sum_{t=1}^T (x_{i,c,t} - x_hat_{i,c,t})^2.    (7)</w:t>
+        <w:lastRenderedPageBreak/>
+        <w:t>e_{i,c} = (1/T) sum_{t=1}^T (x_{i,c,t} - x_hat_{i,c,t})^2.    (7)</w:t>
       </w:r>
     </w:p>
-    <w:p>
+    <w:p ns2:paraId="6936CE92" ns2:textId="77777777">
       <w:r>
-        <w:t xml:space="preserve">The dominant anomaly feature is then defined as the channel with the largest feature-level reconstruction error:</w:t>
+        <w:t>The dominant anomaly feature is then defined as the channel with the largest feature-level reconstruction error:</w:t>
       </w:r>
     </w:p>
-    <w:p>
+    <w:p ns2:paraId="769F9E4A" ns2:textId="77777777">
       <w:r>
-        <w:t xml:space="preserve">d_i = argmax_c e_{i,c}.    (8)</w:t>
+        <w:t>d_i = argmax_c e_{i,c}.    (8)</w:t>
       </w:r>
     </w:p>
-    <w:p>
+    <w:p ns2:paraId="64886242" ns2:textId="77777777">
       <w:r>
-        <w:t xml:space="preserve">This formulation clarifies the role of the autoencoder in the thesis. It is not trained to classify known faults. It is trained to reconstruct recurring daily operating patterns. A high value of e_i indicates that the model could not reconstruct the window using the normal structure learned from historical data, while d_i identifies whether the reconstruction failure is mainly supply-temperature, return-temperature, or flow-rate related.</w:t>
+        <w:t>This formulation clarifies the role of the autoencoder in the thesis. It is not trained to classify known faults. It is trained to reconstruct recurring daily operating patterns. A high value of e_i indicates that the model could not reconstruct the window using the normal structure learned from historical data, while d_i identifies whether the reconstruction failure is mainly supply-temperature, return-temperature, or flow-rate related.</w:t>
       </w:r>
     </w:p>
     <w:p ns2:paraId="6E394C2E" ns2:textId="77777777">
@@ -5605,7 +5488,6 @@
         <w:rPr>
           <w:lang w:val="en-US"/>
         </w:rPr>
-        <w:lastRenderedPageBreak/>
         <w:t>Figure 1 gives a compact schematic of the reconstruction-based detector used throughout the thesis.</w:t>
       </w:r>
     </w:p>
@@ -5637,7 +5519,7 @@
                     <ns8:cNvPicPr/>
                   </ns8:nvPicPr>
                   <ns8:blipFill>
-                    <ns7:blip ns3:embed="rId14"/>
+                    <ns7:blip ns3:embed="rId10"/>
                     <ns7:stretch>
                       <ns7:fillRect/>
                     </ns7:stretch>
@@ -5731,6 +5613,7 @@
         <w:rPr>
           <w:noProof/>
         </w:rPr>
+        <w:lastRenderedPageBreak/>
         <w:drawing>
           <ns5:inline distT="0" distB="0" distL="0" distR="0" ns6:anchorId="1754437B" ns6:editId="16AD84B3">
             <ns5:extent cx="5212080" cy="2978331"/>
@@ -5747,7 +5630,7 @@
                     <ns8:cNvPicPr/>
                   </ns8:nvPicPr>
                   <ns8:blipFill>
-                    <ns7:blip ns3:embed="rId15"/>
+                    <ns7:blip ns3:embed="rId11"/>
                     <ns7:stretch>
                       <ns7:fillRect/>
                     </ns7:stretch>
@@ -5820,15 +5703,14 @@
           <w:lang w:val="en-US"/>
         </w:rPr>
       </w:pPr>
-      <w:bookmarkStart w:id="61" w:name="_Toc233037932"/>
+      <w:bookmarkStart w:id="26" w:name="_Toc233037932"/>
       <w:r>
         <w:rPr>
           <w:lang w:val="en-US"/>
         </w:rPr>
-        <w:lastRenderedPageBreak/>
         <w:t>3.3 Feature construction</w:t>
       </w:r>
-      <w:bookmarkEnd w:id="61"/>
+      <w:bookmarkEnd w:id="26"/>
     </w:p>
     <w:p ns2:paraId="60ADA214" ns2:textId="77777777">
       <w:pPr>
@@ -5891,7 +5773,7 @@
         </w:rPr>
       </w:pPr>
       <w:r>
-        <w:t xml:space="preserve">The flow-rate channel is included because thermal anomalies are often easier to interpret when temperature behaviour is viewed together with hydraulic behaviour. In the final thesis framing, flow rate is treated as a measured sensor channel. The method therefore uses the three synchronized input signals directly: supply temperature, return temperature, and flow rate. This keeps the contribution of the thesis focused on anomaly detection and interpretation, rather than on reconstructing intermediate sensor quantities.</w:t>
+        <w:t xml:space="preserve">The flow-rate channel is included because thermal anomalies are often easier to interpret when temperature behaviour is viewed together with hydraulic behaviour. In the final thesis framing, flow rate is treated as a measured sensor channel. The method therefore uses the three synchronized input signals directly: supply temperature, return temperature, and flow rate. This keeps the contribution of the thesis focused on anomaly detection and interpretation, rather than on reconstructing intermediate sensor quantities. The notation follows Equation (1), which gives the physical relationship between power, temperature difference, and mass flow rate.</w:t>
       </w:r>
     </w:p>
     <w:p ns2:paraId="2CF4DA3E" ns2:textId="77777777">
@@ -5919,6 +5801,7 @@
         <w:rPr>
           <w:lang w:val="en-US"/>
         </w:rPr>
+        <w:lastRenderedPageBreak/>
         <w:t>In practice, the final three-channel representation is therefore a compromise between engineering meaning and model stability. The channels must remain interpretable enough for later anomaly review, but also regular enough that the autoencoder learns recurring daily structure rather than overfitting rare spikes or missing-data artifacts. That balance is one reason the thesis emphasizes channel-level interpretation after detection, instead of treating the latent representation as self-explanatory.</w:t>
       </w:r>
     </w:p>
@@ -5930,14 +5813,14 @@
           <w:lang w:val="en-US"/>
         </w:rPr>
       </w:pPr>
-      <w:bookmarkStart w:id="62" w:name="_Toc233037933"/>
+      <w:bookmarkStart w:id="27" w:name="_Toc233037933"/>
       <w:r>
         <w:rPr>
           <w:lang w:val="en-US"/>
         </w:rPr>
         <w:t>3.4 Thresholding</w:t>
       </w:r>
-      <w:bookmarkEnd w:id="62"/>
+      <w:bookmarkEnd w:id="27"/>
     </w:p>
     <w:p ns2:paraId="24F7A451" ns2:textId="77777777">
       <w:pPr>
@@ -5993,17 +5876,7 @@
         </w:rPr>
       </w:pPr>
       <w:r>
-        <w:rPr>
-          <w:lang w:val="en-US"/>
-        </w:rPr>
-        <w:t xml:space="preserve">The latest main result pack uses the 3-sigma rule, following supervisor guidance. Concretely, the windows are ordered chronologically and the first 80 percent are used for model fitting. After training, the model reconstructs all retained windows, the total reconstruction error is computed as the mean squared difference across all channels and time steps, and the anomaly </w:t>
-      </w:r>
-      <w:r>
-        <w:rPr>
-          <w:lang w:val="en-US"/>
-        </w:rPr>
-        <w:lastRenderedPageBreak/>
-        <w:t>threshold is estimated only from the training subset. Under the 3-sigma rule, a window is flagged when its total reconstruction error exceeds the training mean plus three training standard deviations. The same logic is also applied channel-wise so that supply, return, and flow-specific reconstruction errors can be compared afterward. Neither threshold is uniformly stricter across all sheets. That depends on the shape of the training reconstruction-error distribution, which is consistent with the evaluation concerns discussed by Campos et al. [11] and by Zimek and Filzmoser [23]. Belay et al. also note that score behavior and thresholding are central practical issues in multivariate time-series anomaly detection [17].</w:t>
+        <w:t xml:space="preserve">The latest main result pack uses the 3-sigma rule, following supervisor guidance. Concretely, the windows are ordered chronologically and the first 80 percent are used for model fitting. After training, the model reconstructs all retained windows, the total reconstruction error is computed as the mean squared difference across all channels and time steps, and the anomaly threshold is estimated only from the training subset. Under the 3-sigma rule, a window is flagged when its total reconstruction error exceeds the training mean plus three training standard deviations. The same logic is also applied channel-wise so that supply, return, and flow-specific reconstruction errors can be compared afterward. Neither threshold is uniformly stricter across all sheets. That depends on the shape of the training reconstruction-error distribution, which is consistent with the evaluation concerns discussed by Campos et al. [6] and by Zimek and Filzmoser [15]. Belay et al. also note that score behavior and thresholding are central practical issues in multivariate time-series anomaly detection [21].</w:t>
       </w:r>
     </w:p>
     <w:p ns2:paraId="4E274552" ns2:textId="77777777">
@@ -6014,10 +5887,7 @@
         </w:rPr>
       </w:pPr>
       <w:r>
-        <w:rPr>
-          <w:lang w:val="en-US"/>
-        </w:rPr>
-        <w:t>A second important design choice is that the windows are split chronologically rather than randomly. This means the model is fitted on the earlier portion of the retained history and then evaluated on later periods. The purpose is not only statistical hygiene. It also reflects the intended operational use case, where a detector trained on historical data will later be applied to new incoming windows. A random split would mix early and late behaviour and make the evaluation less representative of prospective monitoring. This choice is also consistent with the broader concern in anomaly-detection evaluation that unrealistic sampling protocols can overstate performance or obscure deployment-relevant behavior [11, 23].</w:t>
+        <w:t xml:space="preserve">A second important design choice is that the windows are split chronologically rather than randomly. This means the model is fitted on the earlier portion of the retained history and then evaluated on later periods. The purpose is not only statistical hygiene. It also reflects the intended operational use case, where a detector trained on historical data will later be applied to new incoming windows. A random split would mix early and late behaviour and make the evaluation less representative of prospective monitoring. This choice is also consistent with the broader concern in anomaly-detection evaluation that unrealistic sampling protocols can overstate performance or obscure deployment-relevant behavior [6, 15].</w:t>
       </w:r>
     </w:p>
     <w:p ns2:paraId="539B2E09" ns2:textId="77777777">
@@ -6028,17 +5898,17 @@
         </w:rPr>
       </w:pPr>
       <w:r>
-        <w:t xml:space="preserve">In mathematical terms, the 3-sigma threshold used in the final result pack is written as tau = mu_train + 3 sigma_train, where mu_train is the mean reconstruction error on the training windows and sigma_train is the corresponding training standard deviation. A retained window i is flagged when its total reconstruction error e_i is greater than tau:</w:t>
+        <w:t>In mathematical terms, the 3-sigma threshold used in the final result pack is written as tau = mu_train + 3 sigma_train, where mu_train is the mean reconstruction error on the training windows and sigma_train is the corresponding training standard deviation. A retained window i is flagged when its total reconstruction error e_i is greater than tau:</w:t>
       </w:r>
     </w:p>
-    <w:p>
+    <w:p ns2:paraId="5F2E7509" ns2:textId="77777777">
       <w:r>
-        <w:t xml:space="preserve">tau = mu_train + 3 sigma_train.    (9)</w:t>
+        <w:t>tau = mu_train + 3 sigma_train.    (9)</w:t>
       </w:r>
     </w:p>
-    <w:p>
+    <w:p ns2:paraId="144CCC2A" ns2:textId="77777777">
       <w:r>
-        <w:t xml:space="preserve">a_i = 1[e_i &gt; tau].    (10)</w:t>
+        <w:t>a_i = 1[e_i &gt; tau].    (10)</w:t>
       </w:r>
     </w:p>
     <w:p ns2:paraId="0341E18B" ns2:textId="77777777">
@@ -6052,6 +5922,7 @@
         <w:rPr>
           <w:lang w:val="en-US"/>
         </w:rPr>
+        <w:lastRenderedPageBreak/>
         <w:t>The 3-sigma rule is easy to explain and is commonly associated with outlier screening under approximately concentrated error distributions. It is not identical to the p99 threshold: p99 fixes the expected upper-tail fraction in the training set, while 3-sigma depends on both the mean and spread of the training errors. As a result, either rule can be stricter depending on whether the training-error distribution is compact, skewed, or contains a heavy tail.</w:t>
       </w:r>
     </w:p>
@@ -6083,7 +5954,6 @@
         <w:rPr>
           <w:lang w:val="en-US"/>
         </w:rPr>
-        <w:lastRenderedPageBreak/>
         <w:t>Figure 2 shows the training reconstruction-error distributions used to compare the p99 and 3-sigma threshold rules.</w:t>
       </w:r>
     </w:p>
@@ -6115,7 +5985,7 @@
                     <ns8:cNvPicPr/>
                   </ns8:nvPicPr>
                   <ns8:blipFill>
-                    <ns7:blip ns3:embed="rId16"/>
+                    <ns7:blip ns3:embed="rId12"/>
                     <ns7:stretch>
                       <ns7:fillRect/>
                     </ns7:stretch>
@@ -6194,10 +6064,7 @@
         </w:rPr>
       </w:pPr>
       <w:r>
-        <w:rPr>
-          <w:lang w:val="en-US"/>
-        </w:rPr>
-        <w:t>The thresholding stage should be understood as a calibration step rather than a separate detector. The autoencoder first produces a continuous reconstruction-error score for every retained window. The threshold then converts that score into a review decision. This distinction matters because the scientific question is not only whether the model can rank unusual windows, but also whether the chosen cutoff produces a manageable and interpretable alert set under realistic low-label conditions [11, 12, 23].</w:t>
+        <w:t xml:space="preserve">The thresholding stage should be understood as a calibration step rather than a separate detector. The autoencoder first produces a continuous reconstruction-error score for every retained window. The threshold then converts that score into a review decision. This distinction matters because the scientific question is not only whether the model can rank unusual windows, but also whether the chosen cutoff produces a manageable and interpretable alert set under realistic low-label conditions [6, 13, 15].</w:t>
       </w:r>
     </w:p>
     <w:p ns2:paraId="3BE591BB" ns2:textId="77777777">
@@ -6208,10 +6075,7 @@
         </w:rPr>
       </w:pPr>
       <w:r>
-        <w:rPr>
-          <w:lang w:val="en-US"/>
-        </w:rPr>
-        <w:t>The comparison between p99 and 3-sigma is useful for precisely this reason. The p99 rule is distribution-free in the sense that it depends only on the empirical upper tail of the training errors, while the 3-sigma rule depends on the training mean and spread. If the error distribution is compact and roughly symmetric, the rules may behave similarly. If the error distribution is skewed or has a heavy right tail, the resulting anomaly counts can diverge substantially. The thesis therefore treats threshold choice as part of the method design, not as a cosmetic post-processing detail [11, 23].</w:t>
+        <w:t xml:space="preserve">The comparison between p99 and 3-sigma is useful for precisely this reason. The p99 rule is distribution-free in the sense that it depends only on the empirical upper tail of the training errors, while the 3-sigma rule depends on the training mean and spread. If the error distribution is compact and roughly symmetric, the rules may behave similarly. If the error distribution is skewed or has a heavy right tail, the resulting anomaly counts can diverge substantially. The thesis therefore treats threshold choice as part of the method design, not as a cosmetic post-processing detail [6, 15].</w:t>
       </w:r>
     </w:p>
     <w:p ns2:paraId="71148ABF" ns2:textId="77777777">
@@ -6222,15 +6086,14 @@
           <w:lang w:val="en-US"/>
         </w:rPr>
       </w:pPr>
-      <w:bookmarkStart w:id="63" w:name="_Toc233037934"/>
+      <w:bookmarkStart w:id="28" w:name="_Toc233037934"/>
       <w:r>
         <w:rPr>
           <w:lang w:val="en-US"/>
         </w:rPr>
-        <w:lastRenderedPageBreak/>
         <w:t>3.5 Engineering baseline</w:t>
       </w:r>
-      <w:bookmarkEnd w:id="63"/>
+      <w:bookmarkEnd w:id="28"/>
     </w:p>
     <w:p ns2:paraId="3C1BBD18" ns2:textId="77777777">
       <w:pPr>
@@ -6269,14 +6132,14 @@
           <w:lang w:val="en-US"/>
         </w:rPr>
       </w:pPr>
-      <w:bookmarkStart w:id="64" w:name="_Toc233037935"/>
+      <w:bookmarkStart w:id="29" w:name="_Toc233037935"/>
       <w:r>
         <w:rPr>
           <w:lang w:val="en-US"/>
         </w:rPr>
         <w:t>3.6 Clustering roles</w:t>
       </w:r>
-      <w:bookmarkEnd w:id="64"/>
+      <w:bookmarkEnd w:id="29"/>
     </w:p>
     <w:p ns2:paraId="7DCE9945" ns2:textId="77777777">
       <w:pPr>
@@ -6355,6 +6218,7 @@
         <w:rPr>
           <w:lang w:val="en-US"/>
         </w:rPr>
+        <w:lastRenderedPageBreak/>
         <w:t>Operating-regime clustering and anomaly-only clustering should also be distinguished conceptually. The first summarizes common daily operating patterns across all retained windows and is useful for understanding how heterogeneous each building is under apparently normal or mixed conditions. The second starts only after anomaly detection and is used to organize the flagged windows into recurring anomaly families. In the final thesis framing, this makes clustering a supporting interpretation layer rather than the primary detection mechanism.</w:t>
       </w:r>
     </w:p>
@@ -6369,14 +6233,7 @@
         <w:rPr>
           <w:lang w:val="en-US"/>
         </w:rPr>
-        <w:t xml:space="preserve">For operating-regime clustering, each retained daily window is summarized by descriptive statistics rather than by the raw 3 x 96 sequence. The feature vector contains supply median and standard deviation, return median and standard deviation, flow median and standard deviation, delta-T median, delta-T 5th percentile, delta-T minimum, and mean active fraction </w:t>
-      </w:r>
-      <w:r>
-        <w:rPr>
-          <w:lang w:val="en-US"/>
-        </w:rPr>
-        <w:lastRenderedPageBreak/>
-        <w:t>over the window. After standardization, KMeans with k = 4 assigns each retained window to the nearest cluster center. In compact form, a window feature vector z_i is assigned to cluster argmin_j ||z_i - c_j||_2^2, where c_j is the j-th cluster centroid in standardized feature space.</w:t>
+        <w:t>For operating-regime clustering, each retained daily window is summarized by descriptive statistics rather than by the raw 3 x 96 sequence. The feature vector contains supply median and standard deviation, return median and standard deviation, flow median and standard deviation, delta-T median, delta-T 5th percentile, delta-T minimum, and mean active fraction over the window. After standardization, KMeans with k = 4 assigns each retained window to the nearest cluster center. In compact form, a window feature vector z_i is assigned to cluster argmin_j ||z_i - c_j||_2^2, where c_j is the j-th cluster centroid in standardized feature space.</w:t>
       </w:r>
     </w:p>
     <w:p ns2:paraId="58858C9F" ns2:textId="77777777">
@@ -6415,17 +6272,17 @@
         </w:rPr>
       </w:pPr>
       <w:r>
-        <w:t xml:space="preserve">The KMeans objective minimizes the within-cluster sum of squared distances in the selected standardized feature space:</w:t>
+        <w:t>The KMeans objective minimizes the within-cluster sum of squared distances in the selected standardized feature space:</w:t>
       </w:r>
     </w:p>
-    <w:p>
+    <w:p ns2:paraId="61411E54" ns2:textId="77777777">
       <w:r>
-        <w:t xml:space="preserve">min_{C_1,...,C_k} sum_{j=1}^k sum_{u_i in C_j} ||u_i - c_j||_2^2.    (11)</w:t>
+        <w:t>min_{C_1,...,C_k} sum_{j=1}^k sum_{u_i in C_j} ||u_i - c_j||_2^2.    (11)</w:t>
       </w:r>
     </w:p>
-    <w:p>
+    <w:p ns2:paraId="1A3569C4" ns2:textId="77777777">
       <w:r>
-        <w:t xml:space="preserve">Here u_i is the standardized feature vector for window i, C_j is cluster j, and c_j is the centroid of that cluster. This clarifies that KMeans groups windows by geometric similarity in the chosen feature space, not by a direct physical fault label.</w:t>
+        <w:t>Here u_i is the standardized feature vector for window i, C_j is cluster j, and c_j is the centroid of that cluster. This clarifies that KMeans groups windows by geometric similarity in the chosen feature space, not by a direct physical fault label.</w:t>
       </w:r>
     </w:p>
     <w:p ns2:paraId="23582125" ns2:textId="77777777">
@@ -6449,14 +6306,15 @@
           <w:lang w:val="en-US"/>
         </w:rPr>
       </w:pPr>
-      <w:bookmarkStart w:id="65" w:name="_Toc233037936"/>
+      <w:bookmarkStart w:id="30" w:name="_Toc233037936"/>
       <w:r>
         <w:rPr>
           <w:lang w:val="en-US"/>
         </w:rPr>
+        <w:lastRenderedPageBreak/>
         <w:t>3.7 Evaluation strategy in a weak-label setting</w:t>
       </w:r>
-      <w:bookmarkEnd w:id="65"/>
+      <w:bookmarkEnd w:id="30"/>
     </w:p>
     <w:p ns2:paraId="1AA6BD97" ns2:textId="77777777">
       <w:pPr>
@@ -6466,17 +6324,7 @@
         </w:rPr>
       </w:pPr>
       <w:r>
-        <w:rPr>
-          <w:lang w:val="en-US"/>
-        </w:rPr>
-        <w:t xml:space="preserve">Because explicit fault labels are largely unavailable, the thesis uses a layered evaluation strategy rather than a single benchmark metric. The first layer is internal model behavior: reconstruction-error distributions, threshold sensitivity, and the stability of dominant-feature assignments. The second layer is engineering comparison: overlap with the low delta-T baseline and inspection of supply, return, and flow behavior in the top anomaly windows. The third layer is cross-building consistency: whether different sheets produce qualitatively different but still interpretable anomaly families under the same pipeline. The fourth and final layer is expert interpretation, where the outputs are reviewed with the supervisor and later compared with live operational context. This evaluation structure is intentionally aligned with </w:t>
-      </w:r>
-      <w:r>
-        <w:rPr>
-          <w:lang w:val="en-US"/>
-        </w:rPr>
-        <w:lastRenderedPageBreak/>
-        <w:t>established warnings that unsupervised anomaly detection cannot be judged responsibly by a single score when labels are weak or absent. That caution is emphasized in the outlier-evaluation study of Campos et al. [11] and in the novelty-detection review of Pimentel et al. [12]. Zimek and Filzmoser make the same point from an outlier-detection perspective [23].</w:t>
+        <w:t xml:space="preserve">Because explicit fault labels are largely unavailable, the thesis uses a layered evaluation strategy rather than a single benchmark metric. The first layer is internal model behavior: reconstruction-error distributions, threshold sensitivity, and the stability of dominant-feature assignments. The second layer is engineering comparison: overlap with the low delta-T baseline and inspection of supply, return, and flow behavior in the top anomaly windows. The third layer is cross-building consistency: whether different sheets produce qualitatively different but still interpretable anomaly families under the same pipeline. The fourth and final layer is expert interpretation, where the outputs are reviewed with the supervisor and later compared with live operational context. This evaluation structure is intentionally aligned with established warnings that unsupervised anomaly detection cannot be judged responsibly by a single score when labels are weak or absent. That caution is emphasized in the outlier-evaluation study of Campos et al. [6] and in the novelty-detection review of Pimentel et al. [13]. Zimek and Filzmoser make the same point from an outlier-detection perspective [15].</w:t>
       </w:r>
     </w:p>
     <w:p ns2:paraId="09C40DF8" ns2:textId="77777777">
@@ -6487,10 +6335,7 @@
         </w:rPr>
       </w:pPr>
       <w:r>
-        <w:rPr>
-          <w:lang w:val="en-US"/>
-        </w:rPr>
-        <w:t>This evaluation strategy is intentionally aligned with the data conditions of the thesis. In a fully labelled study, one would normally report fault-detection metrics against confirmed events. In the present work, the more defensible question is whether the method produces a manageable and physically interpretable anomaly set that is strong enough to justify later prospective testing. The thesis therefore treats interpretability, comparative consistency, and operational reviewability as primary evaluation targets at this stage [11, 12, 23].</w:t>
+        <w:t xml:space="preserve">This evaluation strategy is intentionally aligned with the data conditions of the thesis. In a fully labelled study, one would normally report fault-detection metrics against confirmed events. In the present work, the more defensible question is whether the method produces a manageable and physically interpretable anomaly set that is strong enough to justify later prospective testing. The thesis therefore treats interpretability, comparative consistency, and operational reviewability as primary evaluation targets at this stage [6, 13, 15].</w:t>
       </w:r>
     </w:p>
     <w:p ns2:paraId="41589AD7" ns2:textId="77777777">
@@ -6515,14 +6360,14 @@
           <w:lang w:val="en-US"/>
         </w:rPr>
       </w:pPr>
-      <w:bookmarkStart w:id="66" w:name="_Toc233037937"/>
+      <w:bookmarkStart w:id="31" w:name="_Toc233037937"/>
       <w:r>
         <w:rPr>
           <w:lang w:val="en-US"/>
         </w:rPr>
         <w:t>4 Results</w:t>
       </w:r>
-      <w:bookmarkEnd w:id="66"/>
+      <w:bookmarkEnd w:id="31"/>
     </w:p>
     <w:p ns2:paraId="4A282346" ns2:textId="77777777">
       <w:pPr>
@@ -6732,6 +6577,7 @@
               <w:pStyle w:val="BodyText"/>
             </w:pPr>
             <w:r>
+              <w:lastRenderedPageBreak/>
               <w:t>Abat Garriga</w:t>
             </w:r>
           </w:p>
@@ -7107,7 +6953,6 @@
               <w:pStyle w:val="BodyText"/>
             </w:pPr>
             <w:r>
-              <w:lastRenderedPageBreak/>
               <w:t>Nostra Senyora</w:t>
             </w:r>
           </w:p>
@@ -7176,11 +7021,11 @@
         <w:pStyle w:val="Heading2"/>
         <w:spacing w:before="160" w:after="120"/>
       </w:pPr>
-      <w:bookmarkStart w:id="67" w:name="_Toc233037938"/>
+      <w:bookmarkStart w:id="32" w:name="_Toc233037938"/>
       <w:r>
         <w:t>4.1 Current main result set</w:t>
       </w:r>
-      <w:bookmarkEnd w:id="67"/>
+      <w:bookmarkEnd w:id="32"/>
     </w:p>
     <w:p ns2:paraId="0AC0B1DB" ns2:textId="77777777">
       <w:pPr>
@@ -7233,6 +7078,7 @@
         <w:rPr>
           <w:noProof/>
         </w:rPr>
+        <w:lastRenderedPageBreak/>
         <w:drawing>
           <ns5:inline distT="0" distB="0" distL="0" distR="0" ns6:anchorId="56F75D68" ns6:editId="6AC737DE">
             <ns5:extent cx="5212080" cy="1888167"/>
@@ -7249,7 +7095,7 @@
                     <ns8:cNvPicPr/>
                   </ns8:nvPicPr>
                   <ns8:blipFill>
-                    <ns7:blip ns3:embed="rId17"/>
+                    <ns7:blip ns3:embed="rId13"/>
                     <ns7:stretch>
                       <ns7:fillRect/>
                     </ns7:stretch>
@@ -7311,14 +7157,7 @@
         <w:rPr>
           <w:lang w:val="en-US"/>
         </w:rPr>
-        <w:t xml:space="preserve">Interpretation. This figure compares usable window count, flagged anomaly count, and flagged anomaly rate across the seven selected buildings. The retained-window count shows </w:t>
-      </w:r>
-      <w:r>
-        <w:rPr>
-          <w:lang w:val="en-US"/>
-        </w:rPr>
-        <w:lastRenderedPageBreak/>
-        <w:t>how much usable data each building contributes, the flagged-window count shows the absolute anomaly volume, and the flagged rate shows the relative density of anomalies after accounting for dataset size. The retained-window differences arise from unequal raw-data coverage, missing-data patterns, inactive-heating periods, and the fact that some windows fail the active-share or completeness thresholds during preprocessing.</w:t>
+        <w:t>Interpretation. This figure compares usable window count, flagged anomaly count, and flagged anomaly rate across the seven selected buildings. The retained-window count shows how much usable data each building contributes, the flagged-window count shows the absolute anomaly volume, and the flagged rate shows the relative density of anomalies after accounting for dataset size. The retained-window differences arise from unequal raw-data coverage, missing-data patterns, inactive-heating periods, and the fact that some windows fail the active-share or completeness thresholds during preprocessing.</w:t>
       </w:r>
     </w:p>
     <w:p ns2:paraId="6C1D81F4" ns2:textId="77777777">
@@ -7360,7 +7199,7 @@
                     <ns8:cNvPicPr/>
                   </ns8:nvPicPr>
                   <ns8:blipFill>
-                    <ns7:blip ns3:embed="rId18"/>
+                    <ns7:blip ns3:embed="rId14"/>
                     <ns7:stretch>
                       <ns7:fillRect/>
                     </ns7:stretch>
@@ -7408,7 +7247,6 @@
           <w:i/>
           <w:lang w:val="en-US"/>
         </w:rPr>
-        <w:lastRenderedPageBreak/>
         <w:t>Source: author-generated figure based on all retained 24-hour windows before anomaly filtering.</w:t>
       </w:r>
     </w:p>
@@ -7465,7 +7303,7 @@
                     <ns8:cNvPicPr/>
                   </ns8:nvPicPr>
                   <ns8:blipFill>
-                    <ns7:blip ns3:embed="rId19"/>
+                    <ns7:blip ns3:embed="rId15"/>
                     <ns7:stretch>
                       <ns7:fillRect/>
                     </ns7:stretch>
@@ -7553,7 +7391,6 @@
         <w:rPr>
           <w:noProof/>
         </w:rPr>
-        <w:lastRenderedPageBreak/>
         <w:drawing>
           <ns5:inline distT="0" distB="0" distL="0" distR="0" ns6:anchorId="0E5F6CC2" ns6:editId="7DDBF7AF">
             <ns5:extent cx="5212080" cy="3909059"/>
@@ -7567,6 +7404,422 @@
                 <ns8:pic>
                   <ns8:nvPicPr>
                     <ns8:cNvPr id="3002" name="inspect_autoencoder_cons_abat_cisneros_stabilized_log_01"/>
+                    <ns8:cNvPicPr/>
+                  </ns8:nvPicPr>
+                  <ns8:blipFill>
+                    <ns7:blip ns3:embed="rId16"/>
+                    <ns7:stretch>
+                      <ns7:fillRect/>
+                    </ns7:stretch>
+                  </ns8:blipFill>
+                  <ns8:spPr>
+                    <ns7:xfrm>
+                      <ns7:off x="0" y="0"/>
+                      <ns7:ext cx="5212080" cy="3909059"/>
+                    </ns7:xfrm>
+                    <ns7:prstGeom prst="rect">
+                      <ns7:avLst/>
+                    </ns7:prstGeom>
+                  </ns8:spPr>
+                </ns8:pic>
+              </ns7:graphicData>
+            </ns7:graphic>
+          </ns5:inline>
+        </w:drawing>
+      </w:r>
+    </w:p>
+    <w:p ns2:paraId="113E91CA" ns2:textId="77777777">
+      <w:pPr>
+        <w:pStyle w:val="Caption"/>
+        <w:jc w:val="center"/>
+        <w:rPr>
+          <w:lang w:val="en-US"/>
+        </w:rPr>
+      </w:pPr>
+      <w:r>
+        <w:rPr>
+          <w:lang w:val="en-US"/>
+        </w:rPr>
+        <w:t>Figure 5. Abat Cisneros top reviewed anomaly window. The four traces show supply temperature [deg C], return temperature [deg C], flow [kg/s], and delta-T [deg C] over the 24-hour anomaly window.</w:t>
+      </w:r>
+    </w:p>
+    <w:p ns2:paraId="286BA590" ns2:textId="77777777">
+      <w:pPr>
+        <w:pStyle w:val="BodyText"/>
+        <w:rPr>
+          <w:lang w:val="en-US"/>
+        </w:rPr>
+      </w:pPr>
+      <w:r>
+        <w:rPr>
+          <w:i/>
+          <w:lang w:val="en-US"/>
+        </w:rPr>
+        <w:t>Source: author-generated anomaly inspection plot for Abat Cisneros.</w:t>
+      </w:r>
+    </w:p>
+    <w:p ns2:paraId="44BB3B1C" ns2:textId="77777777">
+      <w:pPr>
+        <w:pStyle w:val="BodyText"/>
+        <w:rPr>
+          <w:lang w:val="en-US"/>
+        </w:rPr>
+      </w:pPr>
+      <w:r>
+        <w:rPr>
+          <w:lang w:val="en-US"/>
+        </w:rPr>
+        <w:t>Interpretation. This anomaly is flow-dominant. The figure should be read from top to bottom. The first two panels show whether supply and return remain smooth or shift abruptly. The third panel shows the physically scaled flow behaviour in kg/s, which is the main panel of interest here. The fourth panel shows delta-T and highlights any overlap with the engineering low delta-T rule. Together the four traces indicate whether the abnormality is mainly hydraulic, mainly thermal, or coupled.</w:t>
+      </w:r>
+    </w:p>
+    <w:p ns2:paraId="5DD78B0B" ns2:textId="77777777">
+      <w:pPr>
+        <w:pStyle w:val="BodyText"/>
+        <w:rPr>
+          <w:lang w:val="en-US"/>
+        </w:rPr>
+      </w:pPr>
+      <w:r>
+        <w:rPr>
+          <w:lang w:val="en-US"/>
+        </w:rPr>
+        <w:t>Figure 6 shows the top reviewed anomaly window for Abat Garriga.</w:t>
+      </w:r>
+    </w:p>
+    <w:p ns2:paraId="30FE1816" ns2:textId="77777777">
+      <w:pPr>
+        <w:pStyle w:val="BodyText"/>
+        <w:jc w:val="center"/>
+      </w:pPr>
+      <w:r>
+        <w:rPr>
+          <w:noProof/>
+        </w:rPr>
+        <w:drawing>
+          <ns5:inline distT="0" distB="0" distL="0" distR="0" ns6:anchorId="7AB9F107" ns6:editId="4A608E81">
+            <ns5:extent cx="5212080" cy="3909059"/>
+            <ns5:effectExtent l="0" t="0" r="0" b="0"/>
+            <ns5:docPr id="3003" name="inspect_autoencoder_cons_abat_garriga_stabilized_log_01"/>
+            <ns5:cNvGraphicFramePr>
+              <ns7:graphicFrameLocks noChangeAspect="1"/>
+            </ns5:cNvGraphicFramePr>
+            <ns7:graphic>
+              <ns7:graphicData uri="http://schemas.openxmlformats.org/drawingml/2006/picture">
+                <ns8:pic>
+                  <ns8:nvPicPr>
+                    <ns8:cNvPr id="3003" name="inspect_autoencoder_cons_abat_garriga_stabilized_log_01"/>
+                    <ns8:cNvPicPr/>
+                  </ns8:nvPicPr>
+                  <ns8:blipFill>
+                    <ns7:blip ns3:embed="rId17"/>
+                    <ns7:stretch>
+                      <ns7:fillRect/>
+                    </ns7:stretch>
+                  </ns8:blipFill>
+                  <ns8:spPr>
+                    <ns7:xfrm>
+                      <ns7:off x="0" y="0"/>
+                      <ns7:ext cx="5212080" cy="3909059"/>
+                    </ns7:xfrm>
+                    <ns7:prstGeom prst="rect">
+                      <ns7:avLst/>
+                    </ns7:prstGeom>
+                  </ns8:spPr>
+                </ns8:pic>
+              </ns7:graphicData>
+            </ns7:graphic>
+          </ns5:inline>
+        </w:drawing>
+      </w:r>
+    </w:p>
+    <w:p ns2:paraId="1EEEDDD5" ns2:textId="77777777">
+      <w:pPr>
+        <w:pStyle w:val="Caption"/>
+        <w:jc w:val="center"/>
+        <w:rPr>
+          <w:lang w:val="en-US"/>
+        </w:rPr>
+      </w:pPr>
+      <w:r>
+        <w:rPr>
+          <w:lang w:val="en-US"/>
+        </w:rPr>
+        <w:t>Figure 6. Abat Garriga top reviewed anomaly window. The four traces show supply temperature [deg C], return temperature [deg C], flow [kg/s], and delta-T [deg C] over the 24-hour anomaly window.</w:t>
+      </w:r>
+    </w:p>
+    <w:p ns2:paraId="4CC1060D" ns2:textId="77777777">
+      <w:pPr>
+        <w:pStyle w:val="BodyText"/>
+        <w:rPr>
+          <w:lang w:val="en-US"/>
+        </w:rPr>
+      </w:pPr>
+      <w:r>
+        <w:rPr>
+          <w:i/>
+          <w:lang w:val="en-US"/>
+        </w:rPr>
+        <w:t>Source: author-generated anomaly inspection plot for Abat Garriga.</w:t>
+      </w:r>
+    </w:p>
+    <w:p ns2:paraId="2411FA1D" ns2:textId="77777777">
+      <w:pPr>
+        <w:pStyle w:val="BodyText"/>
+        <w:rPr>
+          <w:lang w:val="en-US"/>
+        </w:rPr>
+      </w:pPr>
+      <w:r>
+        <w:rPr>
+          <w:lang w:val="en-US"/>
+        </w:rPr>
+        <w:t>Interpretation. This anomaly is return-dominant. The main reading task is to compare the return-temperature trace against the supply trace and then check whether the flow profile changes in a way that supports a thermal explanation. The delta-T panel shows whether the abnormality also coincides with weak temperature separation.</w:t>
+      </w:r>
+    </w:p>
+    <w:p ns2:paraId="60B4F8C2" ns2:textId="77777777">
+      <w:pPr>
+        <w:pStyle w:val="BodyText"/>
+        <w:rPr>
+          <w:lang w:val="en-US"/>
+        </w:rPr>
+      </w:pPr>
+      <w:r>
+        <w:rPr>
+          <w:lang w:val="en-US"/>
+        </w:rPr>
+        <w:t>Figure 7 shows the top reviewed anomaly window for Abat Marcet.</w:t>
+      </w:r>
+    </w:p>
+    <w:p ns2:paraId="19B81C98" ns2:textId="77777777">
+      <w:pPr>
+        <w:pStyle w:val="BodyText"/>
+        <w:jc w:val="center"/>
+      </w:pPr>
+      <w:r>
+        <w:rPr>
+          <w:noProof/>
+        </w:rPr>
+        <w:drawing>
+          <ns5:inline distT="0" distB="0" distL="0" distR="0" ns6:anchorId="7547D988" ns6:editId="60711B1C">
+            <ns5:extent cx="5212080" cy="3909059"/>
+            <ns5:effectExtent l="0" t="0" r="0" b="0"/>
+            <ns5:docPr id="3004" name="inspect_autoencoder_cons_abat_marcet_stabilized_log_01"/>
+            <ns5:cNvGraphicFramePr>
+              <ns7:graphicFrameLocks noChangeAspect="1"/>
+            </ns5:cNvGraphicFramePr>
+            <ns7:graphic>
+              <ns7:graphicData uri="http://schemas.openxmlformats.org/drawingml/2006/picture">
+                <ns8:pic>
+                  <ns8:nvPicPr>
+                    <ns8:cNvPr id="3004" name="inspect_autoencoder_cons_abat_marcet_stabilized_log_01"/>
+                    <ns8:cNvPicPr/>
+                  </ns8:nvPicPr>
+                  <ns8:blipFill>
+                    <ns7:blip ns3:embed="rId18"/>
+                    <ns7:stretch>
+                      <ns7:fillRect/>
+                    </ns7:stretch>
+                  </ns8:blipFill>
+                  <ns8:spPr>
+                    <ns7:xfrm>
+                      <ns7:off x="0" y="0"/>
+                      <ns7:ext cx="5212080" cy="3909059"/>
+                    </ns7:xfrm>
+                    <ns7:prstGeom prst="rect">
+                      <ns7:avLst/>
+                    </ns7:prstGeom>
+                  </ns8:spPr>
+                </ns8:pic>
+              </ns7:graphicData>
+            </ns7:graphic>
+          </ns5:inline>
+        </w:drawing>
+      </w:r>
+    </w:p>
+    <w:p ns2:paraId="472DBF32" ns2:textId="77777777">
+      <w:pPr>
+        <w:pStyle w:val="Caption"/>
+        <w:jc w:val="center"/>
+        <w:rPr>
+          <w:lang w:val="en-US"/>
+        </w:rPr>
+      </w:pPr>
+      <w:r>
+        <w:rPr>
+          <w:lang w:val="en-US"/>
+        </w:rPr>
+        <w:t>Figure 7. Abat Marcet top reviewed anomaly window. The four traces show supply temperature [deg C], return temperature [deg C], flow [kg/s], and delta-T [deg C] over the 24-hour anomaly window.</w:t>
+      </w:r>
+    </w:p>
+    <w:p ns2:paraId="410CC20C" ns2:textId="77777777">
+      <w:pPr>
+        <w:pStyle w:val="BodyText"/>
+        <w:rPr>
+          <w:lang w:val="en-US"/>
+        </w:rPr>
+      </w:pPr>
+      <w:r>
+        <w:rPr>
+          <w:i/>
+          <w:lang w:val="en-US"/>
+        </w:rPr>
+        <w:t>Source: author-generated anomaly inspection plot for Abat Marcet.</w:t>
+      </w:r>
+    </w:p>
+    <w:p ns2:paraId="217D1AE1" ns2:textId="77777777">
+      <w:pPr>
+        <w:pStyle w:val="BodyText"/>
+        <w:rPr>
+          <w:lang w:val="en-US"/>
+        </w:rPr>
+      </w:pPr>
+      <w:r>
+        <w:rPr>
+          <w:lang w:val="en-US"/>
+        </w:rPr>
+        <w:t>Interpretation. This anomaly is flow-dominant. The figure is useful for checking whether the main abnormality appears as unusual flow behaviour, weak thermal separation, or a coordinated change across all channels. Because the signals are synchronized, the reader can compare the timing of the abnormal flow behaviour with the temperature response.</w:t>
+      </w:r>
+    </w:p>
+    <w:p ns2:paraId="577CFF61" ns2:textId="77777777">
+      <w:pPr>
+        <w:pStyle w:val="BodyText"/>
+        <w:rPr>
+          <w:lang w:val="en-US"/>
+        </w:rPr>
+      </w:pPr>
+      <w:r>
+        <w:rPr>
+          <w:lang w:val="en-US"/>
+        </w:rPr>
+        <w:t>Figure 8 shows the top reviewed anomaly window for Abat Oliba.</w:t>
+      </w:r>
+    </w:p>
+    <w:p ns2:paraId="715E1DAD" ns2:textId="77777777">
+      <w:pPr>
+        <w:pStyle w:val="BodyText"/>
+        <w:jc w:val="center"/>
+      </w:pPr>
+      <w:r>
+        <w:rPr>
+          <w:noProof/>
+        </w:rPr>
+        <w:drawing>
+          <ns5:inline distT="0" distB="0" distL="0" distR="0" ns6:anchorId="6E29DFCE" ns6:editId="577BCB7C">
+            <ns5:extent cx="5212080" cy="3909059"/>
+            <ns5:effectExtent l="0" t="0" r="0" b="0"/>
+            <ns5:docPr id="3005" name="inspect_autoencoder_cons_abat_oliba_stabilized_log_01"/>
+            <ns5:cNvGraphicFramePr>
+              <ns7:graphicFrameLocks noChangeAspect="1"/>
+            </ns5:cNvGraphicFramePr>
+            <ns7:graphic>
+              <ns7:graphicData uri="http://schemas.openxmlformats.org/drawingml/2006/picture">
+                <ns8:pic>
+                  <ns8:nvPicPr>
+                    <ns8:cNvPr id="3005" name="inspect_autoencoder_cons_abat_oliba_stabilized_log_01"/>
+                    <ns8:cNvPicPr/>
+                  </ns8:nvPicPr>
+                  <ns8:blipFill>
+                    <ns7:blip ns3:embed="rId19"/>
+                    <ns7:stretch>
+                      <ns7:fillRect/>
+                    </ns7:stretch>
+                  </ns8:blipFill>
+                  <ns8:spPr>
+                    <ns7:xfrm>
+                      <ns7:off x="0" y="0"/>
+                      <ns7:ext cx="5212080" cy="3909059"/>
+                    </ns7:xfrm>
+                    <ns7:prstGeom prst="rect">
+                      <ns7:avLst/>
+                    </ns7:prstGeom>
+                  </ns8:spPr>
+                </ns8:pic>
+              </ns7:graphicData>
+            </ns7:graphic>
+          </ns5:inline>
+        </w:drawing>
+      </w:r>
+    </w:p>
+    <w:p ns2:paraId="42A57633" ns2:textId="77777777">
+      <w:pPr>
+        <w:pStyle w:val="Caption"/>
+        <w:jc w:val="center"/>
+        <w:rPr>
+          <w:lang w:val="en-US"/>
+        </w:rPr>
+      </w:pPr>
+      <w:r>
+        <w:rPr>
+          <w:lang w:val="en-US"/>
+        </w:rPr>
+        <w:t>Figure 8. Abat Oliba top reviewed anomaly window. The four traces show supply temperature [deg C], return temperature [deg C], flow [kg/s], and delta-T [deg C] over the 24-hour anomaly window.</w:t>
+      </w:r>
+    </w:p>
+    <w:p ns2:paraId="60B46236" ns2:textId="77777777">
+      <w:pPr>
+        <w:pStyle w:val="BodyText"/>
+        <w:rPr>
+          <w:lang w:val="en-US"/>
+        </w:rPr>
+      </w:pPr>
+      <w:r>
+        <w:rPr>
+          <w:i/>
+          <w:lang w:val="en-US"/>
+        </w:rPr>
+        <w:t>Source: author-generated anomaly inspection plot for Abat Oliba.</w:t>
+      </w:r>
+    </w:p>
+    <w:p ns2:paraId="032889BD" ns2:textId="77777777">
+      <w:pPr>
+        <w:pStyle w:val="BodyText"/>
+        <w:rPr>
+          <w:lang w:val="en-US"/>
+        </w:rPr>
+      </w:pPr>
+      <w:r>
+        <w:rPr>
+          <w:lang w:val="en-US"/>
+        </w:rPr>
+        <w:t>Interpretation. This anomaly is return-dominant. The figure should be interpreted by comparing the return-temperature behaviour with the supply trace and then checking whether the flow panel remains plausible in physical scale. This is particularly important for Abat Oliba because the sheet was central in earlier flow-sensitivity analysis.</w:t>
+      </w:r>
+    </w:p>
+    <w:p ns2:paraId="4538BC26" ns2:textId="77777777">
+      <w:pPr>
+        <w:pStyle w:val="BodyText"/>
+        <w:rPr>
+          <w:lang w:val="en-US"/>
+        </w:rPr>
+      </w:pPr>
+      <w:r>
+        <w:rPr>
+          <w:lang w:val="en-US"/>
+        </w:rPr>
+        <w:t>Figure 9 shows the top reviewed anomaly window for Hostatgeria DHW Radiators.</w:t>
+      </w:r>
+    </w:p>
+    <w:p ns2:paraId="2C96E941" ns2:textId="77777777">
+      <w:pPr>
+        <w:pStyle w:val="BodyText"/>
+        <w:jc w:val="center"/>
+      </w:pPr>
+      <w:r>
+        <w:rPr>
+          <w:noProof/>
+        </w:rPr>
+        <w:drawing>
+          <ns5:inline distT="0" distB="0" distL="0" distR="0" ns6:anchorId="433A3262" ns6:editId="2AABA761">
+            <ns5:extent cx="5212080" cy="3909059"/>
+            <ns5:effectExtent l="0" t="0" r="0" b="0"/>
+            <ns5:docPr id="3006" name="inspect_autoencoder_cons_hostatgeria_dhw_radiators_stabilized_log_01"/>
+            <ns5:cNvGraphicFramePr>
+              <ns7:graphicFrameLocks noChangeAspect="1"/>
+            </ns5:cNvGraphicFramePr>
+            <ns7:graphic>
+              <ns7:graphicData uri="http://schemas.openxmlformats.org/drawingml/2006/picture">
+                <ns8:pic>
+                  <ns8:nvPicPr>
+                    <ns8:cNvPr id="3006" name="inspect_autoencoder_cons_hostatgeria_dhw_radiators_stabilized_log_01"/>
                     <ns8:cNvPicPr/>
                   </ns8:nvPicPr>
                   <ns8:blipFill>
@@ -7591,7 +7844,7 @@
         </w:drawing>
       </w:r>
     </w:p>
-    <w:p ns2:paraId="113E91CA" ns2:textId="77777777">
+    <w:p ns2:paraId="347F3F3A" ns2:textId="77777777">
       <w:pPr>
         <w:pStyle w:val="Caption"/>
         <w:jc w:val="center"/>
@@ -7603,10 +7856,10 @@
         <w:rPr>
           <w:lang w:val="en-US"/>
         </w:rPr>
-        <w:t>Figure 5. Abat Cisneros top reviewed anomaly window. The four traces show supply temperature [deg C], return temperature [deg C], flow [kg/s], and delta-T [deg C] over the 24-hour anomaly window.</w:t>
+        <w:t>Figure 9. Hostatgeria DHW Radiators top reviewed anomaly window. The four traces show supply temperature [deg C], return temperature [deg C], flow [kg/s], and delta-T [deg C] over the 24-hour anomaly window.</w:t>
       </w:r>
     </w:p>
-    <w:p ns2:paraId="286BA590" ns2:textId="77777777">
+    <w:p ns2:paraId="10A95B08" ns2:textId="77777777">
       <w:pPr>
         <w:pStyle w:val="BodyText"/>
         <w:rPr>
@@ -7618,10 +7871,10 @@
           <w:i/>
           <w:lang w:val="en-US"/>
         </w:rPr>
-        <w:t>Source: author-generated anomaly inspection plot for Abat Cisneros.</w:t>
+        <w:t>Source: author-generated anomaly inspection plot for Hostatgeria DHW Radiators.</w:t>
       </w:r>
     </w:p>
-    <w:p ns2:paraId="44BB3B1C" ns2:textId="77777777">
+    <w:p ns2:paraId="4C15F5E8" ns2:textId="77777777">
       <w:pPr>
         <w:pStyle w:val="BodyText"/>
         <w:rPr>
@@ -7632,10 +7885,10 @@
         <w:rPr>
           <w:lang w:val="en-US"/>
         </w:rPr>
-        <w:t>Interpretation. This anomaly is flow-dominant. The figure should be read from top to bottom. The first two panels show whether supply and return remain smooth or shift abruptly. The third panel shows the physically scaled flow behaviour in kg/s, which is the main panel of interest here. The fourth panel shows delta-T and highlights any overlap with the engineering low delta-T rule. Together the four traces indicate whether the abnormality is mainly hydraulic, mainly thermal, or coupled.</w:t>
+        <w:t>Interpretation. This anomaly is flow-dominant. The figure is useful for checking whether the detector is responding to a recurring hydraulic pattern rather than to a one-off temperature excursion. The relative stability of the temperature panels compared with the flow panel helps explain why this sheet tends to accumulate many flow-dominant anomalies.</w:t>
       </w:r>
     </w:p>
-    <w:p ns2:paraId="5DD78B0B" ns2:textId="77777777">
+    <w:p ns2:paraId="0187A15F" ns2:textId="77777777">
       <w:pPr>
         <w:pStyle w:val="BodyText"/>
         <w:rPr>
@@ -7646,10 +7899,10 @@
         <w:rPr>
           <w:lang w:val="en-US"/>
         </w:rPr>
-        <w:t>Figure 6 shows the top reviewed anomaly window for Abat Garriga.</w:t>
+        <w:t>Figure 10 shows the top reviewed anomaly window for Hostatgeria Underfloor.</w:t>
       </w:r>
     </w:p>
-    <w:p ns2:paraId="30FE1816" ns2:textId="77777777">
+    <w:p ns2:paraId="4B46760E" ns2:textId="77777777">
       <w:pPr>
         <w:pStyle w:val="BodyText"/>
         <w:jc w:val="center"/>
@@ -7658,12 +7911,11 @@
         <w:rPr>
           <w:noProof/>
         </w:rPr>
-        <w:lastRenderedPageBreak/>
         <w:drawing>
-          <ns5:inline distT="0" distB="0" distL="0" distR="0" ns6:anchorId="7AB9F107" ns6:editId="4A608E81">
+          <ns5:inline distT="0" distB="0" distL="0" distR="0" ns6:anchorId="1640FC8C" ns6:editId="56254533">
             <ns5:extent cx="5212080" cy="3909059"/>
             <ns5:effectExtent l="0" t="0" r="0" b="0"/>
-            <ns5:docPr id="3003" name="inspect_autoencoder_cons_abat_garriga_stabilized_log_01"/>
+            <ns5:docPr id="3007" name="inspect_autoencoder_cons_hostatgeria_underfloor_hea_stabilized_log_01"/>
             <ns5:cNvGraphicFramePr>
               <ns7:graphicFrameLocks noChangeAspect="1"/>
             </ns5:cNvGraphicFramePr>
@@ -7671,7 +7923,7 @@
               <ns7:graphicData uri="http://schemas.openxmlformats.org/drawingml/2006/picture">
                 <ns8:pic>
                   <ns8:nvPicPr>
-                    <ns8:cNvPr id="3003" name="inspect_autoencoder_cons_abat_garriga_stabilized_log_01"/>
+                    <ns8:cNvPr id="3007" name="inspect_autoencoder_cons_hostatgeria_underfloor_hea_stabilized_log_01"/>
                     <ns8:cNvPicPr/>
                   </ns8:nvPicPr>
                   <ns8:blipFill>
@@ -7696,7 +7948,7 @@
         </w:drawing>
       </w:r>
     </w:p>
-    <w:p ns2:paraId="1EEEDDD5" ns2:textId="77777777">
+    <w:p ns2:paraId="692BC7EF" ns2:textId="77777777">
       <w:pPr>
         <w:pStyle w:val="Caption"/>
         <w:jc w:val="center"/>
@@ -7708,10 +7960,10 @@
         <w:rPr>
           <w:lang w:val="en-US"/>
         </w:rPr>
-        <w:t>Figure 6. Abat Garriga top reviewed anomaly window. The four traces show supply temperature [deg C], return temperature [deg C], flow [kg/s], and delta-T [deg C] over the 24-hour anomaly window.</w:t>
+        <w:t>Figure 10. Hostatgeria Underfloor top reviewed anomaly window. The four traces show supply temperature [deg C], return temperature [deg C], flow [kg/s], and delta-T [deg C] over the 24-hour anomaly window.</w:t>
       </w:r>
     </w:p>
-    <w:p ns2:paraId="4CC1060D" ns2:textId="77777777">
+    <w:p ns2:paraId="4FA200C1" ns2:textId="77777777">
       <w:pPr>
         <w:pStyle w:val="BodyText"/>
         <w:rPr>
@@ -7723,10 +7975,10 @@
           <w:i/>
           <w:lang w:val="en-US"/>
         </w:rPr>
-        <w:t>Source: author-generated anomaly inspection plot for Abat Garriga.</w:t>
+        <w:t>Source: author-generated anomaly inspection plot for Hostatgeria Underfloor.</w:t>
       </w:r>
     </w:p>
-    <w:p ns2:paraId="2411FA1D" ns2:textId="77777777">
+    <w:p ns2:paraId="1503B94B" ns2:textId="77777777">
       <w:pPr>
         <w:pStyle w:val="BodyText"/>
         <w:rPr>
@@ -7737,10 +7989,10 @@
         <w:rPr>
           <w:lang w:val="en-US"/>
         </w:rPr>
-        <w:t>Interpretation. This anomaly is return-dominant. The main reading task is to compare the return-temperature trace against the supply trace and then check whether the flow profile changes in a way that supports a thermal explanation. The delta-T panel shows whether the abnormality also coincides with weak temperature separation.</w:t>
+        <w:t>Interpretation. This anomaly is supply-dominant and remains the strongest thesis case. The supply panel carries the main abnormality, the return and flow panels provide context, and the delta-T panel shows that the same window also overlaps the engineering baseline. This makes it the clearest example where the learned detector and the engineering reference point to the same abnormal operating period.</w:t>
       </w:r>
     </w:p>
-    <w:p ns2:paraId="60B4F8C2" ns2:textId="77777777">
+    <w:p ns2:paraId="4AE8292B" ns2:textId="77777777">
       <w:pPr>
         <w:pStyle w:val="BodyText"/>
         <w:rPr>
@@ -7751,10 +8003,10 @@
         <w:rPr>
           <w:lang w:val="en-US"/>
         </w:rPr>
-        <w:t>Figure 7 shows the top reviewed anomaly window for Abat Marcet.</w:t>
+        <w:t>Figure 11 shows the top reviewed anomaly window for Nostra Senyora.</w:t>
       </w:r>
     </w:p>
-    <w:p ns2:paraId="19B81C98" ns2:textId="77777777">
+    <w:p ns2:paraId="478035EE" ns2:textId="77777777">
       <w:pPr>
         <w:pStyle w:val="BodyText"/>
         <w:jc w:val="center"/>
@@ -7763,12 +8015,11 @@
         <w:rPr>
           <w:noProof/>
         </w:rPr>
-        <w:lastRenderedPageBreak/>
         <w:drawing>
-          <ns5:inline distT="0" distB="0" distL="0" distR="0" ns6:anchorId="7547D988" ns6:editId="60711B1C">
+          <ns5:inline distT="0" distB="0" distL="0" distR="0" ns6:anchorId="6EDC9429" ns6:editId="1F2CD28C">
             <ns5:extent cx="5212080" cy="3909059"/>
             <ns5:effectExtent l="0" t="0" r="0" b="0"/>
-            <ns5:docPr id="3004" name="inspect_autoencoder_cons_abat_marcet_stabilized_log_01"/>
+            <ns5:docPr id="3008" name="inspect_autoencoder_cons_nostra_senyora_stabilized_log_01"/>
             <ns5:cNvGraphicFramePr>
               <ns7:graphicFrameLocks noChangeAspect="1"/>
             </ns5:cNvGraphicFramePr>
@@ -7776,7 +8027,7 @@
               <ns7:graphicData uri="http://schemas.openxmlformats.org/drawingml/2006/picture">
                 <ns8:pic>
                   <ns8:nvPicPr>
-                    <ns8:cNvPr id="3004" name="inspect_autoencoder_cons_abat_marcet_stabilized_log_01"/>
+                    <ns8:cNvPr id="3008" name="inspect_autoencoder_cons_nostra_senyora_stabilized_log_01"/>
                     <ns8:cNvPicPr/>
                   </ns8:nvPicPr>
                   <ns8:blipFill>
@@ -7801,426 +8052,6 @@
         </w:drawing>
       </w:r>
     </w:p>
-    <w:p ns2:paraId="472DBF32" ns2:textId="77777777">
-      <w:pPr>
-        <w:pStyle w:val="Caption"/>
-        <w:jc w:val="center"/>
-        <w:rPr>
-          <w:lang w:val="en-US"/>
-        </w:rPr>
-      </w:pPr>
-      <w:r>
-        <w:rPr>
-          <w:lang w:val="en-US"/>
-        </w:rPr>
-        <w:t>Figure 7. Abat Marcet top reviewed anomaly window. The four traces show supply temperature [deg C], return temperature [deg C], flow [kg/s], and delta-T [deg C] over the 24-hour anomaly window.</w:t>
-      </w:r>
-    </w:p>
-    <w:p ns2:paraId="410CC20C" ns2:textId="77777777">
-      <w:pPr>
-        <w:pStyle w:val="BodyText"/>
-        <w:rPr>
-          <w:lang w:val="en-US"/>
-        </w:rPr>
-      </w:pPr>
-      <w:r>
-        <w:rPr>
-          <w:i/>
-          <w:lang w:val="en-US"/>
-        </w:rPr>
-        <w:t>Source: author-generated anomaly inspection plot for Abat Marcet.</w:t>
-      </w:r>
-    </w:p>
-    <w:p ns2:paraId="217D1AE1" ns2:textId="77777777">
-      <w:pPr>
-        <w:pStyle w:val="BodyText"/>
-        <w:rPr>
-          <w:lang w:val="en-US"/>
-        </w:rPr>
-      </w:pPr>
-      <w:r>
-        <w:rPr>
-          <w:lang w:val="en-US"/>
-        </w:rPr>
-        <w:t>Interpretation. This anomaly is flow-dominant. The figure is useful for checking whether the main abnormality appears as unusual flow behaviour, weak thermal separation, or a coordinated change across all channels. Because the signals are synchronized, the reader can compare the timing of the abnormal flow behaviour with the temperature response.</w:t>
-      </w:r>
-    </w:p>
-    <w:p ns2:paraId="577CFF61" ns2:textId="77777777">
-      <w:pPr>
-        <w:pStyle w:val="BodyText"/>
-        <w:rPr>
-          <w:lang w:val="en-US"/>
-        </w:rPr>
-      </w:pPr>
-      <w:r>
-        <w:rPr>
-          <w:lang w:val="en-US"/>
-        </w:rPr>
-        <w:t>Figure 8 shows the top reviewed anomaly window for Abat Oliba.</w:t>
-      </w:r>
-    </w:p>
-    <w:p ns2:paraId="715E1DAD" ns2:textId="77777777">
-      <w:pPr>
-        <w:pStyle w:val="BodyText"/>
-        <w:jc w:val="center"/>
-      </w:pPr>
-      <w:r>
-        <w:rPr>
-          <w:noProof/>
-        </w:rPr>
-        <w:lastRenderedPageBreak/>
-        <w:drawing>
-          <ns5:inline distT="0" distB="0" distL="0" distR="0" ns6:anchorId="6E29DFCE" ns6:editId="577BCB7C">
-            <ns5:extent cx="5212080" cy="3909059"/>
-            <ns5:effectExtent l="0" t="0" r="0" b="0"/>
-            <ns5:docPr id="3005" name="inspect_autoencoder_cons_abat_oliba_stabilized_log_01"/>
-            <ns5:cNvGraphicFramePr>
-              <ns7:graphicFrameLocks noChangeAspect="1"/>
-            </ns5:cNvGraphicFramePr>
-            <ns7:graphic>
-              <ns7:graphicData uri="http://schemas.openxmlformats.org/drawingml/2006/picture">
-                <ns8:pic>
-                  <ns8:nvPicPr>
-                    <ns8:cNvPr id="3005" name="inspect_autoencoder_cons_abat_oliba_stabilized_log_01"/>
-                    <ns8:cNvPicPr/>
-                  </ns8:nvPicPr>
-                  <ns8:blipFill>
-                    <ns7:blip ns3:embed="rId23"/>
-                    <ns7:stretch>
-                      <ns7:fillRect/>
-                    </ns7:stretch>
-                  </ns8:blipFill>
-                  <ns8:spPr>
-                    <ns7:xfrm>
-                      <ns7:off x="0" y="0"/>
-                      <ns7:ext cx="5212080" cy="3909059"/>
-                    </ns7:xfrm>
-                    <ns7:prstGeom prst="rect">
-                      <ns7:avLst/>
-                    </ns7:prstGeom>
-                  </ns8:spPr>
-                </ns8:pic>
-              </ns7:graphicData>
-            </ns7:graphic>
-          </ns5:inline>
-        </w:drawing>
-      </w:r>
-    </w:p>
-    <w:p ns2:paraId="42A57633" ns2:textId="77777777">
-      <w:pPr>
-        <w:pStyle w:val="Caption"/>
-        <w:jc w:val="center"/>
-        <w:rPr>
-          <w:lang w:val="en-US"/>
-        </w:rPr>
-      </w:pPr>
-      <w:r>
-        <w:rPr>
-          <w:lang w:val="en-US"/>
-        </w:rPr>
-        <w:t>Figure 8. Abat Oliba top reviewed anomaly window. The four traces show supply temperature [deg C], return temperature [deg C], flow [kg/s], and delta-T [deg C] over the 24-hour anomaly window.</w:t>
-      </w:r>
-    </w:p>
-    <w:p ns2:paraId="60B46236" ns2:textId="77777777">
-      <w:pPr>
-        <w:pStyle w:val="BodyText"/>
-        <w:rPr>
-          <w:lang w:val="en-US"/>
-        </w:rPr>
-      </w:pPr>
-      <w:r>
-        <w:rPr>
-          <w:i/>
-          <w:lang w:val="en-US"/>
-        </w:rPr>
-        <w:t>Source: author-generated anomaly inspection plot for Abat Oliba.</w:t>
-      </w:r>
-    </w:p>
-    <w:p ns2:paraId="032889BD" ns2:textId="77777777">
-      <w:pPr>
-        <w:pStyle w:val="BodyText"/>
-        <w:rPr>
-          <w:lang w:val="en-US"/>
-        </w:rPr>
-      </w:pPr>
-      <w:r>
-        <w:rPr>
-          <w:lang w:val="en-US"/>
-        </w:rPr>
-        <w:t>Interpretation. This anomaly is return-dominant. The figure should be interpreted by comparing the return-temperature behaviour with the supply trace and then checking whether the flow panel remains plausible in physical scale. This is particularly important for Abat Oliba because the sheet was central in earlier flow-sensitivity analysis.</w:t>
-      </w:r>
-    </w:p>
-    <w:p ns2:paraId="4538BC26" ns2:textId="77777777">
-      <w:pPr>
-        <w:pStyle w:val="BodyText"/>
-        <w:rPr>
-          <w:lang w:val="en-US"/>
-        </w:rPr>
-      </w:pPr>
-      <w:r>
-        <w:rPr>
-          <w:lang w:val="en-US"/>
-        </w:rPr>
-        <w:t>Figure 9 shows the top reviewed anomaly window for Hostatgeria DHW Radiators.</w:t>
-      </w:r>
-    </w:p>
-    <w:p ns2:paraId="2C96E941" ns2:textId="77777777">
-      <w:pPr>
-        <w:pStyle w:val="BodyText"/>
-        <w:jc w:val="center"/>
-      </w:pPr>
-      <w:r>
-        <w:rPr>
-          <w:noProof/>
-        </w:rPr>
-        <w:lastRenderedPageBreak/>
-        <w:drawing>
-          <ns5:inline distT="0" distB="0" distL="0" distR="0" ns6:anchorId="433A3262" ns6:editId="2AABA761">
-            <ns5:extent cx="5212080" cy="3909059"/>
-            <ns5:effectExtent l="0" t="0" r="0" b="0"/>
-            <ns5:docPr id="3006" name="inspect_autoencoder_cons_hostatgeria_dhw_radiators_stabilized_log_01"/>
-            <ns5:cNvGraphicFramePr>
-              <ns7:graphicFrameLocks noChangeAspect="1"/>
-            </ns5:cNvGraphicFramePr>
-            <ns7:graphic>
-              <ns7:graphicData uri="http://schemas.openxmlformats.org/drawingml/2006/picture">
-                <ns8:pic>
-                  <ns8:nvPicPr>
-                    <ns8:cNvPr id="3006" name="inspect_autoencoder_cons_hostatgeria_dhw_radiators_stabilized_log_01"/>
-                    <ns8:cNvPicPr/>
-                  </ns8:nvPicPr>
-                  <ns8:blipFill>
-                    <ns7:blip ns3:embed="rId24"/>
-                    <ns7:stretch>
-                      <ns7:fillRect/>
-                    </ns7:stretch>
-                  </ns8:blipFill>
-                  <ns8:spPr>
-                    <ns7:xfrm>
-                      <ns7:off x="0" y="0"/>
-                      <ns7:ext cx="5212080" cy="3909059"/>
-                    </ns7:xfrm>
-                    <ns7:prstGeom prst="rect">
-                      <ns7:avLst/>
-                    </ns7:prstGeom>
-                  </ns8:spPr>
-                </ns8:pic>
-              </ns7:graphicData>
-            </ns7:graphic>
-          </ns5:inline>
-        </w:drawing>
-      </w:r>
-    </w:p>
-    <w:p ns2:paraId="347F3F3A" ns2:textId="77777777">
-      <w:pPr>
-        <w:pStyle w:val="Caption"/>
-        <w:jc w:val="center"/>
-        <w:rPr>
-          <w:lang w:val="en-US"/>
-        </w:rPr>
-      </w:pPr>
-      <w:r>
-        <w:rPr>
-          <w:lang w:val="en-US"/>
-        </w:rPr>
-        <w:t>Figure 9. Hostatgeria DHW Radiators top reviewed anomaly window. The four traces show supply temperature [deg C], return temperature [deg C], flow [kg/s], and delta-T [deg C] over the 24-hour anomaly window.</w:t>
-      </w:r>
-    </w:p>
-    <w:p ns2:paraId="10A95B08" ns2:textId="77777777">
-      <w:pPr>
-        <w:pStyle w:val="BodyText"/>
-        <w:rPr>
-          <w:lang w:val="en-US"/>
-        </w:rPr>
-      </w:pPr>
-      <w:r>
-        <w:rPr>
-          <w:i/>
-          <w:lang w:val="en-US"/>
-        </w:rPr>
-        <w:t>Source: author-generated anomaly inspection plot for Hostatgeria DHW Radiators.</w:t>
-      </w:r>
-    </w:p>
-    <w:p ns2:paraId="4C15F5E8" ns2:textId="77777777">
-      <w:pPr>
-        <w:pStyle w:val="BodyText"/>
-        <w:rPr>
-          <w:lang w:val="en-US"/>
-        </w:rPr>
-      </w:pPr>
-      <w:r>
-        <w:rPr>
-          <w:lang w:val="en-US"/>
-        </w:rPr>
-        <w:t>Interpretation. This anomaly is flow-dominant. The figure is useful for checking whether the detector is responding to a recurring hydraulic pattern rather than to a one-off temperature excursion. The relative stability of the temperature panels compared with the flow panel helps explain why this sheet tends to accumulate many flow-dominant anomalies.</w:t>
-      </w:r>
-    </w:p>
-    <w:p ns2:paraId="0187A15F" ns2:textId="77777777">
-      <w:pPr>
-        <w:pStyle w:val="BodyText"/>
-        <w:rPr>
-          <w:lang w:val="en-US"/>
-        </w:rPr>
-      </w:pPr>
-      <w:r>
-        <w:rPr>
-          <w:lang w:val="en-US"/>
-        </w:rPr>
-        <w:t>Figure 10 shows the top reviewed anomaly window for Hostatgeria Underfloor.</w:t>
-      </w:r>
-    </w:p>
-    <w:p ns2:paraId="4B46760E" ns2:textId="77777777">
-      <w:pPr>
-        <w:pStyle w:val="BodyText"/>
-        <w:jc w:val="center"/>
-      </w:pPr>
-      <w:r>
-        <w:rPr>
-          <w:noProof/>
-        </w:rPr>
-        <w:lastRenderedPageBreak/>
-        <w:drawing>
-          <ns5:inline distT="0" distB="0" distL="0" distR="0" ns6:anchorId="1640FC8C" ns6:editId="56254533">
-            <ns5:extent cx="5212080" cy="3909059"/>
-            <ns5:effectExtent l="0" t="0" r="0" b="0"/>
-            <ns5:docPr id="3007" name="inspect_autoencoder_cons_hostatgeria_underfloor_hea_stabilized_log_01"/>
-            <ns5:cNvGraphicFramePr>
-              <ns7:graphicFrameLocks noChangeAspect="1"/>
-            </ns5:cNvGraphicFramePr>
-            <ns7:graphic>
-              <ns7:graphicData uri="http://schemas.openxmlformats.org/drawingml/2006/picture">
-                <ns8:pic>
-                  <ns8:nvPicPr>
-                    <ns8:cNvPr id="3007" name="inspect_autoencoder_cons_hostatgeria_underfloor_hea_stabilized_log_01"/>
-                    <ns8:cNvPicPr/>
-                  </ns8:nvPicPr>
-                  <ns8:blipFill>
-                    <ns7:blip ns3:embed="rId25"/>
-                    <ns7:stretch>
-                      <ns7:fillRect/>
-                    </ns7:stretch>
-                  </ns8:blipFill>
-                  <ns8:spPr>
-                    <ns7:xfrm>
-                      <ns7:off x="0" y="0"/>
-                      <ns7:ext cx="5212080" cy="3909059"/>
-                    </ns7:xfrm>
-                    <ns7:prstGeom prst="rect">
-                      <ns7:avLst/>
-                    </ns7:prstGeom>
-                  </ns8:spPr>
-                </ns8:pic>
-              </ns7:graphicData>
-            </ns7:graphic>
-          </ns5:inline>
-        </w:drawing>
-      </w:r>
-    </w:p>
-    <w:p ns2:paraId="692BC7EF" ns2:textId="77777777">
-      <w:pPr>
-        <w:pStyle w:val="Caption"/>
-        <w:jc w:val="center"/>
-        <w:rPr>
-          <w:lang w:val="en-US"/>
-        </w:rPr>
-      </w:pPr>
-      <w:r>
-        <w:rPr>
-          <w:lang w:val="en-US"/>
-        </w:rPr>
-        <w:t>Figure 10. Hostatgeria Underfloor top reviewed anomaly window. The four traces show supply temperature [deg C], return temperature [deg C], flow [kg/s], and delta-T [deg C] over the 24-hour anomaly window.</w:t>
-      </w:r>
-    </w:p>
-    <w:p ns2:paraId="4FA200C1" ns2:textId="77777777">
-      <w:pPr>
-        <w:pStyle w:val="BodyText"/>
-        <w:rPr>
-          <w:lang w:val="en-US"/>
-        </w:rPr>
-      </w:pPr>
-      <w:r>
-        <w:rPr>
-          <w:i/>
-          <w:lang w:val="en-US"/>
-        </w:rPr>
-        <w:t>Source: author-generated anomaly inspection plot for Hostatgeria Underfloor.</w:t>
-      </w:r>
-    </w:p>
-    <w:p ns2:paraId="1503B94B" ns2:textId="77777777">
-      <w:pPr>
-        <w:pStyle w:val="BodyText"/>
-        <w:rPr>
-          <w:lang w:val="en-US"/>
-        </w:rPr>
-      </w:pPr>
-      <w:r>
-        <w:rPr>
-          <w:lang w:val="en-US"/>
-        </w:rPr>
-        <w:t>Interpretation. This anomaly is supply-dominant and remains the strongest thesis case. The supply panel carries the main abnormality, the return and flow panels provide context, and the delta-T panel shows that the same window also overlaps the engineering baseline. This makes it the clearest example where the learned detector and the engineering reference point to the same abnormal operating period.</w:t>
-      </w:r>
-    </w:p>
-    <w:p ns2:paraId="4AE8292B" ns2:textId="77777777">
-      <w:pPr>
-        <w:pStyle w:val="BodyText"/>
-        <w:rPr>
-          <w:lang w:val="en-US"/>
-        </w:rPr>
-      </w:pPr>
-      <w:r>
-        <w:rPr>
-          <w:lang w:val="en-US"/>
-        </w:rPr>
-        <w:t>Figure 11 shows the top reviewed anomaly window for Nostra Senyora.</w:t>
-      </w:r>
-    </w:p>
-    <w:p ns2:paraId="478035EE" ns2:textId="77777777">
-      <w:pPr>
-        <w:pStyle w:val="BodyText"/>
-        <w:jc w:val="center"/>
-      </w:pPr>
-      <w:r>
-        <w:rPr>
-          <w:noProof/>
-        </w:rPr>
-        <w:lastRenderedPageBreak/>
-        <w:drawing>
-          <ns5:inline distT="0" distB="0" distL="0" distR="0" ns6:anchorId="6EDC9429" ns6:editId="1F2CD28C">
-            <ns5:extent cx="5212080" cy="3909059"/>
-            <ns5:effectExtent l="0" t="0" r="0" b="0"/>
-            <ns5:docPr id="3008" name="inspect_autoencoder_cons_nostra_senyora_stabilized_log_01"/>
-            <ns5:cNvGraphicFramePr>
-              <ns7:graphicFrameLocks noChangeAspect="1"/>
-            </ns5:cNvGraphicFramePr>
-            <ns7:graphic>
-              <ns7:graphicData uri="http://schemas.openxmlformats.org/drawingml/2006/picture">
-                <ns8:pic>
-                  <ns8:nvPicPr>
-                    <ns8:cNvPr id="3008" name="inspect_autoencoder_cons_nostra_senyora_stabilized_log_01"/>
-                    <ns8:cNvPicPr/>
-                  </ns8:nvPicPr>
-                  <ns8:blipFill>
-                    <ns7:blip ns3:embed="rId26"/>
-                    <ns7:stretch>
-                      <ns7:fillRect/>
-                    </ns7:stretch>
-                  </ns8:blipFill>
-                  <ns8:spPr>
-                    <ns7:xfrm>
-                      <ns7:off x="0" y="0"/>
-                      <ns7:ext cx="5212080" cy="3909059"/>
-                    </ns7:xfrm>
-                    <ns7:prstGeom prst="rect">
-                      <ns7:avLst/>
-                    </ns7:prstGeom>
-                  </ns8:spPr>
-                </ns8:pic>
-              </ns7:graphicData>
-            </ns7:graphic>
-          </ns5:inline>
-        </w:drawing>
-      </w:r>
-    </w:p>
     <w:p ns2:paraId="1CA1C71A" ns2:textId="77777777">
       <w:pPr>
         <w:pStyle w:val="Caption"/>
@@ -8288,7 +8119,6 @@
         <w:rPr>
           <w:noProof/>
         </w:rPr>
-        <w:lastRenderedPageBreak/>
         <w:drawing>
           <ns5:inline distT="0" distB="0" distL="0" distR="0" ns6:anchorId="6A87121C" ns6:editId="5ACEB5A1">
             <ns5:extent cx="5212080" cy="3763115"/>
@@ -8305,7 +8135,7 @@
                     <ns8:cNvPicPr/>
                   </ns8:nvPicPr>
                   <ns8:blipFill>
-                    <ns7:blip ns3:embed="rId27"/>
+                    <ns7:blip ns3:embed="rId23"/>
                     <ns7:stretch>
                       <ns7:fillRect/>
                     </ns7:stretch>
@@ -8393,7 +8223,6 @@
         <w:rPr>
           <w:noProof/>
         </w:rPr>
-        <w:lastRenderedPageBreak/>
         <w:drawing>
           <ns5:inline distT="0" distB="0" distL="0" distR="0" ns6:anchorId="471ACC30" ns6:editId="6A181A16">
             <ns5:extent cx="5212080" cy="3763115"/>
@@ -8410,7 +8239,7 @@
                     <ns8:cNvPicPr/>
                   </ns8:nvPicPr>
                   <ns8:blipFill>
-                    <ns7:blip ns3:embed="rId28"/>
+                    <ns7:blip ns3:embed="rId24"/>
                     <ns7:stretch>
                       <ns7:fillRect/>
                     </ns7:stretch>
@@ -8514,7 +8343,7 @@
                     <ns8:cNvPicPr/>
                   </ns8:nvPicPr>
                   <ns8:blipFill>
-                    <ns7:blip ns3:embed="rId29"/>
+                    <ns7:blip ns3:embed="rId25"/>
                     <ns7:stretch>
                       <ns7:fillRect/>
                     </ns7:stretch>
@@ -8562,7 +8391,6 @@
           <w:i/>
           <w:lang w:val="en-US"/>
         </w:rPr>
-        <w:lastRenderedPageBreak/>
         <w:t>Source: author-generated comparison between the joint three-channel autoencoder and single-channel autoencoders for the Underfloor sheet.</w:t>
       </w:r>
     </w:p>
@@ -8588,14 +8416,14 @@
           <w:lang w:val="en-US"/>
         </w:rPr>
       </w:pPr>
-      <w:bookmarkStart w:id="68" w:name="_Toc233037939"/>
+      <w:bookmarkStart w:id="33" w:name="_Toc233037939"/>
       <w:r>
         <w:rPr>
           <w:lang w:val="en-US"/>
         </w:rPr>
         <w:t>4.2 Dominant-feature interpretation</w:t>
       </w:r>
-      <w:bookmarkEnd w:id="68"/>
+      <w:bookmarkEnd w:id="33"/>
     </w:p>
     <w:p ns2:paraId="3F011BAA" ns2:textId="77777777">
       <w:pPr>
@@ -8664,7 +8492,7 @@
                     <ns8:cNvPicPr/>
                   </ns8:nvPicPr>
                   <ns8:blipFill>
-                    <ns7:blip ns3:embed="rId30"/>
+                    <ns7:blip ns3:embed="rId26"/>
                     <ns7:stretch>
                       <ns7:fillRect/>
                     </ns7:stretch>
@@ -8886,7 +8714,6 @@
               <w:pStyle w:val="BodyText"/>
             </w:pPr>
             <w:r>
-              <w:lastRenderedPageBreak/>
               <w:t>Abat Garriga</w:t>
             </w:r>
           </w:p>
@@ -9362,7 +9189,7 @@
                     <ns8:cNvPicPr/>
                   </ns8:nvPicPr>
                   <ns8:blipFill>
-                    <ns7:blip ns3:embed="rId31"/>
+                    <ns7:blip ns3:embed="rId27"/>
                     <ns7:stretch>
                       <ns7:fillRect/>
                     </ns7:stretch>
@@ -9424,14 +9251,7 @@
         <w:rPr>
           <w:lang w:val="en-US"/>
         </w:rPr>
-        <w:t xml:space="preserve">Interpretation. Each point is one anomaly window, positioned using the actual per-feature reconstruction errors rather than a projected embedding. The axes therefore correspond to </w:t>
-      </w:r>
-      <w:r>
-        <w:rPr>
-          <w:lang w:val="en-US"/>
-        </w:rPr>
-        <w:lastRenderedPageBreak/>
-        <w:t>real model-error quantities, and the point color identifies the dominant anomalous feature for that window.</w:t>
+        <w:t>Interpretation. Each point is one anomaly window, positioned using the actual per-feature reconstruction errors rather than a projected embedding. The axes therefore correspond to real model-error quantities, and the point color identifies the dominant anomalous feature for that window.</w:t>
       </w:r>
     </w:p>
     <w:p ns2:paraId="1187F709" ns2:textId="77777777">
@@ -9442,14 +9262,14 @@
           <w:lang w:val="en-US"/>
         </w:rPr>
       </w:pPr>
-      <w:bookmarkStart w:id="69" w:name="_Toc233037940"/>
+      <w:bookmarkStart w:id="34" w:name="_Toc233037940"/>
       <w:r>
         <w:rPr>
           <w:lang w:val="en-US"/>
         </w:rPr>
         <w:t>4.3 Low delta-T overlap</w:t>
       </w:r>
-      <w:bookmarkEnd w:id="69"/>
+      <w:bookmarkEnd w:id="34"/>
     </w:p>
     <w:p ns2:paraId="281CD53C" ns2:textId="77777777">
       <w:pPr>
@@ -9504,7 +9324,7 @@
                     <ns8:cNvPicPr/>
                   </ns8:nvPicPr>
                   <ns8:blipFill>
-                    <ns7:blip ns3:embed="rId32"/>
+                    <ns7:blip ns3:embed="rId28"/>
                     <ns7:stretch>
                       <ns7:fillRect/>
                     </ns7:stretch>
@@ -9592,7 +9412,6 @@
         <w:rPr>
           <w:noProof/>
         </w:rPr>
-        <w:lastRenderedPageBreak/>
         <w:drawing>
           <ns5:inline distT="0" distB="0" distL="0" distR="0" ns6:anchorId="06C931EA" ns6:editId="6F8C9DD8">
             <ns5:extent cx="5212080" cy="1888167"/>
@@ -9609,7 +9428,7 @@
                     <ns8:cNvPicPr/>
                   </ns8:nvPicPr>
                   <ns8:blipFill>
-                    <ns7:blip ns3:embed="rId33"/>
+                    <ns7:blip ns3:embed="rId29"/>
                     <ns7:stretch>
                       <ns7:fillRect/>
                     </ns7:stretch>
@@ -9696,14 +9515,14 @@
           <w:lang w:val="en-US"/>
         </w:rPr>
       </w:pPr>
-      <w:bookmarkStart w:id="70" w:name="_Toc233037941"/>
+      <w:bookmarkStart w:id="35" w:name="_Toc233037941"/>
       <w:r>
         <w:rPr>
           <w:lang w:val="en-US"/>
         </w:rPr>
         <w:t>4.4 Operating regimes</w:t>
       </w:r>
-      <w:bookmarkEnd w:id="70"/>
+      <w:bookmarkEnd w:id="35"/>
     </w:p>
     <w:p ns2:paraId="60C3D9DE" ns2:textId="77777777">
       <w:pPr>
@@ -9742,7 +9561,6 @@
         <w:rPr>
           <w:noProof/>
         </w:rPr>
-        <w:lastRenderedPageBreak/>
         <w:drawing>
           <ns5:inline distT="0" distB="0" distL="0" distR="0" ns6:anchorId="00905E62" ns6:editId="3D819345">
             <ns5:extent cx="5212080" cy="2199938"/>
@@ -9759,7 +9577,7 @@
                     <ns8:cNvPicPr/>
                   </ns8:nvPicPr>
                   <ns8:blipFill>
-                    <ns7:blip ns3:embed="rId34"/>
+                    <ns7:blip ns3:embed="rId30"/>
                     <ns7:stretch>
                       <ns7:fillRect/>
                     </ns7:stretch>
@@ -10584,7 +10402,6 @@
               <w:pStyle w:val="BodyText"/>
             </w:pPr>
             <w:r>
-              <w:lastRenderedPageBreak/>
               <w:t>Hostatgeria Underfloor</w:t>
             </w:r>
           </w:p>
@@ -10909,14 +10726,14 @@
           <w:lang w:val="en-US"/>
         </w:rPr>
       </w:pPr>
-      <w:bookmarkStart w:id="71" w:name="_Toc233037942"/>
+      <w:bookmarkStart w:id="36" w:name="_Toc233037942"/>
       <w:r>
         <w:rPr>
           <w:lang w:val="en-US"/>
         </w:rPr>
         <w:t>4.5 Threshold comparison</w:t>
       </w:r>
-      <w:bookmarkEnd w:id="71"/>
+      <w:bookmarkEnd w:id="36"/>
     </w:p>
     <w:p ns2:paraId="41C76CE8" ns2:textId="77777777">
       <w:pPr>
@@ -10955,7 +10772,6 @@
         <w:rPr>
           <w:noProof/>
         </w:rPr>
-        <w:lastRenderedPageBreak/>
         <w:drawing>
           <ns5:inline distT="0" distB="0" distL="0" distR="0" ns6:anchorId="3663544D" ns6:editId="1BA5DFB9">
             <ns5:extent cx="5212080" cy="3918157"/>
@@ -10972,7 +10788,7 @@
                     <ns8:cNvPicPr/>
                   </ns8:nvPicPr>
                   <ns8:blipFill>
-                    <ns7:blip ns3:embed="rId16"/>
+                    <ns7:blip ns3:embed="rId12"/>
                     <ns7:stretch>
                       <ns7:fillRect/>
                     </ns7:stretch>
@@ -11624,7 +11440,6 @@
               <w:pStyle w:val="BodyText"/>
             </w:pPr>
             <w:r>
-              <w:lastRenderedPageBreak/>
               <w:t>Nostra Senyora</w:t>
             </w:r>
           </w:p>
@@ -11747,14 +11562,14 @@
           <w:lang w:val="en-US"/>
         </w:rPr>
       </w:pPr>
-      <w:bookmarkStart w:id="72" w:name="_Toc233037943"/>
+      <w:bookmarkStart w:id="37" w:name="_Toc233037943"/>
       <w:r>
         <w:rPr>
           <w:lang w:val="en-US"/>
         </w:rPr>
         <w:t>4.6 Train-test split and anomaly timing</w:t>
       </w:r>
-      <w:bookmarkEnd w:id="72"/>
+      <w:bookmarkEnd w:id="37"/>
     </w:p>
     <w:p ns2:paraId="3D77BACF" ns2:textId="77777777">
       <w:pPr>
@@ -11809,7 +11624,7 @@
                     <ns8:cNvPicPr/>
                   </ns8:nvPicPr>
                   <ns8:blipFill>
-                    <ns7:blip ns3:embed="rId35"/>
+                    <ns7:blip ns3:embed="rId31"/>
                     <ns7:stretch>
                       <ns7:fillRect/>
                     </ns7:stretch>
@@ -11882,15 +11697,14 @@
           <w:lang w:val="en-US"/>
         </w:rPr>
       </w:pPr>
-      <w:bookmarkStart w:id="73" w:name="_Toc233037944"/>
+      <w:bookmarkStart w:id="38" w:name="_Toc233037944"/>
       <w:r>
         <w:rPr>
           <w:lang w:val="en-US"/>
         </w:rPr>
-        <w:lastRenderedPageBreak/>
         <w:t>5 Discussion</w:t>
       </w:r>
-      <w:bookmarkEnd w:id="73"/>
+      <w:bookmarkEnd w:id="38"/>
     </w:p>
     <w:p ns2:paraId="3674442C" ns2:textId="77777777">
       <w:pPr>
@@ -11900,14 +11714,14 @@
           <w:lang w:val="en-US"/>
         </w:rPr>
       </w:pPr>
-      <w:bookmarkStart w:id="74" w:name="_Toc233037945"/>
+      <w:bookmarkStart w:id="39" w:name="_Toc233037945"/>
       <w:r>
         <w:rPr>
           <w:lang w:val="en-US"/>
         </w:rPr>
         <w:t>5.1 What is currently convincing</w:t>
       </w:r>
-      <w:bookmarkEnd w:id="74"/>
+      <w:bookmarkEnd w:id="39"/>
     </w:p>
     <w:p ns2:paraId="2568266D" ns2:textId="77777777">
       <w:pPr>
@@ -11959,14 +11773,14 @@
           <w:lang w:val="en-US"/>
         </w:rPr>
       </w:pPr>
-      <w:bookmarkStart w:id="75" w:name="_Toc233037946"/>
+      <w:bookmarkStart w:id="40" w:name="_Toc233037946"/>
       <w:r>
         <w:rPr>
           <w:lang w:val="en-US"/>
         </w:rPr>
         <w:t>5.2 What remains uncertain</w:t>
       </w:r>
-      <w:bookmarkEnd w:id="75"/>
+      <w:bookmarkEnd w:id="40"/>
     </w:p>
     <w:p ns2:paraId="3279CFEA" ns2:textId="77777777">
       <w:pPr>
@@ -12058,14 +11872,7 @@
         <w:rPr>
           <w:lang w:val="en-US"/>
         </w:rPr>
-        <w:t xml:space="preserve">This has a direct implication for how the results should be presented. Most detected windows should be framed as credible anomaly candidates rather than confirmed faults. That is not a weakness in the thesis framing; it is an honest consequence of the available evidence. In a </w:t>
-      </w:r>
-      <w:r>
-        <w:rPr>
-          <w:lang w:val="en-US"/>
-        </w:rPr>
-        <w:lastRenderedPageBreak/>
-        <w:t>low-label industrial setting, the value of the method lies in prioritizing unusual and interpretable windows for expert review, not in claiming certainty that the underlying fault mechanism is already known.</w:t>
+        <w:t>This has a direct implication for how the results should be presented. Most detected windows should be framed as credible anomaly candidates rather than confirmed faults. That is not a weakness in the thesis framing; it is an honest consequence of the available evidence. In a low-label industrial setting, the value of the method lies in prioritizing unusual and interpretable windows for expert review, not in claiming certainty that the underlying fault mechanism is already known.</w:t>
       </w:r>
     </w:p>
     <w:p ns2:paraId="659C4E62" ns2:textId="77777777">
@@ -12118,14 +11925,14 @@
           <w:lang w:val="en-US"/>
         </w:rPr>
       </w:pPr>
-      <w:bookmarkStart w:id="76" w:name="_Toc233037947"/>
+      <w:bookmarkStart w:id="41" w:name="_Toc233037947"/>
       <w:r>
         <w:rPr>
           <w:lang w:val="en-US"/>
         </w:rPr>
         <w:t>5.3 Implications for live deployment</w:t>
       </w:r>
-      <w:bookmarkEnd w:id="76"/>
+      <w:bookmarkEnd w:id="41"/>
     </w:p>
     <w:p ns2:paraId="1B7E58D9" ns2:textId="77777777">
       <w:pPr>
@@ -12152,14 +11959,7 @@
         <w:rPr>
           <w:lang w:val="en-US"/>
         </w:rPr>
-        <w:t xml:space="preserve">The live-data period will also introduce practical constraints that are less visible in purely historical analysis. In a live setting, anomaly volume matters because too many alerts will reduce review quality, while too few alerts may miss relevant events. For that reason, the historical analysis of threshold choice, dominant-feature attribution, and building-specific </w:t>
-      </w:r>
-      <w:r>
-        <w:rPr>
-          <w:lang w:val="en-US"/>
-        </w:rPr>
-        <w:lastRenderedPageBreak/>
-        <w:t>behaviour is already valuable: it helps define what kind of anomaly output is likely to be actionable once the detector is run prospectively.</w:t>
+        <w:t>The live-data period will also introduce practical constraints that are less visible in purely historical analysis. In a live setting, anomaly volume matters because too many alerts will reduce review quality, while too few alerts may miss relevant events. For that reason, the historical analysis of threshold choice, dominant-feature attribution, and building-specific behaviour is already valuable: it helps define what kind of anomaly output is likely to be actionable once the detector is run prospectively.</w:t>
       </w:r>
     </w:p>
     <w:p ns2:paraId="38C4388F" ns2:textId="77777777">
@@ -12170,10 +11970,7 @@
         </w:rPr>
       </w:pPr>
       <w:r>
-        <w:rPr>
-          <w:lang w:val="en-US"/>
-        </w:rPr>
-        <w:t>A final discussion point concerns what successful evaluation should look like after the thesis. In a fully labelled setting, one would expect event-level fault benchmarks, explicit alert reliability measures, and timing-based criteria such as earliness. Recent district-heating evaluation work shows the value of exactly those fault-centric metrics once service-validated labels become available [7]. The present thesis does not yet have that evidence base, which is why it focuses instead on interpretable anomaly ranking, cross-building comparison, and readiness for future live-data review.</w:t>
+        <w:t xml:space="preserve">A final discussion point concerns what successful evaluation should look like after the thesis. In a fully labelled setting, one would expect event-level fault benchmarks, explicit alert reliability measures, and timing-based criteria such as earliness. Recent district-heating evaluation work shows the value of exactly those fault-centric metrics once service-validated labels become available [5]. The present thesis does not yet have that evidence base, which is why it focuses instead on interpretable anomaly ranking, cross-building comparison, and readiness for future live-data review.</w:t>
       </w:r>
     </w:p>
     <w:p ns2:paraId="5ABA8F01" ns2:textId="77777777">
@@ -12183,14 +11980,14 @@
           <w:lang w:val="en-US"/>
         </w:rPr>
       </w:pPr>
-      <w:bookmarkStart w:id="77" w:name="_Toc233037948"/>
+      <w:bookmarkStart w:id="42" w:name="_Toc233037948"/>
       <w:r>
         <w:rPr>
           <w:lang w:val="en-US"/>
         </w:rPr>
         <w:t>5.4 Threats to validity</w:t>
       </w:r>
-      <w:bookmarkEnd w:id="77"/>
+      <w:bookmarkEnd w:id="42"/>
     </w:p>
     <w:p ns2:paraId="420CF706" ns2:textId="77777777">
       <w:pPr>
@@ -12228,14 +12025,14 @@
           <w:lang w:val="en-US"/>
         </w:rPr>
       </w:pPr>
-      <w:bookmarkStart w:id="78" w:name="_Toc233037949"/>
+      <w:bookmarkStart w:id="43" w:name="_Toc233037949"/>
       <w:r>
         <w:rPr>
           <w:lang w:val="en-US"/>
         </w:rPr>
         <w:t>6 Conclusion</w:t>
       </w:r>
-      <w:bookmarkEnd w:id="78"/>
+      <w:bookmarkEnd w:id="43"/>
     </w:p>
     <w:p ns2:paraId="4A7E95F5" ns2:textId="77777777">
       <w:pPr>
@@ -12245,7 +12042,7 @@
         </w:rPr>
       </w:pPr>
       <w:r>
-        <w:t xml:space="preserve">This thesis develops and evaluates a reconstruction-based anomaly-detection pipeline for a small district-heating network with limited fault labels. The work takes the reference encoder-assisted clustering method as its main methodological reference, but adapts that reference to a setting where long historical coverage is more useful than large-scale peer-group clustering. The main result is that the proposed pipeline can identify anomalous daily operating windows that are not only statistically unusual, but also interpretable in terms of supply temperature, return temperature, and the flow-related input channel. The strongest case is Hostatgeria Underfloor, where the detected anomalies also align with a simple engineering low delta-T rule.</w:t>
+        <w:t>This thesis develops and evaluates a reconstruction-based anomaly-detection pipeline for a small district-heating network with limited fault labels. The work takes the reference encoder-assisted clustering method as its main methodological reference, but adapts that reference to a setting where long historical coverage is more useful than large-scale peer-group clustering. The main result is that the proposed pipeline can identify anomalous daily operating windows that are not only statistically unusual, but also interpretable in terms of supply temperature, return temperature, and the flow-related input channel. The strongest case is Hostatgeria Underfloor, where the detected anomalies also align with a simple engineering low delta-T rule.</w:t>
       </w:r>
     </w:p>
     <w:p ns2:paraId="754BAFF7" ns2:textId="77777777">
@@ -12259,14 +12056,7 @@
         <w:rPr>
           <w:lang w:val="en-US"/>
         </w:rPr>
-        <w:t xml:space="preserve">The broader building-level analysis shows that anomaly behaviour is heterogeneous across the network. Some buildings are mainly associated with flow-dominant anomalies, others are </w:t>
-      </w:r>
-      <w:r>
-        <w:rPr>
-          <w:lang w:val="en-US"/>
-        </w:rPr>
-        <w:lastRenderedPageBreak/>
-        <w:t>more return-dominant, and only a smaller number of cases are clearly supply-dominant. This supports the conclusion that the detector is capturing multiple anomaly families rather than one repeated signature. The flow-channel sensitivity analysis further shows that feature construction materially affects the interpretability of the detected anomalies, which justifies the final representation used in the main results. Operating-regime clustering remains useful as contextual support, but dominant-feature attribution is the clearer explanation layer for discussing anomaly type.</w:t>
+        <w:t>The broader building-level analysis shows that anomaly behaviour is heterogeneous across the network. Some buildings are mainly associated with flow-dominant anomalies, others are more return-dominant, and only a smaller number of cases are clearly supply-dominant. This supports the conclusion that the detector is capturing multiple anomaly families rather than one repeated signature. The flow-channel sensitivity analysis further shows that feature construction materially affects the interpretability of the detected anomalies, which justifies the final representation used in the main results. Operating-regime clustering remains useful as contextual support, but dominant-feature attribution is the clearer explanation layer for discussing anomaly type.</w:t>
       </w:r>
     </w:p>
     <w:p ns2:paraId="73AAA05F" ns2:textId="77777777">
@@ -12291,10 +12081,7 @@
         </w:rPr>
       </w:pPr>
       <w:r>
-        <w:rPr>
-          <w:lang w:val="en-US"/>
-        </w:rPr>
-        <w:t>From a thesis perspective, the contribution is therefore not the discovery of one universally validated fault class, but the construction of a defensible anomaly-detection and interpretation workflow for a realistic low-label district-heating dataset. That is an appropriate outcome for the available data setting and provides a solid basis for the transition from historical analysis to live operational use. A stronger post-thesis evaluation would require the kind of event-centered validation discussed in recent district-heating benchmark work, where accuracy, alert reliability, and earliness can be measured against service-validated fault records [7]. The present thesis does not yet have that evidence base, which is why its main contribution is methodological readiness and interpretable anomaly prioritization rather than benchmark-style fault-class performance.</w:t>
+        <w:t xml:space="preserve">From a thesis perspective, the contribution is therefore not the discovery of one universally validated fault class, but the construction of a defensible anomaly-detection and interpretation workflow for a realistic low-label district-heating dataset. That is an appropriate outcome for the available data setting and provides a solid basis for the transition from historical analysis to live operational use. A stronger post-thesis evaluation would require the kind of event-centered validation discussed in recent district-heating benchmark work, where accuracy, alert reliability, and earliness can be measured against service-validated fault records [5]. The present thesis does not yet have that evidence base, which is why its main contribution is methodological readiness and interpretable anomaly prioritization rather than benchmark-style fault-class performance.</w:t>
       </w:r>
     </w:p>
     <w:p ns2:paraId="262F7FB2" ns2:textId="77777777">
@@ -12304,14 +12091,14 @@
           <w:lang w:val="en-US"/>
         </w:rPr>
       </w:pPr>
-      <w:bookmarkStart w:id="79" w:name="_Toc233037950"/>
+      <w:bookmarkStart w:id="44" w:name="_Toc233037950"/>
       <w:r>
         <w:rPr>
           <w:lang w:val="en-US"/>
         </w:rPr>
         <w:t>6.1 Future work</w:t>
       </w:r>
-      <w:bookmarkEnd w:id="79"/>
+      <w:bookmarkEnd w:id="44"/>
     </w:p>
     <w:p ns2:paraId="0742A9A8" ns2:textId="77777777">
       <w:pPr>
@@ -12321,10 +12108,7 @@
         </w:rPr>
       </w:pPr>
       <w:r>
-        <w:rPr>
-          <w:lang w:val="en-US"/>
-        </w:rPr>
-        <w:t>The next stage of the work is to apply the current detector to live data and use that prospective period as an operational evaluation step. That stage will make it possible to compare flagged windows against ongoing system behaviour, operator observations, and any available maintenance or event context. A second priority is to refine threshold selection once live alert volume can be judged operationally rather than only historically. A third priority is to strengthen validation by collecting any maintenance, alarm, or manually reviewed event records that can be aligned with the flagged windows. Beyond deployment, a natural continuation of the thesis would be to broaden the building set as cleaner data become available and to compare the current joint autoencoder with alternative architectures or per-feature detectors under the same review workflow. Another extension is to incorporate contextual variables such as outdoor temperature, season, month, and day type. Their relevance follows from the broader system role of district heating in seasonal energy supply [19, 21]. The efficiency perspective in Heat Roadmap Europe points in the same direction [20]. Such context could reduce false positives by helping the detector separate genuinely abnormal behavior from expected seasonal regime shifts. If richer live measurements become available later, additional variables such as pressure, valve position, or occupancy-related proxies could also support more precise anomaly interpretation.</w:t>
+        <w:t xml:space="preserve">The next stage of the work is to apply the current detector to live data and use that prospective period as an operational evaluation step. That stage will make it possible to compare flagged windows against ongoing system behaviour, operator observations, and any available maintenance or event context. A second priority is to refine threshold selection once live alert volume can be judged operationally rather than only historically. A third priority is to strengthen validation by collecting any maintenance, alarm, or manually reviewed event records that can be aligned with the flagged windows. Beyond deployment, a natural continuation of the thesis would be to broaden the building set as cleaner data become available and to compare the current joint autoencoder with alternative architectures or per-feature detectors under the same review workflow. Another extension is to incorporate contextual variables such as outdoor temperature, season, month, and day type. Their relevance follows from the broader system role of district heating in seasonal energy supply [3, 11]. The efficiency perspective in Heat Roadmap Europe points in the same direction [4]. Such context could reduce false positives by helping the detector separate genuinely abnormal behavior from expected seasonal regime shifts. If richer live measurements become available later, additional variables such as pressure, valve position, or occupancy-related proxies could also support more precise anomaly interpretation.</w:t>
       </w:r>
     </w:p>
     <w:p ns2:paraId="23734B47" ns2:textId="77777777">
@@ -12343,17 +12127,16 @@
           <w:lang w:val="en-US"/>
         </w:rPr>
       </w:pPr>
-      <w:bookmarkStart w:id="80" w:name="_Toc233037951"/>
+      <w:bookmarkStart w:id="45" w:name="_Toc233037951"/>
       <w:r>
         <w:rPr>
           <w:lang w:val="en-US"/>
         </w:rPr>
-        <w:lastRenderedPageBreak/>
         <w:t>References</w:t>
       </w:r>
-      <w:bookmarkEnd w:id="80"/>
+      <w:bookmarkEnd w:id="45"/>
     </w:p>
-    <w:p ns2:paraId="56D2F386" ns2:textId="77777777">
+    <w:p ns2:paraId="01245C7C" ns2:textId="77777777">
       <w:pPr>
         <w:pStyle w:val="BodyText"/>
         <w:rPr>
@@ -12361,10 +12144,7 @@
         </w:rPr>
       </w:pPr>
       <w:r>
-        <w:rPr>
-          <w:lang w:val="en-US"/>
-        </w:rPr>
-        <w:t>[1] HEAT: Hierarchical-constrained Encoder-Assisted Time series clustering for fault detection in district heating substations, Energy and AI, 2025.</w:t>
+        <w:t xml:space="preserve">[1] R. Chalapathy and S. Chawla, Deep Learning for Anomaly Detection: A Survey, arXiv:1901.03407, 2019.</w:t>
       </w:r>
     </w:p>
     <w:p ns2:paraId="75D546C0" ns2:textId="77777777">
@@ -12375,10 +12155,7 @@
         </w:rPr>
       </w:pPr>
       <w:r>
-        <w:rPr>
-          <w:lang w:val="en-US"/>
-        </w:rPr>
-        <w:t>[2] R. Chalapathy and S. Chawla, Deep Learning for Anomaly Detection: A Survey, arXiv:1901.03407, 2019.</w:t>
+        <w:t xml:space="preserve">[2] M. Jiang, C. Hou, A. Zheng, X. Hu, S. Han, H. Huang, X. He, P. S. Yu, and Y. Zhao, Weakly Supervised Anomaly Detection: A Survey, arXiv:2302.04549, 2023.</w:t>
       </w:r>
     </w:p>
     <w:p ns2:paraId="1208233F" ns2:textId="77777777">
@@ -12389,10 +12166,139 @@
         </w:rPr>
       </w:pPr>
       <w:r>
-        <w:rPr>
-          <w:lang w:val="en-US"/>
-        </w:rPr>
-        <w:t>[3] M. Jiang, C. Hou, A. Zheng, X. Hu, S. Han, H. Huang, X. He, P. S. Yu, and Y. Zhao, Weakly Supervised Anomaly Detection: A Survey, arXiv:2302.04549, 2023.</w:t>
+        <w:t xml:space="preserve">[3] H. Lund, S. Werner, R. Wiltshire, S. Svendsen, J. E. Thorsen, F. Hvelplund, and B. V. Mathiesen, 4th Generation District Heating (4GDH): Integrating smart thermal grids into future sustainable energy systems, Energy, vol. 68, pp. 1-11, 2014.</w:t>
+      </w:r>
+    </w:p>
+    <w:p ns2:paraId="6AFCA370" ns2:textId="77777777">
+      <w:pPr>
+        <w:pStyle w:val="BodyText"/>
+        <w:rPr>
+          <w:lang w:val="en-US"/>
+        </w:rPr>
+      </w:pPr>
+      <w:r>
+        <w:t xml:space="preserve">[4] D. Connolly, H. Lund, B. V. Mathiesen, S. Werner, B. Moller, U. Persson, T. Boermans, D. Trier, P. A. Ostergaard, and S. Nielsen, Heat Roadmap Europe: Combining district heating with heat savings to decarbonise the EU energy system, Energy Policy, vol. 65, pp. 475-489, 2014.</w:t>
+      </w:r>
+    </w:p>
+    <w:p ns2:paraId="56D2F386" ns2:textId="77777777">
+      <w:pPr>
+        <w:pStyle w:val="BodyText"/>
+        <w:rPr>
+          <w:lang w:val="en-US"/>
+        </w:rPr>
+      </w:pPr>
+      <w:r>
+        <w:t xml:space="preserve">[5] C. M. A. Roelofs, E. Guevara Bastidas, T. Hugo, S. Faulstich, and A. Cadenbach, Enabling Predictive Maintenance in District Heating Substations: A Labelled Dataset and Fault Detection Evaluation Framework based on Service Data, arXiv:2511.14791, 2025.</w:t>
+      </w:r>
+    </w:p>
+    <w:p ns2:paraId="7916E7D6" ns2:textId="77777777">
+      <w:pPr>
+        <w:pStyle w:val="BodyText"/>
+        <w:rPr>
+          <w:lang w:val="en-US"/>
+        </w:rPr>
+      </w:pPr>
+      <w:r>
+        <w:t xml:space="preserve">[6] G. O. Campos, A. Zimek, J. Sander, R. J. G. B. Campello, and B. Micenkova, On the evaluation of unsupervised outlier detection: measures, datasets, and an empirical study, Data Mining and Knowledge Discovery, vol. 30, pp. 891-927, 2016.</w:t>
+      </w:r>
+    </w:p>
+    <w:p ns2:paraId="3852499E" ns2:textId="77777777">
+      <w:pPr>
+        <w:pStyle w:val="BodyText"/>
+        <w:rPr>
+          <w:lang w:val="en-US"/>
+        </w:rPr>
+      </w:pPr>
+      <w:r>
+        <w:t xml:space="preserve">[7] HEAT: Hierarchical-constrained Encoder-Assisted Time series clustering for fault detection in district heating substations, Energy and AI, 2025.</w:t>
+      </w:r>
+    </w:p>
+    <w:p ns2:paraId="04563DD7" ns2:textId="77777777">
+      <w:pPr>
+        <w:pStyle w:val="BodyText"/>
+        <w:rPr>
+          <w:lang w:val="en-US"/>
+        </w:rPr>
+      </w:pPr>
+      <w:r>
+        <w:t xml:space="preserve">[8] J. van Dreven, A. Cheddad, S. Alawadi, A. N. Ghazi, J. Al Koussa, and D. Vanhoudt, SHEDAD: SNN-Enhanced District Heating Anomaly Detection for Urban Substations, arXiv:2408.14499, 2024.</w:t>
+      </w:r>
+    </w:p>
+    <w:p ns2:paraId="47DEF5C2" ns2:textId="77777777">
+      <w:pPr>
+        <w:pStyle w:val="BodyText"/>
+        <w:rPr>
+          <w:lang w:val="en-US"/>
+        </w:rPr>
+      </w:pPr>
+      <w:r>
+        <w:t xml:space="preserve">[9] N. Mejri, L. Lopez-Fuentes, K. Roy, P. Chernakov, E. Ghorbel, and D. Aouada, Unsupervised Anomaly Detection in Time-series: An Extensive Evaluation and Analysis of State-of-the-art Methods, arXiv:2212.03637, 2022.</w:t>
+      </w:r>
+    </w:p>
+    <w:p ns2:paraId="7B8F0225" ns2:textId="77777777">
+      <w:pPr>
+        <w:pStyle w:val="BodyText"/>
+        <w:rPr>
+          <w:lang w:val="en-US"/>
+        </w:rPr>
+      </w:pPr>
+      <w:r>
+        <w:t xml:space="preserve">[10] E. Calikus, S. Nowaczyk, A. Sant'Anna, H. Gadd, and S. Werner, A data-driven approach for discovering heat load patterns in district heating, arXiv:1901.04863, 2019.</w:t>
+      </w:r>
+    </w:p>
+    <w:p ns2:paraId="13F123F7" ns2:textId="77777777">
+      <w:pPr>
+        <w:pStyle w:val="BodyText"/>
+        <w:rPr>
+          <w:lang w:val="en-US"/>
+        </w:rPr>
+      </w:pPr>
+      <w:r>
+        <w:t xml:space="preserve">[11] H. Lund, P. A. Ostergaard, D. Connolly, and B. V. Mathiesen, The status of 4th generation district heating: Research and results, Energy, vol. 164, pp. 147-159, 2018.</w:t>
+      </w:r>
+    </w:p>
+    <w:p ns2:paraId="07FD1A93" ns2:textId="77777777">
+      <w:pPr>
+        <w:pStyle w:val="BodyText"/>
+        <w:rPr>
+          <w:lang w:val="en-US"/>
+        </w:rPr>
+      </w:pPr>
+      <w:r>
+        <w:t xml:space="preserve">[12] V. Chandola, A. Banerjee, and V. Kumar, Anomaly Detection: A Survey, ACM Computing Surveys, vol. 41, no. 3, article 15, 2009.</w:t>
+      </w:r>
+    </w:p>
+    <w:p ns2:paraId="24FD74CD" ns2:textId="77777777">
+      <w:pPr>
+        <w:pStyle w:val="BodyText"/>
+        <w:rPr>
+          <w:lang w:val="en-US"/>
+        </w:rPr>
+      </w:pPr>
+      <w:r>
+        <w:t xml:space="preserve">[13] M. A. F. Pimentel, D. A. Clifton, L. Clifton, and L. Tarassenko, A review of novelty detection, Signal Processing, vol. 99, pp. 215-249, 2014.</w:t>
+      </w:r>
+    </w:p>
+    <w:p ns2:paraId="2A76AD8C" ns2:textId="77777777">
+      <w:pPr>
+        <w:pStyle w:val="BodyText"/>
+        <w:rPr>
+          <w:lang w:val="en-US"/>
+        </w:rPr>
+      </w:pPr>
+      <w:r>
+        <w:t xml:space="preserve">[14] D. M. Hawkins, Identification of Outliers, London: Chapman and Hall, 1980.</w:t>
+      </w:r>
+    </w:p>
+    <w:p ns2:paraId="7EC8F48D" ns2:textId="77777777">
+      <w:pPr>
+        <w:pStyle w:val="BodyText"/>
+        <w:rPr>
+          <w:lang w:val="en-US"/>
+        </w:rPr>
+      </w:pPr>
+      <w:r>
+        <w:t xml:space="preserve">[15] A. Zimek and P. Filzmoser, There and back again: Outlier detection between statistical reasoning and data mining algorithms, WIREs Data Mining and Knowledge Discovery, vol. 8, no. 6, e1280, 2018.</w:t>
       </w:r>
     </w:p>
     <w:p ns2:paraId="5D3CE627" ns2:textId="77777777">
@@ -12403,66 +12309,7 @@
         </w:rPr>
       </w:pPr>
       <w:r>
-        <w:rPr>
-          <w:lang w:val="en-US"/>
-        </w:rPr>
-        <w:t>[4] G. E. Hinton and R. R. Salakhutdinov, Reducing the Dimensionality of Data with Neural Networks, Science, vol. 313, no. 5786, pp. 504-507, 2006.</w:t>
-      </w:r>
-    </w:p>
-    <w:p ns2:paraId="04563DD7" ns2:textId="77777777">
-      <w:pPr>
-        <w:pStyle w:val="BodyText"/>
-        <w:rPr>
-          <w:lang w:val="en-US"/>
-        </w:rPr>
-      </w:pPr>
-      <w:r>
-        <w:rPr>
-          <w:lang w:val="en-US"/>
-        </w:rPr>
-        <w:t>[5] J. van Dreven, A. Cheddad, S. Alawadi, A. N. Ghazi, J. Al Koussa, and D. Vanhoudt, SHEDAD: SNN-Enhanced District Heating Anomaly Detection for Urban Substations, arXiv:2408.14499, 2024.</w:t>
-      </w:r>
-    </w:p>
-    <w:p ns2:paraId="7B8F0225" ns2:textId="77777777">
-      <w:pPr>
-        <w:pStyle w:val="BodyText"/>
-        <w:rPr>
-          <w:lang w:val="en-US"/>
-        </w:rPr>
-      </w:pPr>
-      <w:r>
-        <w:rPr>
-          <w:lang w:val="en-US"/>
-        </w:rPr>
-        <w:t>[6] E. Calikus, S. Nowaczyk, A. Sant'Anna, H. Gadd, and S. Werner, A data-driven approach for discovering heat load patterns in district heating, arXiv:1901.04863, 2019.</w:t>
-      </w:r>
-    </w:p>
-    <w:p ns2:paraId="3852499E" ns2:textId="77777777">
-      <w:pPr>
-        <w:pStyle w:val="BodyText"/>
-        <w:rPr>
-          <w:lang w:val="en-US"/>
-        </w:rPr>
-      </w:pPr>
-      <w:r>
-        <w:rPr>
-          <w:lang w:val="en-US"/>
-        </w:rPr>
-        <w:t>[7] C. M. A. Roelofs, E. Guevara Bastidas, T. Hugo, S. Faulstich, and A. Cadenbach, Enabling Predictive Maintenance in District Heating Substations: A Labelled Dataset and Fault Detection Evaluation Framework based on Service Data, arXiv:2511.14791, 2025.</w:t>
-      </w:r>
-    </w:p>
-    <w:p ns2:paraId="47DEF5C2" ns2:textId="77777777">
-      <w:pPr>
-        <w:pStyle w:val="BodyText"/>
-        <w:rPr>
-          <w:lang w:val="en-US"/>
-        </w:rPr>
-      </w:pPr>
-      <w:r>
-        <w:rPr>
-          <w:lang w:val="en-US"/>
-        </w:rPr>
-        <w:t>[8] N. Mejri, L. Lopez-Fuentes, K. Roy, P. Chernakov, E. Ghorbel, and D. Aouada, Unsupervised Anomaly Detection in Time-series: An Extensive Evaluation and Analysis of State-of-the-art Methods, arXiv:2212.03637, 2022.</w:t>
+        <w:t xml:space="preserve">[16] G. E. Hinton and R. R. Salakhutdinov, Reducing the Dimensionality of Data with Neural Networks, Science, vol. 313, no. 5786, pp. 504-507, 2006.</w:t>
       </w:r>
     </w:p>
     <w:p ns2:paraId="4F86F8A1" ns2:textId="77777777">
@@ -12473,66 +12320,7 @@
         </w:rPr>
       </w:pPr>
       <w:r>
-        <w:rPr>
-          <w:lang w:val="en-US"/>
-        </w:rPr>
-        <w:t>[9] T. Kieu, B. Yang, C. Guo, C. S. Jensen, Y. Zhao, F. Huang, and K. Zheng, Robust and Explainable Autoencoders for Unsupervised Time Series Outlier Detection, arXiv:2204.03341, 2022.</w:t>
-      </w:r>
-    </w:p>
-    <w:p ns2:paraId="07FD1A93" ns2:textId="77777777">
-      <w:pPr>
-        <w:pStyle w:val="BodyText"/>
-        <w:rPr>
-          <w:lang w:val="en-US"/>
-        </w:rPr>
-      </w:pPr>
-      <w:r>
-        <w:rPr>
-          <w:lang w:val="en-US"/>
-        </w:rPr>
-        <w:t>[10] V. Chandola, A. Banerjee, and V. Kumar, Anomaly Detection: A Survey, ACM Computing Surveys, vol. 41, no. 3, article 15, 2009.</w:t>
-      </w:r>
-    </w:p>
-    <w:p ns2:paraId="13F123F7" ns2:textId="77777777">
-      <w:pPr>
-        <w:pStyle w:val="BodyText"/>
-        <w:rPr>
-          <w:lang w:val="en-US"/>
-        </w:rPr>
-      </w:pPr>
-      <w:r>
-        <w:rPr>
-          <w:lang w:val="en-US"/>
-        </w:rPr>
-        <w:t>[11] G. O. Campos, A. Zimek, J. Sander, R. J. G. B. Campello, and B. Micenkova, On the evaluation of unsupervised outlier detection: measures, datasets, and an empirical study, Data Mining and Knowledge Discovery, vol. 30, pp. 891-927, 2016.</w:t>
-      </w:r>
-    </w:p>
-    <w:p ns2:paraId="24FD74CD" ns2:textId="77777777">
-      <w:pPr>
-        <w:pStyle w:val="BodyText"/>
-        <w:rPr>
-          <w:lang w:val="en-US"/>
-        </w:rPr>
-      </w:pPr>
-      <w:r>
-        <w:rPr>
-          <w:lang w:val="en-US"/>
-        </w:rPr>
-        <w:t>[12] M. A. F. Pimentel, D. A. Clifton, L. Clifton, and L. Tarassenko, A review of novelty detection, Signal Processing, vol. 99, pp. 215-249, 2014.</w:t>
-      </w:r>
-    </w:p>
-    <w:p ns2:paraId="2A76AD8C" ns2:textId="77777777">
-      <w:pPr>
-        <w:pStyle w:val="BodyText"/>
-        <w:rPr>
-          <w:lang w:val="en-US"/>
-        </w:rPr>
-      </w:pPr>
-      <w:r>
-        <w:rPr>
-          <w:lang w:val="en-US"/>
-        </w:rPr>
-        <w:t>[13] M. Markou and S. Singh, Novelty detection: a review - part 1: statistical approaches, Signal Processing, vol. 83, no. 12, pp. 2481-2497, 2003.</w:t>
+        <w:t xml:space="preserve">[17] T. Kieu, B. Yang, C. Guo, C. S. Jensen, Y. Zhao, F. Huang, and K. Zheng, Robust and Explainable Autoencoders for Unsupervised Time Series Outlier Detection, arXiv:2204.03341, 2022.</w:t>
       </w:r>
     </w:p>
     <w:p ns2:paraId="25EC9BDE" ns2:textId="77777777">
@@ -12543,67 +12331,7 @@
         </w:rPr>
       </w:pPr>
       <w:r>
-        <w:rPr>
-          <w:lang w:val="en-US"/>
-        </w:rPr>
-        <w:lastRenderedPageBreak/>
-        <w:t>[14] P. Malhotra, L. Vig, G. Shroff, and P. Agarwal, LSTM-based Encoder-Decoder for Multi-sensor Anomaly Detection, Proceedings of the ICML 2016 Anomaly Detection Workshop, 2016.</w:t>
-      </w:r>
-    </w:p>
-    <w:p ns2:paraId="01245C7C" ns2:textId="77777777">
-      <w:pPr>
-        <w:pStyle w:val="BodyText"/>
-        <w:rPr>
-          <w:lang w:val="en-US"/>
-        </w:rPr>
-      </w:pPr>
-      <w:r>
-        <w:rPr>
-          <w:lang w:val="en-US"/>
-        </w:rPr>
-        <w:t>[15] M. Sakurada and T. Yairi, Anomaly Detection using Autoencoders with Nonlinear Dimensionality Reduction, Proceedings of the MLSDA 2014 2nd Workshop on Machine Learning for Sensory Data Analysis, 2014.</w:t>
-      </w:r>
-    </w:p>
-    <w:p ns2:paraId="6AFCA370" ns2:textId="77777777">
-      <w:pPr>
-        <w:pStyle w:val="BodyText"/>
-        <w:rPr>
-          <w:lang w:val="en-US"/>
-        </w:rPr>
-      </w:pPr>
-      <w:r>
-        <w:rPr>
-          <w:lang w:val="en-US"/>
-        </w:rPr>
-        <w:t>[16] B. Zong, Q. Song, M. R. Min, W. Cheng, C. Lumezanu, D. Cho, and H. Chen, Deep Autoencoding Gaussian Mixture Model for Unsupervised Anomaly Detection, Proceedings of the 6th International Conference on Learning Representations Workshop Track, 2018.</w:t>
-      </w:r>
-    </w:p>
-    <w:p ns2:paraId="7916E7D6" ns2:textId="77777777">
-      <w:pPr>
-        <w:pStyle w:val="BodyText"/>
-        <w:rPr>
-          <w:lang w:val="en-US"/>
-        </w:rPr>
-      </w:pPr>
-      <w:r>
-        <w:rPr>
-          <w:lang w:val="en-US"/>
-        </w:rPr>
-        <w:t>[17] M. A. Belay, S. S. Blakseth, A. Rasheed, and P. S. Rossi, Unsupervised Anomaly Detection for IoT-Based Multivariate Time Series: Existing Solutions, Performance Analysis and Future Directions, Sensors, vol. 23, no. 3, 2023.</w:t>
-      </w:r>
-    </w:p>
-    <w:p ns2:paraId="7EC8F48D" ns2:textId="77777777">
-      <w:pPr>
-        <w:pStyle w:val="BodyText"/>
-        <w:rPr>
-          <w:lang w:val="en-US"/>
-        </w:rPr>
-      </w:pPr>
-      <w:r>
-        <w:rPr>
-          <w:lang w:val="en-US"/>
-        </w:rPr>
-        <w:t>[18] All result figures in this thesis are author-generated from the historical district-heating dataset unless otherwise stated.</w:t>
+        <w:t xml:space="preserve">[18] P. Malhotra, L. Vig, G. Shroff, and P. Agarwal, LSTM-based Encoder-Decoder for Multi-sensor Anomaly Detection, Proceedings of the ICML 2016 Anomaly Detection Workshop, 2016.</w:t>
       </w:r>
     </w:p>
     <w:p ns2:paraId="7E5AB024" ns2:textId="77777777">
@@ -12614,10 +12342,7 @@
         </w:rPr>
       </w:pPr>
       <w:r>
-        <w:rPr>
-          <w:lang w:val="en-US"/>
-        </w:rPr>
-        <w:t>[19] H. Lund, S. Werner, R. Wiltshire, S. Svendsen, J. E. Thorsen, F. Hvelplund, and B. V. Mathiesen, 4th Generation District Heating (4GDH): Integrating smart thermal grids into future sustainable energy systems, Energy, vol. 68, pp. 1-11, 2014.</w:t>
+        <w:t xml:space="preserve">[19] M. Sakurada and T. Yairi, Anomaly Detection using Autoencoders with Nonlinear Dimensionality Reduction, Proceedings of the MLSDA 2014 2nd Workshop on Machine Learning for Sensory Data Analysis, 2014.</w:t>
       </w:r>
     </w:p>
     <w:p ns2:paraId="78245D12" ns2:textId="77777777">
@@ -12628,10 +12353,7 @@
         </w:rPr>
       </w:pPr>
       <w:r>
-        <w:rPr>
-          <w:lang w:val="en-US"/>
-        </w:rPr>
-        <w:t>[20] D. Connolly, H. Lund, B. V. Mathiesen, S. Werner, B. Moller, U. Persson, T. Boermans, D. Trier, P. A. Ostergaard, and S. Nielsen, Heat Roadmap Europe: Combining district heating with heat savings to decarbonise the EU energy system, Energy Policy, vol. 65, pp. 475-489, 2014.</w:t>
+        <w:t xml:space="preserve">[20] B. Zong, Q. Song, M. R. Min, W. Cheng, C. Lumezanu, D. Cho, and H. Chen, Deep Autoencoding Gaussian Mixture Model for Unsupervised Anomaly Detection, Proceedings of the 6th International Conference on Learning Representations Workshop Track, 2018.</w:t>
       </w:r>
     </w:p>
     <w:p ns2:paraId="26136F74" ns2:textId="77777777">
@@ -12642,10 +12364,7 @@
         </w:rPr>
       </w:pPr>
       <w:r>
-        <w:rPr>
-          <w:lang w:val="en-US"/>
-        </w:rPr>
-        <w:t>[21] H. Lund, P. A. Ostergaard, D. Connolly, and B. V. Mathiesen, The status of 4th generation district heating: Research and results, Energy, vol. 164, pp. 147-159, 2018.</w:t>
+        <w:t xml:space="preserve">[21] M. A. Belay, S. S. Blakseth, A. Rasheed, and P. S. Rossi, Unsupervised Anomaly Detection for IoT-Based Multivariate Time Series: Existing Solutions, Performance Analysis and Future Directions, Sensors, vol. 23, no. 3, 2023.</w:t>
       </w:r>
     </w:p>
     <w:p ns2:paraId="52A78EFB" ns2:textId="77777777">
@@ -12656,10 +12375,7 @@
         </w:rPr>
       </w:pPr>
       <w:r>
-        <w:rPr>
-          <w:lang w:val="en-US"/>
-        </w:rPr>
-        <w:t>[22] D. M. Hawkins, Identification of Outliers, London: Chapman and Hall, 1980.</w:t>
+        <w:t xml:space="preserve">[22] M. Markou and S. Singh, Novelty detection: a review - part 1: statistical approaches, Signal Processing, vol. 83, no. 12, pp. 2481-2497, 2003.</w:t>
       </w:r>
     </w:p>
     <w:p ns2:paraId="012504DC" ns2:textId="77777777">
@@ -12670,10 +12386,7 @@
         </w:rPr>
       </w:pPr>
       <w:r>
-        <w:rPr>
-          <w:lang w:val="en-US"/>
-        </w:rPr>
-        <w:t>[23] A. Zimek and P. Filzmoser, There and back again: Outlier detection between statistical reasoning and data mining algorithms, WIREs Data Mining and Knowledge Discovery, vol. 8, no. 6, e1280, 2018.</w:t>
+        <w:t xml:space="preserve">[23] All result figures in this thesis are author-generated from the historical district-heating dataset unless otherwise stated.</w:t>
       </w:r>
     </w:p>
     <w:sectPr>
@@ -12684,311 +12397,6 @@
     </w:sectPr>
   </w:body>
 </w:document>
-</file>
-
-<file path=word/comments.xml><?xml version="1.0" encoding="utf-8"?>
-<w:comments xmlns:wpc="http://schemas.microsoft.com/office/word/2010/wordprocessingCanvas" xmlns:cx="http://schemas.microsoft.com/office/drawing/2014/chartex" xmlns:cx1="http://schemas.microsoft.com/office/drawing/2015/9/8/chartex" xmlns:cx2="http://schemas.microsoft.com/office/drawing/2015/10/21/chartex" xmlns:cx3="http://schemas.microsoft.com/office/drawing/2016/5/9/chartex" xmlns:cx4="http://schemas.microsoft.com/office/drawing/2016/5/10/chartex" xmlns:cx5="http://schemas.microsoft.com/office/drawing/2016/5/11/chartex" xmlns:cx6="http://schemas.microsoft.com/office/drawing/2016/5/12/chartex" xmlns:cx7="http://schemas.microsoft.com/office/drawing/2016/5/13/chartex" xmlns:cx8="http://schemas.microsoft.com/office/drawing/2016/5/14/chartex" xmlns:mc="http://schemas.openxmlformats.org/markup-compatibility/2006" xmlns:aink="http://schemas.microsoft.com/office/drawing/2016/ink" xmlns:am3d="http://schemas.microsoft.com/office/drawing/2017/model3d" xmlns:o="urn:schemas-microsoft-com:office:office" xmlns:oel="http://schemas.microsoft.com/office/2019/extlst" xmlns:r="http://schemas.openxmlformats.org/officeDocument/2006/relationships" xmlns:m="http://schemas.openxmlformats.org/officeDocument/2006/math" xmlns:v="urn:schemas-microsoft-com:vml" xmlns:wp14="http://schemas.microsoft.com/office/word/2010/wordprocessingDrawing" xmlns:wp="http://schemas.openxmlformats.org/drawingml/2006/wordprocessingDrawing" xmlns:w10="urn:schemas-microsoft-com:office:word" xmlns:w="http://schemas.openxmlformats.org/wordprocessingml/2006/main" xmlns:w14="http://schemas.microsoft.com/office/word/2010/wordml" xmlns:w15="http://schemas.microsoft.com/office/word/2012/wordml" xmlns:w16cex="http://schemas.microsoft.com/office/word/2018/wordml/cex" xmlns:w16cid="http://schemas.microsoft.com/office/word/2016/wordml/cid" xmlns:w16="http://schemas.microsoft.com/office/word/2018/wordml" xmlns:w16du="http://schemas.microsoft.com/office/word/2023/wordml/word16du" xmlns:w16sdtdh="http://schemas.microsoft.com/office/word/2020/wordml/sdtdatahash" xmlns:w16sdtfl="http://schemas.microsoft.com/office/word/2024/wordml/sdtformatlock" xmlns:w16se="http://schemas.microsoft.com/office/word/2015/wordml/symex" xmlns:wpg="http://schemas.microsoft.com/office/word/2010/wordprocessingGroup" xmlns:wpi="http://schemas.microsoft.com/office/word/2010/wordprocessingInk" xmlns:wne="http://schemas.microsoft.com/office/word/2006/wordml" xmlns:wps="http://schemas.microsoft.com/office/word/2010/wordprocessingShape" mc:Ignorable="w14 w15 w16se w16cid w16 w16cex w16sdtdh w16sdtfl w16du wp14">
-  <w:comment w:id="3" w:author="Mustapha Habib" w:date="2026-06-29T09:57:00Z" w:initials="MH">
-    <w:p>
-      <w:pPr>
-        <w:pStyle w:val="CommentText"/>
-      </w:pPr>
-      <w:r>
-        <w:rPr>
-          <w:rStyle w:val="CommentReference"/>
-        </w:rPr>
-        <w:annotationRef/>
-      </w:r>
-      <w:r>
-        <w:t xml:space="preserve">Here you need to mention the methodology you are refering to briefly, without this ”HEAT” paper, because no one will understand what this stands for! </w:t>
-      </w:r>
-    </w:p>
-  </w:comment>
-  <w:comment w:id="6" w:author="Mustapha Habib" w:date="2026-06-29T09:58:00Z" w:initials="MH">
-    <w:p>
-      <w:pPr>
-        <w:pStyle w:val="CommentText"/>
-      </w:pPr>
-      <w:r>
-        <w:rPr>
-          <w:rStyle w:val="CommentReference"/>
-        </w:rPr>
-        <w:annotationRef/>
-      </w:r>
-      <w:r>
-        <w:t>Please, rephrase</w:t>
-      </w:r>
-    </w:p>
-  </w:comment>
-  <w:comment w:id="7" w:author="Mustapha Habib" w:date="2026-06-29T09:59:00Z" w:initials="MH">
-    <w:p>
-      <w:pPr>
-        <w:pStyle w:val="CommentText"/>
-      </w:pPr>
-      <w:r>
-        <w:rPr>
-          <w:rStyle w:val="CommentReference"/>
-        </w:rPr>
-        <w:annotationRef/>
-      </w:r>
-      <w:r>
-        <w:t>I thing you mean here ”data point” and not windows</w:t>
-      </w:r>
-    </w:p>
-  </w:comment>
-  <w:comment w:id="16" w:author="Mustapha Habib" w:date="2026-06-29T10:04:00Z" w:initials="MH">
-    <w:p>
-      <w:pPr>
-        <w:pStyle w:val="CommentText"/>
-      </w:pPr>
-      <w:r>
-        <w:rPr>
-          <w:rStyle w:val="CommentReference"/>
-        </w:rPr>
-        <w:annotationRef/>
-      </w:r>
-      <w:r>
-        <w:t>There is no need to mention the building name in the abstract. Just say, a building case-study.</w:t>
-      </w:r>
-    </w:p>
-  </w:comment>
-  <w:comment w:id="17" w:author="Mustapha Habib" w:date="2026-06-29T10:04:00Z" w:initials="MH">
-    <w:p>
-      <w:pPr>
-        <w:pStyle w:val="CommentText"/>
-      </w:pPr>
-      <w:r>
-        <w:rPr>
-          <w:rStyle w:val="CommentReference"/>
-        </w:rPr>
-        <w:annotationRef/>
-      </w:r>
-      <w:r>
-        <w:t>Same comment as above</w:t>
-      </w:r>
-    </w:p>
-  </w:comment>
-  <w:comment w:id="18" w:author="Mustapha Habib" w:date="2026-06-29T10:06:00Z" w:initials="MH">
-    <w:p>
-      <w:pPr>
-        <w:pStyle w:val="CommentText"/>
-      </w:pPr>
-      <w:r>
-        <w:rPr>
-          <w:rStyle w:val="CommentReference"/>
-        </w:rPr>
-        <w:annotationRef/>
-      </w:r>
-      <w:r>
-        <w:t>Same comment as above. In the abstract, focus on the methodolgy and the main study outcomes. It is irrelevant to go for some details like building names here</w:t>
-      </w:r>
-    </w:p>
-  </w:comment>
-  <w:comment w:id="24" w:author="Mustapha Habib" w:date="2026-06-29T10:07:00Z" w:initials="MH">
-    <w:p>
-      <w:pPr>
-        <w:pStyle w:val="CommentText"/>
-      </w:pPr>
-      <w:r>
-        <w:rPr>
-          <w:rStyle w:val="CommentReference"/>
-        </w:rPr>
-        <w:annotationRef/>
-      </w:r>
-      <w:r>
-        <w:t>You cannot jump from referene 3 (the last one)  directly to reference 19. You can step back fto mention a previous reference but you cannot jumot forward</w:t>
-      </w:r>
-    </w:p>
-  </w:comment>
-  <w:comment w:id="26" w:author="Mustapha Habib" w:date="2026-06-29T10:12:00Z" w:initials="MH">
-    <w:p>
-      <w:pPr>
-        <w:pStyle w:val="CommentText"/>
-      </w:pPr>
-      <w:r>
-        <w:rPr>
-          <w:rStyle w:val="CommentReference"/>
-        </w:rPr>
-        <w:annotationRef/>
-      </w:r>
-      <w:r>
-        <w:t>Please, rephrase this to highlight that operation anomalies are a presist issue in modern district heating networks, where there is a high need to take advantage of the data available in the DH substations to detect such anomalies and deal with them. Support your claims with references.</w:t>
-      </w:r>
-    </w:p>
-  </w:comment>
-  <w:comment w:id="35" w:author="Mustapha Habib" w:date="2026-06-29T10:15:00Z" w:initials="MH">
-    <w:p>
-      <w:pPr>
-        <w:pStyle w:val="CommentText"/>
-      </w:pPr>
-      <w:r>
-        <w:rPr>
-          <w:rStyle w:val="CommentReference"/>
-        </w:rPr>
-        <w:annotationRef/>
-      </w:r>
-      <w:r>
-        <w:t>This is too detailled, keep the research questions general!</w:t>
-      </w:r>
-    </w:p>
-  </w:comment>
-  <w:comment w:id="38" w:author="Mustapha Habib" w:date="2026-06-29T10:15:00Z" w:initials="MH">
-    <w:p>
-      <w:pPr>
-        <w:pStyle w:val="CommentText"/>
-      </w:pPr>
-      <w:r>
-        <w:rPr>
-          <w:rStyle w:val="CommentReference"/>
-        </w:rPr>
-        <w:annotationRef/>
-      </w:r>
-      <w:r>
-        <w:t>Same here!</w:t>
-      </w:r>
-    </w:p>
-  </w:comment>
-  <w:comment w:id="40" w:author="Mustapha Habib" w:date="2026-06-29T10:17:00Z" w:initials="MH">
-    <w:p>
-      <w:pPr>
-        <w:pStyle w:val="CommentText"/>
-      </w:pPr>
-      <w:r>
-        <w:rPr>
-          <w:rStyle w:val="CommentReference"/>
-        </w:rPr>
-        <w:annotationRef/>
-      </w:r>
-      <w:r>
-        <w:t>Rephrase is this way: what is the impact of changing the configuration settings of the proposed methodology on the expect results.</w:t>
-      </w:r>
-    </w:p>
-  </w:comment>
-  <w:comment w:id="49" w:author="Mustapha Habib" w:date="2026-06-29T10:28:00Z" w:initials="MH">
-    <w:p>
-      <w:pPr>
-        <w:pStyle w:val="CommentText"/>
-      </w:pPr>
-      <w:r>
-        <w:rPr>
-          <w:rStyle w:val="CommentReference"/>
-        </w:rPr>
-        <w:annotationRef/>
-      </w:r>
-      <w:r>
-        <w:t>Name this section differently because no one knows that this HEAT paper is!! You can go for ”Baseline method” or ”Reference method”</w:t>
-      </w:r>
-    </w:p>
-  </w:comment>
-  <w:comment w:id="50" w:author="Mustapha Habib" w:date="2026-06-29T10:34:00Z" w:initials="MH">
-    <w:p>
-      <w:pPr>
-        <w:pStyle w:val="CommentText"/>
-      </w:pPr>
-      <w:r>
-        <w:rPr>
-          <w:rStyle w:val="CommentReference"/>
-        </w:rPr>
-        <w:annotationRef/>
-      </w:r>
-      <w:r>
-        <w:t>Please remove ”HEAT paper” from the entire thesis and replace it either with the reference method, baseline method or mention directky the name of the method presented in this paper.</w:t>
-      </w:r>
-    </w:p>
-  </w:comment>
-  <w:comment w:id="54" w:author="Mustapha Habib" w:date="2026-06-29T10:35:00Z" w:initials="MH">
-    <w:p>
-      <w:pPr>
-        <w:pStyle w:val="CommentText"/>
-      </w:pPr>
-      <w:r>
-        <w:rPr>
-          <w:rStyle w:val="CommentReference"/>
-        </w:rPr>
-        <w:annotationRef/>
-      </w:r>
-      <w:r>
-        <w:t>Equation should be numbered, please check the template!</w:t>
-      </w:r>
-    </w:p>
-  </w:comment>
-  <w:comment w:id="55" w:author="Mustapha Habib" w:date="2026-06-29T10:40:00Z" w:initials="MH">
-    <w:p>
-      <w:pPr>
-        <w:pStyle w:val="CommentText"/>
-      </w:pPr>
-      <w:r>
-        <w:rPr>
-          <w:rStyle w:val="CommentReference"/>
-        </w:rPr>
-        <w:annotationRef/>
-      </w:r>
-      <w:r>
-        <w:t>As we discussed in the meeting, there is no need to mention that flow rates data were calculated and not directly measured. Just assume that we have a flow sensors because this is not the contribution of the thesis.</w:t>
-      </w:r>
-    </w:p>
-  </w:comment>
-</w:comments>
-</file>
-
-<file path=word/commentsExtended.xml><?xml version="1.0" encoding="utf-8"?>
-<w15:commentsEx xmlns:wpc="http://schemas.microsoft.com/office/word/2010/wordprocessingCanvas" xmlns:cx="http://schemas.microsoft.com/office/drawing/2014/chartex" xmlns:cx1="http://schemas.microsoft.com/office/drawing/2015/9/8/chartex" xmlns:cx2="http://schemas.microsoft.com/office/drawing/2015/10/21/chartex" xmlns:cx3="http://schemas.microsoft.com/office/drawing/2016/5/9/chartex" xmlns:cx4="http://schemas.microsoft.com/office/drawing/2016/5/10/chartex" xmlns:cx5="http://schemas.microsoft.com/office/drawing/2016/5/11/chartex" xmlns:cx6="http://schemas.microsoft.com/office/drawing/2016/5/12/chartex" xmlns:cx7="http://schemas.microsoft.com/office/drawing/2016/5/13/chartex" xmlns:cx8="http://schemas.microsoft.com/office/drawing/2016/5/14/chartex" xmlns:mc="http://schemas.openxmlformats.org/markup-compatibility/2006" xmlns:aink="http://schemas.microsoft.com/office/drawing/2016/ink" xmlns:am3d="http://schemas.microsoft.com/office/drawing/2017/model3d" xmlns:o="urn:schemas-microsoft-com:office:office" xmlns:oel="http://schemas.microsoft.com/office/2019/extlst" xmlns:r="http://schemas.openxmlformats.org/officeDocument/2006/relationships" xmlns:m="http://schemas.openxmlformats.org/officeDocument/2006/math" xmlns:v="urn:schemas-microsoft-com:vml" xmlns:wp14="http://schemas.microsoft.com/office/word/2010/wordprocessingDrawing" xmlns:wp="http://schemas.openxmlformats.org/drawingml/2006/wordprocessingDrawing" xmlns:w10="urn:schemas-microsoft-com:office:word" xmlns:w="http://schemas.openxmlformats.org/wordprocessingml/2006/main" xmlns:w14="http://schemas.microsoft.com/office/word/2010/wordml" xmlns:w15="http://schemas.microsoft.com/office/word/2012/wordml" xmlns:w16cex="http://schemas.microsoft.com/office/word/2018/wordml/cex" xmlns:w16cid="http://schemas.microsoft.com/office/word/2016/wordml/cid" xmlns:w16="http://schemas.microsoft.com/office/word/2018/wordml" xmlns:w16du="http://schemas.microsoft.com/office/word/2023/wordml/word16du" xmlns:w16sdtdh="http://schemas.microsoft.com/office/word/2020/wordml/sdtdatahash" xmlns:w16sdtfl="http://schemas.microsoft.com/office/word/2024/wordml/sdtformatlock" xmlns:w16se="http://schemas.microsoft.com/office/word/2015/wordml/symex" xmlns:wpg="http://schemas.microsoft.com/office/word/2010/wordprocessingGroup" xmlns:wpi="http://schemas.microsoft.com/office/word/2010/wordprocessingInk" xmlns:wne="http://schemas.microsoft.com/office/word/2006/wordml" xmlns:wps="http://schemas.microsoft.com/office/word/2010/wordprocessingShape" mc:Ignorable="w14 w15 w16se w16cid w16 w16cex w16sdtdh w16sdtfl w16du wp14">
-  <w15:commentEx w15:paraId="52A12998" w15:done="0"/>
-  <w15:commentEx w15:paraId="2291D222" w15:done="0"/>
-  <w15:commentEx w15:paraId="11FED6DA" w15:done="0"/>
-  <w15:commentEx w15:paraId="2C782A01" w15:done="0"/>
-  <w15:commentEx w15:paraId="6C019937" w15:done="0"/>
-  <w15:commentEx w15:paraId="1F990D67" w15:done="0"/>
-  <w15:commentEx w15:paraId="71E663D4" w15:done="0"/>
-  <w15:commentEx w15:paraId="02C33BC8" w15:done="0"/>
-  <w15:commentEx w15:paraId="7FB1BABD" w15:done="0"/>
-  <w15:commentEx w15:paraId="3391B427" w15:done="0"/>
-  <w15:commentEx w15:paraId="114C47BA" w15:done="0"/>
-  <w15:commentEx w15:paraId="4100BB4D" w15:done="0"/>
-  <w15:commentEx w15:paraId="70CDC3DB" w15:done="0"/>
-  <w15:commentEx w15:paraId="75AC18B9" w15:done="0"/>
-  <w15:commentEx w15:paraId="7183C28C" w15:done="0"/>
-</w15:commentsEx>
-</file>
-
-<file path=word/commentsExtensible.xml><?xml version="1.0" encoding="utf-8"?>
-<w16cex:commentsExtensible xmlns:wpc="http://schemas.microsoft.com/office/word/2010/wordprocessingCanvas" xmlns:cx="http://schemas.microsoft.com/office/drawing/2014/chartex" xmlns:cx1="http://schemas.microsoft.com/office/drawing/2015/9/8/chartex" xmlns:cx2="http://schemas.microsoft.com/office/drawing/2015/10/21/chartex" xmlns:cx3="http://schemas.microsoft.com/office/drawing/2016/5/9/chartex" xmlns:cx4="http://schemas.microsoft.com/office/drawing/2016/5/10/chartex" xmlns:cx5="http://schemas.microsoft.com/office/drawing/2016/5/11/chartex" xmlns:cx6="http://schemas.microsoft.com/office/drawing/2016/5/12/chartex" xmlns:cx7="http://schemas.microsoft.com/office/drawing/2016/5/13/chartex" xmlns:cx8="http://schemas.microsoft.com/office/drawing/2016/5/14/chartex" xmlns:cr="http://schemas.microsoft.com/office/comments/2020/reactions" xmlns:mc="http://schemas.openxmlformats.org/markup-compatibility/2006" xmlns:aink="http://schemas.microsoft.com/office/drawing/2016/ink" xmlns:am3d="http://schemas.microsoft.com/office/drawing/2017/model3d" xmlns:o="urn:schemas-microsoft-com:office:office" xmlns:oel="http://schemas.microsoft.com/office/2019/extlst" xmlns:r="http://schemas.openxmlformats.org/officeDocument/2006/relationships" xmlns:m="http://schemas.openxmlformats.org/officeDocument/2006/math" xmlns:v="urn:schemas-microsoft-com:vml" xmlns:wp14="http://schemas.microsoft.com/office/word/2010/wordprocessingDrawing" xmlns:wp="http://schemas.openxmlformats.org/drawingml/2006/wordprocessingDrawing" xmlns:w10="urn:schemas-microsoft-com:office:word" xmlns:w="http://schemas.openxmlformats.org/wordprocessingml/2006/main" xmlns:w14="http://schemas.microsoft.com/office/word/2010/wordml" xmlns:w15="http://schemas.microsoft.com/office/word/2012/wordml" xmlns:w16cex="http://schemas.microsoft.com/office/word/2018/wordml/cex" xmlns:w16cid="http://schemas.microsoft.com/office/word/2016/wordml/cid" xmlns:w16="http://schemas.microsoft.com/office/word/2018/wordml" xmlns:w16du="http://schemas.microsoft.com/office/word/2023/wordml/word16du" xmlns:w16sdtdh="http://schemas.microsoft.com/office/word/2020/wordml/sdtdatahash" xmlns:w16sdtfl="http://schemas.microsoft.com/office/word/2024/wordml/sdtformatlock" xmlns:w16se="http://schemas.microsoft.com/office/word/2015/wordml/symex" xmlns:wpg="http://schemas.microsoft.com/office/word/2010/wordprocessingGroup" xmlns:wpi="http://schemas.microsoft.com/office/word/2010/wordprocessingInk" xmlns:wne="http://schemas.microsoft.com/office/word/2006/wordml" xmlns:wps="http://schemas.microsoft.com/office/word/2010/wordprocessingShape" mc:Ignorable="w14 w15 w16se w16cid w16 w16cex w16sdtdh w16sdtfl cr w16du wp14">
-  <w16cex:commentExtensible w16cex:durableId="61612338" w16cex:dateUtc="2026-06-29T07:57:00Z"/>
-  <w16cex:commentExtensible w16cex:durableId="3267E46F" w16cex:dateUtc="2026-06-29T07:58:00Z"/>
-  <w16cex:commentExtensible w16cex:durableId="6836FE48" w16cex:dateUtc="2026-06-29T07:59:00Z"/>
-  <w16cex:commentExtensible w16cex:durableId="4AF0E89C" w16cex:dateUtc="2026-06-29T08:04:00Z"/>
-  <w16cex:commentExtensible w16cex:durableId="23FFC5A1" w16cex:dateUtc="2026-06-29T08:04:00Z"/>
-  <w16cex:commentExtensible w16cex:durableId="095A4FDA" w16cex:dateUtc="2026-06-29T08:06:00Z"/>
-  <w16cex:commentExtensible w16cex:durableId="48C46F92" w16cex:dateUtc="2026-06-29T08:07:00Z"/>
-  <w16cex:commentExtensible w16cex:durableId="79E83A59" w16cex:dateUtc="2026-06-29T08:12:00Z"/>
-  <w16cex:commentExtensible w16cex:durableId="3544049E" w16cex:dateUtc="2026-06-29T08:15:00Z"/>
-  <w16cex:commentExtensible w16cex:durableId="26CB8DC7" w16cex:dateUtc="2026-06-29T08:15:00Z"/>
-  <w16cex:commentExtensible w16cex:durableId="3BF4E545" w16cex:dateUtc="2026-06-29T08:17:00Z"/>
-  <w16cex:commentExtensible w16cex:durableId="0CDA7FF9" w16cex:dateUtc="2026-06-29T08:28:00Z"/>
-  <w16cex:commentExtensible w16cex:durableId="5E57DD46" w16cex:dateUtc="2026-06-29T08:34:00Z"/>
-  <w16cex:commentExtensible w16cex:durableId="7C194F4B" w16cex:dateUtc="2026-06-29T08:35:00Z"/>
-  <w16cex:commentExtensible w16cex:durableId="69589FE4" w16cex:dateUtc="2026-06-29T08:40:00Z"/>
-</w16cex:commentsExtensible>
-</file>
-
-<file path=word/commentsIds.xml><?xml version="1.0" encoding="utf-8"?>
-<w16cid:commentsIds xmlns:wpc="http://schemas.microsoft.com/office/word/2010/wordprocessingCanvas" xmlns:cx="http://schemas.microsoft.com/office/drawing/2014/chartex" xmlns:cx1="http://schemas.microsoft.com/office/drawing/2015/9/8/chartex" xmlns:cx2="http://schemas.microsoft.com/office/drawing/2015/10/21/chartex" xmlns:cx3="http://schemas.microsoft.com/office/drawing/2016/5/9/chartex" xmlns:cx4="http://schemas.microsoft.com/office/drawing/2016/5/10/chartex" xmlns:cx5="http://schemas.microsoft.com/office/drawing/2016/5/11/chartex" xmlns:cx6="http://schemas.microsoft.com/office/drawing/2016/5/12/chartex" xmlns:cx7="http://schemas.microsoft.com/office/drawing/2016/5/13/chartex" xmlns:cx8="http://schemas.microsoft.com/office/drawing/2016/5/14/chartex" xmlns:mc="http://schemas.openxmlformats.org/markup-compatibility/2006" xmlns:aink="http://schemas.microsoft.com/office/drawing/2016/ink" xmlns:am3d="http://schemas.microsoft.com/office/drawing/2017/model3d" xmlns:o="urn:schemas-microsoft-com:office:office" xmlns:oel="http://schemas.microsoft.com/office/2019/extlst" xmlns:r="http://schemas.openxmlformats.org/officeDocument/2006/relationships" xmlns:m="http://schemas.openxmlformats.org/officeDocument/2006/math" xmlns:v="urn:schemas-microsoft-com:vml" xmlns:wp14="http://schemas.microsoft.com/office/word/2010/wordprocessingDrawing" xmlns:wp="http://schemas.openxmlformats.org/drawingml/2006/wordprocessingDrawing" xmlns:w10="urn:schemas-microsoft-com:office:word" xmlns:w="http://schemas.openxmlformats.org/wordprocessingml/2006/main" xmlns:w14="http://schemas.microsoft.com/office/word/2010/wordml" xmlns:w15="http://schemas.microsoft.com/office/word/2012/wordml" xmlns:w16cex="http://schemas.microsoft.com/office/word/2018/wordml/cex" xmlns:w16cid="http://schemas.microsoft.com/office/word/2016/wordml/cid" xmlns:w16="http://schemas.microsoft.com/office/word/2018/wordml" xmlns:w16du="http://schemas.microsoft.com/office/word/2023/wordml/word16du" xmlns:w16sdtdh="http://schemas.microsoft.com/office/word/2020/wordml/sdtdatahash" xmlns:w16sdtfl="http://schemas.microsoft.com/office/word/2024/wordml/sdtformatlock" xmlns:w16se="http://schemas.microsoft.com/office/word/2015/wordml/symex" xmlns:wpg="http://schemas.microsoft.com/office/word/2010/wordprocessingGroup" xmlns:wpi="http://schemas.microsoft.com/office/word/2010/wordprocessingInk" xmlns:wne="http://schemas.microsoft.com/office/word/2006/wordml" xmlns:wps="http://schemas.microsoft.com/office/word/2010/wordprocessingShape" mc:Ignorable="w14 w15 w16se w16cid w16 w16cex w16sdtdh w16sdtfl w16du wp14">
-  <w16cid:commentId w16cid:paraId="52A12998" w16cid:durableId="61612338"/>
-  <w16cid:commentId w16cid:paraId="2291D222" w16cid:durableId="3267E46F"/>
-  <w16cid:commentId w16cid:paraId="11FED6DA" w16cid:durableId="6836FE48"/>
-  <w16cid:commentId w16cid:paraId="2C782A01" w16cid:durableId="4AF0E89C"/>
-  <w16cid:commentId w16cid:paraId="6C019937" w16cid:durableId="23FFC5A1"/>
-  <w16cid:commentId w16cid:paraId="1F990D67" w16cid:durableId="095A4FDA"/>
-  <w16cid:commentId w16cid:paraId="71E663D4" w16cid:durableId="48C46F92"/>
-  <w16cid:commentId w16cid:paraId="02C33BC8" w16cid:durableId="79E83A59"/>
-  <w16cid:commentId w16cid:paraId="7FB1BABD" w16cid:durableId="3544049E"/>
-  <w16cid:commentId w16cid:paraId="3391B427" w16cid:durableId="26CB8DC7"/>
-  <w16cid:commentId w16cid:paraId="114C47BA" w16cid:durableId="3BF4E545"/>
-  <w16cid:commentId w16cid:paraId="4100BB4D" w16cid:durableId="0CDA7FF9"/>
-  <w16cid:commentId w16cid:paraId="70CDC3DB" w16cid:durableId="5E57DD46"/>
-  <w16cid:commentId w16cid:paraId="75AC18B9" w16cid:durableId="7C194F4B"/>
-  <w16cid:commentId w16cid:paraId="7183C28C" w16cid:durableId="69589FE4"/>
-</w16cid:commentsIds>
 </file>
 
 <file path=word/endnotes.xml><?xml version="1.0" encoding="utf-8"?>
@@ -40452,14 +39860,14 @@
     <w:charset w:val="00"/>
     <w:family w:val="swiss"/>
     <w:pitch w:val="variable"/>
-    <w:sig w:usb0="E4002EFF" w:usb1="C200247B" w:usb2="00000009" w:usb3="00000000" w:csb0="000001FF" w:csb1="00000000"/>
+    <w:sig w:usb0="E4002EFF" w:usb1="C000247B" w:usb2="00000009" w:usb3="00000000" w:csb0="000001FF" w:csb1="00000000"/>
   </w:font>
   <w:font w:name="Calibri Light">
     <w:panose1 w:val="020F0302020204030204"/>
     <w:charset w:val="00"/>
     <w:family w:val="swiss"/>
     <w:pitch w:val="variable"/>
-    <w:sig w:usb0="E4002EFF" w:usb1="C200247B" w:usb2="00000009" w:usb3="00000000" w:csb0="000001FF" w:csb1="00000000"/>
+    <w:sig w:usb0="E4002EFF" w:usb1="C000247B" w:usb2="00000009" w:usb3="00000000" w:csb0="000001FF" w:csb1="00000000"/>
   </w:font>
   <w:font w:name="Segoe UI">
     <w:panose1 w:val="020B0502040204020203"/>
@@ -40561,6 +39969,7 @@
     <w:rsid w:val="00AE4BFE"/>
     <w:rsid w:val="00B05FDD"/>
     <w:rsid w:val="00B43CBD"/>
+    <w:rsid w:val="00B45A0B"/>
     <w:rsid w:val="00B84D1D"/>
     <w:rsid w:val="00C1123B"/>
     <w:rsid w:val="00C374E1"/>
@@ -40571,6 +39980,7 @@
     <w:rsid w:val="00E24CAD"/>
     <w:rsid w:val="00E521DC"/>
     <w:rsid w:val="00E61268"/>
+    <w:rsid w:val="00E6400E"/>
     <w:rsid w:val="00EB59AD"/>
     <w:rsid w:val="00F27BE1"/>
     <w:rsid w:val="00F75E63"/>
@@ -40592,8 +40002,8 @@
   </m:mathPr>
   <w:themeFontLang w:val="en-IE"/>
   <w:clrSchemeMapping w:bg1="light1" w:t1="dark1" w:bg2="light2" w:t2="dark2" w:accent1="accent1" w:accent2="accent2" w:accent3="accent3" w:accent4="accent4" w:accent5="accent5" w:accent6="accent6" w:hyperlink="hyperlink" w:followedHyperlink="followedHyperlink"/>
-  <w:decimalSymbol w:val=","/>
-  <w:listSeparator w:val=";"/>
+  <w:decimalSymbol w:val="."/>
+  <w:listSeparator w:val=","/>
   <w15:chartTrackingRefBased/>
 </w:settings>
 </file>

</xml_diff>